<commit_message>
Revise worksheet: guided instruction-blank format, OMML equations, Calibri 9pt
Major changes:
- Each step is now: instruction text -> blank line(s) for student response
- Uses OMML (Office Math Markup Language) for proper equation rendering in Word
- Font changed to Calibri, size 9pt throughout
- Layout: 4 vertical columns (landscape page divided vertically)
- Maximized usable space with narrow margins (0.3in)
- Monochrome grayscale only
- Each column is independent (own Name/Grade/Date header)
- Dashed cut lines between columns
</commit_message>
<xml_diff>
--- a/kinematics_worksheet.docx
+++ b/kinematics_worksheet.docx
@@ -8,26 +8,27 @@
         <w:jc w:val="center"/>
         <w:tblLook w:firstColumn="1" w:firstRow="1" w:lastColumn="0" w:lastRow="0" w:noHBand="0" w:noVBand="1" w:val="04A0"/>
         <w:tblLayout w:type="fixed"/>
+        <w:tblCellSpacing w:w="0" w:type="dxa"/>
       </w:tblPr>
       <w:tblGrid>
-        <w:gridCol w:w="4428"/>
-        <w:gridCol w:w="4428"/>
-        <w:gridCol w:w="4428"/>
-        <w:gridCol w:w="4428"/>
+        <w:gridCol w:w="4464"/>
+        <w:gridCol w:w="4464"/>
+        <w:gridCol w:w="4464"/>
+        <w:gridCol w:w="4464"/>
       </w:tblGrid>
       <w:tr>
         <w:trPr>
-          <w:trHeight w:val="11140" w:hRule="atLeast"/>
+          <w:trHeight w:val="11376" w:hRule="exact"/>
         </w:trPr>
         <w:tc>
           <w:tcPr>
-            <w:tcW w:type="dxa" w:w="4428"/>
-            <w:tcW w:w="4428" w:type="dxa"/>
+            <w:tcW w:type="dxa" w:w="7"/>
+            <w:tcW w:w="4464" w:type="dxa"/>
             <w:tcMar>
-              <w:top w:w="50" w:type="dxa"/>
-              <w:bottom w:w="50" w:type="dxa"/>
-              <w:left w:w="70" w:type="dxa"/>
-              <w:right w:w="70" w:type="dxa"/>
+              <w:top w:w="40" w:type="dxa"/>
+              <w:bottom w:w="30" w:type="dxa"/>
+              <w:left w:w="60" w:type="dxa"/>
+              <w:right w:w="60" w:type="dxa"/>
             </w:tcMar>
             <w:vAlign w:val="top"/>
             <w:tcBorders>
@@ -38,55 +39,153 @@
             </w:tcBorders>
           </w:tcPr>
           <w:p>
-            <w:r/>
+            <w:pPr>
+              <w:spacing w:after="0" w:before="0"/>
+            </w:pPr>
+            <w:r>
+              <w:rPr>
+                <w:rFonts w:ascii="Calibri" w:hAnsi="Calibri"/>
+                <w:b w:val="0"/>
+                <w:i w:val="0"/>
+                <w:color w:val="000000"/>
+                <w:sz w:val="16"/>
+                <w:u w:val="none"/>
+              </w:rPr>
+              <w:t>Name: ___________________________________</w:t>
+            </w:r>
           </w:p>
           <w:p>
             <w:pPr>
-              <w:spacing w:after="20"/>
+              <w:spacing w:before="40" w:after="0"/>
             </w:pPr>
             <w:r>
               <w:rPr>
-                <w:rFonts w:ascii="Times New Roman" w:hAnsi="Times New Roman"/>
+                <w:rFonts w:ascii="Calibri" w:hAnsi="Calibri"/>
+                <w:b w:val="0"/>
+                <w:i w:val="0"/>
+                <w:color w:val="000000"/>
+                <w:sz w:val="16"/>
+                <w:u w:val="none"/>
+              </w:rPr>
+              <w:t>Grade &amp; Section: _____________  Date: __________</w:t>
+            </w:r>
+          </w:p>
+          <w:p>
+            <w:pPr>
+              <w:spacing w:before="100" w:after="20"/>
+              <w:jc w:val="center"/>
+              <w:pBdr>
+                <w:top w:val="single" w:sz="8" w:space="2" w:color="000000"/>
+                <w:left w:val="single" w:sz="8" w:space="2" w:color="000000"/>
+                <w:bottom w:val="single" w:sz="8" w:space="2" w:color="000000"/>
+                <w:right w:val="single" w:sz="8" w:space="2" w:color="000000"/>
+              </w:pBdr>
+              <w:shd w:val="clear" w:color="auto" w:fill="EDEDED"/>
+            </w:pPr>
+            <w:r>
+              <w:rPr>
+                <w:rFonts w:ascii="Calibri" w:hAnsi="Calibri"/>
+                <w:b/>
+                <w:i w:val="0"/>
+                <w:color w:val="000000"/>
+                <w:sz w:val="18"/>
+                <w:u w:val="none"/>
+              </w:rPr>
+              <w:t xml:space="preserve">PART A: </w:t>
+            </w:r>
+            <w:r>
+              <w:rPr>
+                <w:rFonts w:ascii="Calibri" w:hAnsi="Calibri"/>
+                <w:b/>
+                <w:i w:val="0"/>
+                <w:color w:val="000000"/>
+                <w:sz w:val="18"/>
+                <w:u w:val="none"/>
+              </w:rPr>
+              <w:t>Deriving Kinematic Equation 1</w:t>
+            </w:r>
+          </w:p>
+          <w:p>
+            <w:pPr>
+              <w:spacing w:before="80" w:after="80"/>
+            </w:pPr>
+            <w:r>
+              <w:rPr>
+                <w:rFonts w:ascii="Calibri" w:hAnsi="Calibri"/>
                 <w:b/>
                 <w:i w:val="0"/>
                 <w:color w:val="000000"/>
                 <w:sz w:val="16"/>
                 <w:u w:val="none"/>
               </w:rPr>
-              <w:t xml:space="preserve">Name: </w:t>
+              <w:t xml:space="preserve">GOAL: Derive  </w:t>
             </w:r>
+            <m:oMath>
+              <m:r>
+                <m:t>v</m:t>
+              </m:r>
+              <m:r>
+                <m:rPr>
+                  <m:sty m:val="p"/>
+                </m:rPr>
+                <m:t> = </m:t>
+              </m:r>
+              <m:sSub>
+                <m:e>
+                  <m:r>
+                    <m:t>v</m:t>
+                  </m:r>
+                </m:e>
+                <m:sub>
+                  <m:r>
+                    <m:rPr>
+                      <m:sty m:val="p"/>
+                    </m:rPr>
+                    <m:t>0</m:t>
+                  </m:r>
+                </m:sub>
+              </m:sSub>
+              <m:r>
+                <m:rPr>
+                  <m:sty m:val="p"/>
+                </m:rPr>
+                <m:t> + </m:t>
+              </m:r>
+              <m:r>
+                <m:t>at</m:t>
+              </m:r>
+            </m:oMath>
+          </w:p>
+          <w:p>
+            <w:pPr>
+              <w:spacing w:before="60" w:after="0"/>
+            </w:pPr>
             <w:r>
               <w:rPr>
-                <w:rFonts w:ascii="Times New Roman" w:hAnsi="Times New Roman"/>
+                <w:rFonts w:ascii="Calibri" w:hAnsi="Calibri"/>
                 <w:b w:val="0"/>
                 <w:i w:val="0"/>
                 <w:color w:val="000000"/>
-                <w:sz w:val="16"/>
+                <w:sz w:val="18"/>
                 <w:u w:val="none"/>
               </w:rPr>
-              <w:tab/>
-              <w:tab/>
-              <w:tab/>
-              <w:tab/>
-              <w:tab/>
-              <w:tab/>
-              <w:tab/>
+              <w:t>1. Acceleration is defined as the rate of change of velocity over time. Write the general definition of acceleration using delta notation (a = ?):</w:t>
             </w:r>
           </w:p>
           <w:p>
             <w:pPr>
-              <w:spacing w:after="20"/>
+              <w:spacing w:before="60" w:after="0"/>
               <w:pBdr>
-                <w:bottom w:val="single" w:sz="4" w:space="1" w:color="000000"/>
+                <w:bottom w:val="single" w:sz="4" w:space="1" w:color="999999"/>
               </w:pBdr>
             </w:pPr>
             <w:r>
               <w:rPr>
-                <w:rFonts w:ascii="Times New Roman" w:hAnsi="Times New Roman"/>
+                <w:rFonts w:ascii="Calibri" w:hAnsi="Calibri"/>
                 <w:b w:val="0"/>
                 <w:i w:val="0"/>
                 <w:color w:val="000000"/>
-                <w:sz w:val="16"/>
+                <w:sz w:val="22"/>
                 <w:u w:val="none"/>
               </w:rPr>
               <w:t xml:space="preserve"> </w:t>
@@ -94,34 +193,34 @@
           </w:p>
           <w:p>
             <w:pPr>
-              <w:spacing w:after="20" w:before="60"/>
+              <w:spacing w:before="60" w:after="0"/>
             </w:pPr>
             <w:r>
               <w:rPr>
-                <w:rFonts w:ascii="Times New Roman" w:hAnsi="Times New Roman"/>
-                <w:b/>
+                <w:rFonts w:ascii="Calibri" w:hAnsi="Calibri"/>
+                <w:b w:val="0"/>
                 <w:i w:val="0"/>
                 <w:color w:val="000000"/>
-                <w:sz w:val="16"/>
+                <w:sz w:val="18"/>
                 <w:u w:val="none"/>
               </w:rPr>
-              <w:t xml:space="preserve">Grade &amp; Section: </w:t>
+              <w:t>2. The change in velocity is Δv = v − v₀, and if timing starts at t = 0, then Δt = t. Substitute these into the definition you wrote above:</w:t>
             </w:r>
           </w:p>
           <w:p>
             <w:pPr>
-              <w:spacing w:after="20"/>
+              <w:spacing w:before="60" w:after="0"/>
               <w:pBdr>
-                <w:bottom w:val="single" w:sz="4" w:space="1" w:color="000000"/>
+                <w:bottom w:val="single" w:sz="4" w:space="1" w:color="999999"/>
               </w:pBdr>
             </w:pPr>
             <w:r>
               <w:rPr>
-                <w:rFonts w:ascii="Times New Roman" w:hAnsi="Times New Roman"/>
+                <w:rFonts w:ascii="Calibri" w:hAnsi="Calibri"/>
                 <w:b w:val="0"/>
                 <w:i w:val="0"/>
                 <w:color w:val="000000"/>
-                <w:sz w:val="16"/>
+                <w:sz w:val="22"/>
                 <w:u w:val="none"/>
               </w:rPr>
               <w:t xml:space="preserve"> </w:t>
@@ -129,34 +228,34 @@
           </w:p>
           <w:p>
             <w:pPr>
-              <w:spacing w:after="20" w:before="60"/>
+              <w:spacing w:before="60" w:after="0"/>
             </w:pPr>
             <w:r>
               <w:rPr>
-                <w:rFonts w:ascii="Times New Roman" w:hAnsi="Times New Roman"/>
-                <w:b/>
+                <w:rFonts w:ascii="Calibri" w:hAnsi="Calibri"/>
+                <w:b w:val="0"/>
                 <w:i w:val="0"/>
                 <w:color w:val="000000"/>
-                <w:sz w:val="16"/>
+                <w:sz w:val="18"/>
                 <w:u w:val="none"/>
               </w:rPr>
-              <w:t xml:space="preserve">Date: </w:t>
+              <w:t>3. Using the equation you arrived at, multiply both sides by t to eliminate the fraction. Write the result:</w:t>
             </w:r>
           </w:p>
           <w:p>
             <w:pPr>
-              <w:spacing w:after="80"/>
+              <w:spacing w:before="60" w:after="0"/>
               <w:pBdr>
-                <w:bottom w:val="single" w:sz="4" w:space="1" w:color="000000"/>
+                <w:bottom w:val="single" w:sz="4" w:space="1" w:color="999999"/>
               </w:pBdr>
             </w:pPr>
             <w:r>
               <w:rPr>
-                <w:rFonts w:ascii="Times New Roman" w:hAnsi="Times New Roman"/>
+                <w:rFonts w:ascii="Calibri" w:hAnsi="Calibri"/>
                 <w:b w:val="0"/>
                 <w:i w:val="0"/>
                 <w:color w:val="000000"/>
-                <w:sz w:val="16"/>
+                <w:sz w:val="22"/>
                 <w:u w:val="none"/>
               </w:rPr>
               <w:t xml:space="preserve"> </w:t>
@@ -164,451 +263,34 @@
           </w:p>
           <w:p>
             <w:pPr>
-              <w:spacing w:before="40" w:after="0"/>
-              <w:jc w:val="center"/>
-              <w:pBdr>
-                <w:top w:val="single" w:sz="10" w:space="4" w:color="000000"/>
-                <w:left w:val="single" w:sz="10" w:space="4" w:color="000000"/>
-                <w:bottom w:val="single" w:sz="10" w:space="4" w:color="000000"/>
-                <w:right w:val="single" w:sz="10" w:space="4" w:color="000000"/>
-              </w:pBdr>
+              <w:spacing w:before="60" w:after="0"/>
             </w:pPr>
             <w:r>
               <w:rPr>
-                <w:rFonts w:ascii="Times New Roman" w:hAnsi="Times New Roman"/>
-                <w:b/>
-                <w:i w:val="0"/>
-                <w:color w:val="000000"/>
-                <w:sz w:val="22"/>
-                <w:u w:val="none"/>
-              </w:rPr>
-              <w:t>PART A</w:t>
-            </w:r>
-          </w:p>
-          <w:p>
-            <w:pPr>
-              <w:spacing w:after="120"/>
-              <w:jc w:val="center"/>
-            </w:pPr>
-            <w:r>
-              <w:rPr>
-                <w:rFonts w:ascii="Times New Roman" w:hAnsi="Times New Roman"/>
+                <w:rFonts w:ascii="Calibri" w:hAnsi="Calibri"/>
                 <w:b w:val="0"/>
-                <w:i/>
-                <w:color w:val="000000"/>
-                <w:sz w:val="15"/>
-                <w:u w:val="none"/>
-              </w:rPr>
-              <w:t>Kinematics Activity Sheet</w:t>
-            </w:r>
-          </w:p>
-          <w:p>
-            <w:pPr>
-              <w:spacing w:after="60"/>
-              <w:pBdr>
-                <w:bottom w:val="single" w:sz="6" w:space="1" w:color="555555"/>
-              </w:pBdr>
-            </w:pPr>
-            <w:r>
-              <w:rPr>
-                <w:rFonts w:ascii="Times New Roman" w:hAnsi="Times New Roman"/>
-                <w:b/>
-                <w:i w:val="0"/>
-                <w:color w:val="000000"/>
-                <w:sz w:val="19"/>
-                <w:u w:val="none"/>
-              </w:rPr>
-              <w:t>DERIVING KINEMATIC EQUATION 1</w:t>
-            </w:r>
-          </w:p>
-          <w:p>
-            <w:pPr>
-              <w:spacing w:before="40" w:after="120"/>
-              <w:pBdr>
-                <w:top w:val="single" w:sz="8" w:space="4" w:color="000000"/>
-                <w:left w:val="single" w:sz="8" w:space="4" w:color="000000"/>
-                <w:bottom w:val="single" w:sz="8" w:space="4" w:color="000000"/>
-                <w:right w:val="single" w:sz="8" w:space="4" w:color="000000"/>
-              </w:pBdr>
-              <w:shd w:val="clear" w:color="auto" w:fill="E8E8E8"/>
-            </w:pPr>
-            <w:r>
-              <w:rPr>
-                <w:rFonts w:ascii="Times New Roman" w:hAnsi="Times New Roman"/>
-                <w:b/>
-                <w:i w:val="0"/>
-                <w:color w:val="000000"/>
-                <w:sz w:val="17"/>
-                <w:u w:val="none"/>
-              </w:rPr>
-              <w:t xml:space="preserve">Goal:  </w:t>
-            </w:r>
-            <w:r>
-              <w:rPr>
-                <w:rFonts w:ascii="Times New Roman" w:hAnsi="Times New Roman"/>
-                <w:b w:val="0"/>
-                <w:i w:val="0"/>
-                <w:color w:val="000000"/>
-                <w:sz w:val="17"/>
-                <w:u w:val="none"/>
-              </w:rPr>
-              <w:t xml:space="preserve">Derive the equation  </w:t>
-            </w:r>
-            <w:r>
-              <w:rPr>
-                <w:rFonts w:ascii="Times New Roman" w:hAnsi="Times New Roman"/>
-                <w:b/>
                 <w:i w:val="0"/>
                 <w:color w:val="000000"/>
                 <w:sz w:val="18"/>
                 <w:u w:val="none"/>
               </w:rPr>
-              <w:t>v</w:t>
-            </w:r>
-            <w:r>
-              <w:rPr>
-                <w:rFonts w:ascii="Times New Roman" w:hAnsi="Times New Roman"/>
-                <w:b/>
-                <w:i w:val="0"/>
-                <w:color w:val="000000"/>
-                <w:sz w:val="18"/>
-                <w:u w:val="none"/>
-              </w:rPr>
-              <w:t xml:space="preserve"> = v</w:t>
-            </w:r>
-            <w:r>
-              <w:rPr>
-                <w:rFonts w:ascii="Times New Roman" w:hAnsi="Times New Roman"/>
-                <w:b/>
-                <w:i w:val="0"/>
-                <w:color w:val="000000"/>
-                <w:sz w:val="18"/>
-                <w:u w:val="none"/>
-                <w:vertAlign w:val="subscript"/>
-              </w:rPr>
-              <w:t>0</w:t>
-            </w:r>
-            <w:r>
-              <w:rPr>
-                <w:rFonts w:ascii="Times New Roman" w:hAnsi="Times New Roman"/>
-                <w:b/>
-                <w:i w:val="0"/>
-                <w:color w:val="000000"/>
-                <w:sz w:val="18"/>
-                <w:u w:val="none"/>
-              </w:rPr>
-              <w:t xml:space="preserve"> + at</w:t>
+              <w:t>4. Now add v₀ to both sides of your equation to isolate v. Write the final equation:</w:t>
             </w:r>
           </w:p>
           <w:p>
             <w:pPr>
-              <w:spacing w:before="100" w:after="20"/>
-            </w:pPr>
-            <w:r>
-              <w:rPr>
-                <w:rFonts w:ascii="Times New Roman" w:hAnsi="Times New Roman"/>
-                <w:b/>
-                <w:i w:val="0"/>
-                <w:color w:val="000000"/>
-                <w:sz w:val="19"/>
-                <w:u w:val="none"/>
-              </w:rPr>
-              <w:t xml:space="preserve">1.  </w:t>
-            </w:r>
-            <w:r>
-              <w:rPr>
-                <w:rFonts w:ascii="Times New Roman" w:hAnsi="Times New Roman"/>
-                <w:b/>
-                <w:i w:val="0"/>
-                <w:color w:val="000000"/>
-                <w:sz w:val="18"/>
-                <w:u w:val="single"/>
-              </w:rPr>
-              <w:t>State the Definition of Acceleration</w:t>
-            </w:r>
-          </w:p>
-          <w:p>
-            <w:pPr>
-              <w:spacing w:after="40"/>
-              <w:ind w:left="202"/>
-            </w:pPr>
-            <w:r>
-              <w:rPr>
-                <w:rFonts w:ascii="Times New Roman" w:hAnsi="Times New Roman"/>
-                <w:b w:val="0"/>
-                <w:i w:val="0"/>
-                <w:color w:val="000000"/>
-                <w:sz w:val="17"/>
-                <w:u w:val="none"/>
-              </w:rPr>
-              <w:t>Recall that acceleration is defined as the rate of change of velocity over time. Write the defining formula for average acceleration using delta notation:</w:t>
-            </w:r>
-          </w:p>
-          <w:p>
-            <w:pPr>
-              <w:spacing w:before="40" w:after="60"/>
-              <w:jc w:val="center"/>
-            </w:pPr>
-            <w:r>
-              <w:rPr>
-                <w:rFonts w:ascii="Times New Roman" w:hAnsi="Times New Roman"/>
-                <w:b w:val="0"/>
-                <w:i w:val="0"/>
-                <w:color w:val="000000"/>
-                <w:sz w:val="20"/>
-                <w:u w:val="none"/>
-              </w:rPr>
-              <w:t xml:space="preserve">a = </w:t>
-            </w:r>
-            <w:r>
-              <w:rPr>
-                <w:rFonts w:ascii="Times New Roman" w:hAnsi="Times New Roman"/>
-                <w:b w:val="0"/>
-                <w:i w:val="0"/>
-                <w:color w:val="000000"/>
-                <w:sz w:val="20"/>
-                <w:u w:val="none"/>
-              </w:rPr>
-              <w:t>Δv</w:t>
-            </w:r>
-            <w:r>
-              <w:rPr>
-                <w:rFonts w:ascii="Times New Roman" w:hAnsi="Times New Roman"/>
-                <w:b w:val="0"/>
-                <w:i w:val="0"/>
-                <w:color w:val="000000"/>
-                <w:sz w:val="20"/>
-                <w:u w:val="none"/>
-              </w:rPr>
-              <w:t xml:space="preserve"> / </w:t>
-            </w:r>
-            <w:r>
-              <w:rPr>
-                <w:rFonts w:ascii="Times New Roman" w:hAnsi="Times New Roman"/>
-                <w:b w:val="0"/>
-                <w:i w:val="0"/>
-                <w:color w:val="000000"/>
-                <w:sz w:val="20"/>
-                <w:u w:val="none"/>
-              </w:rPr>
-              <w:t>Δt</w:t>
-            </w:r>
-          </w:p>
-          <w:p>
-            <w:pPr>
-              <w:spacing w:after="40"/>
-              <w:ind w:left="202"/>
-            </w:pPr>
-            <w:r>
-              <w:rPr>
-                <w:rFonts w:ascii="Times New Roman" w:hAnsi="Times New Roman"/>
-                <w:b w:val="0"/>
-                <w:i w:val="0"/>
-                <w:color w:val="000000"/>
-                <w:sz w:val="17"/>
-                <w:u w:val="none"/>
-              </w:rPr>
-              <w:t>Identify what each symbol represents: Δv is the change in velocity, and Δt is the elapsed time interval.</w:t>
-            </w:r>
-          </w:p>
-          <w:p>
-            <w:pPr>
-              <w:spacing w:before="100" w:after="20"/>
-            </w:pPr>
-            <w:r>
-              <w:rPr>
-                <w:rFonts w:ascii="Times New Roman" w:hAnsi="Times New Roman"/>
-                <w:b/>
-                <w:i w:val="0"/>
-                <w:color w:val="000000"/>
-                <w:sz w:val="19"/>
-                <w:u w:val="none"/>
-              </w:rPr>
-              <w:t xml:space="preserve">2.  </w:t>
-            </w:r>
-            <w:r>
-              <w:rPr>
-                <w:rFonts w:ascii="Times New Roman" w:hAnsi="Times New Roman"/>
-                <w:b/>
-                <w:i w:val="0"/>
-                <w:color w:val="000000"/>
-                <w:sz w:val="18"/>
-                <w:u w:val="single"/>
-              </w:rPr>
-              <w:t>Expand the Delta Notation</w:t>
-            </w:r>
-          </w:p>
-          <w:p>
-            <w:pPr>
-              <w:spacing w:after="40"/>
-              <w:ind w:left="202"/>
-            </w:pPr>
-            <w:r>
-              <w:rPr>
-                <w:rFonts w:ascii="Times New Roman" w:hAnsi="Times New Roman"/>
-                <w:b w:val="0"/>
-                <w:i w:val="0"/>
-                <w:color w:val="000000"/>
-                <w:sz w:val="17"/>
-                <w:u w:val="none"/>
-              </w:rPr>
-              <w:t>Using the definitions from Step 1, replace Δv with (v − v₀) and replace Δt with t, assuming motion starts at t = 0. Rewrite the formula with these substitutions clearly shown:</w:t>
-            </w:r>
-          </w:p>
-          <w:p>
-            <w:pPr>
-              <w:spacing w:before="40" w:after="60"/>
-              <w:jc w:val="center"/>
-            </w:pPr>
-            <w:r>
-              <w:rPr>
-                <w:rFonts w:ascii="Times New Roman" w:hAnsi="Times New Roman"/>
-                <w:b w:val="0"/>
-                <w:i w:val="0"/>
-                <w:color w:val="000000"/>
-                <w:sz w:val="20"/>
-                <w:u w:val="none"/>
-              </w:rPr>
-              <w:t>a = (v − v</w:t>
-            </w:r>
-            <w:r>
-              <w:rPr>
-                <w:rFonts w:ascii="Times New Roman" w:hAnsi="Times New Roman"/>
-                <w:b w:val="0"/>
-                <w:i w:val="0"/>
-                <w:color w:val="000000"/>
-                <w:sz w:val="20"/>
-                <w:u w:val="none"/>
-                <w:vertAlign w:val="subscript"/>
-              </w:rPr>
-              <w:t>0</w:t>
-            </w:r>
-            <w:r>
-              <w:rPr>
-                <w:rFonts w:ascii="Times New Roman" w:hAnsi="Times New Roman"/>
-                <w:b w:val="0"/>
-                <w:i w:val="0"/>
-                <w:color w:val="000000"/>
-                <w:sz w:val="20"/>
-                <w:u w:val="none"/>
-              </w:rPr>
-              <w:t>) / t</w:t>
-            </w:r>
-          </w:p>
-          <w:p>
-            <w:pPr>
-              <w:spacing w:before="100" w:after="20"/>
-            </w:pPr>
-            <w:r>
-              <w:rPr>
-                <w:rFonts w:ascii="Times New Roman" w:hAnsi="Times New Roman"/>
-                <w:b/>
-                <w:i w:val="0"/>
-                <w:color w:val="000000"/>
-                <w:sz w:val="19"/>
-                <w:u w:val="none"/>
-              </w:rPr>
-              <w:t xml:space="preserve">3.  </w:t>
-            </w:r>
-            <w:r>
-              <w:rPr>
-                <w:rFonts w:ascii="Times New Roman" w:hAnsi="Times New Roman"/>
-                <w:b/>
-                <w:i w:val="0"/>
-                <w:color w:val="000000"/>
-                <w:sz w:val="18"/>
-                <w:u w:val="single"/>
-              </w:rPr>
-              <w:t>Isolate the Final Velocity</w:t>
-            </w:r>
-          </w:p>
-          <w:p>
-            <w:pPr>
-              <w:spacing w:after="40"/>
-              <w:ind w:left="202"/>
-            </w:pPr>
-            <w:r>
-              <w:rPr>
-                <w:rFonts w:ascii="Times New Roman" w:hAnsi="Times New Roman"/>
-                <w:b w:val="0"/>
-                <w:i w:val="0"/>
-                <w:color w:val="000000"/>
-                <w:sz w:val="17"/>
-                <w:u w:val="none"/>
-              </w:rPr>
-              <w:t>Using the equation from Step 2, eliminate the fraction by multiplying both sides by t. Then isolate v by moving v0 to the other side. Show each algebraic step in the work area below until you arrive at:</w:t>
-            </w:r>
-          </w:p>
-          <w:p>
-            <w:pPr>
-              <w:spacing w:before="40" w:after="60"/>
-              <w:jc w:val="center"/>
-            </w:pPr>
-            <w:r>
-              <w:rPr>
-                <w:rFonts w:ascii="Times New Roman" w:hAnsi="Times New Roman"/>
-                <w:b w:val="0"/>
-                <w:i w:val="0"/>
-                <w:color w:val="000000"/>
-                <w:sz w:val="20"/>
-                <w:u w:val="none"/>
-              </w:rPr>
-              <w:t>v = v</w:t>
-            </w:r>
-            <w:r>
-              <w:rPr>
-                <w:rFonts w:ascii="Times New Roman" w:hAnsi="Times New Roman"/>
-                <w:b w:val="0"/>
-                <w:i w:val="0"/>
-                <w:color w:val="000000"/>
-                <w:sz w:val="20"/>
-                <w:u w:val="none"/>
-                <w:vertAlign w:val="subscript"/>
-              </w:rPr>
-              <w:t>0</w:t>
-            </w:r>
-            <w:r>
-              <w:rPr>
-                <w:rFonts w:ascii="Times New Roman" w:hAnsi="Times New Roman"/>
-                <w:b w:val="0"/>
-                <w:i w:val="0"/>
-                <w:color w:val="000000"/>
-                <w:sz w:val="20"/>
-                <w:u w:val="none"/>
-              </w:rPr>
-              <w:t xml:space="preserve"> + at</w:t>
-            </w:r>
-          </w:p>
-          <w:p>
-            <w:pPr>
-              <w:spacing w:before="120" w:after="20"/>
-            </w:pPr>
-            <w:r>
-              <w:rPr>
-                <w:rFonts w:ascii="Times New Roman" w:hAnsi="Times New Roman"/>
-                <w:b w:val="0"/>
-                <w:i/>
-                <w:color w:val="555555"/>
-                <w:sz w:val="14"/>
-                <w:u w:val="none"/>
-              </w:rPr>
-              <w:t>Work Area</w:t>
-            </w:r>
-          </w:p>
-          <w:p>
-            <w:pPr>
-              <w:spacing w:after="180"/>
+              <w:spacing w:before="60" w:after="0"/>
               <w:pBdr>
-                <w:bottom w:val="single" w:sz="3" w:space="1" w:color="AAAAAA"/>
+                <w:bottom w:val="single" w:sz="4" w:space="1" w:color="999999"/>
               </w:pBdr>
             </w:pPr>
             <w:r>
               <w:rPr>
-                <w:rFonts w:ascii="Times New Roman" w:hAnsi="Times New Roman"/>
+                <w:rFonts w:ascii="Calibri" w:hAnsi="Calibri"/>
                 <w:b w:val="0"/>
                 <w:i w:val="0"/>
                 <w:color w:val="000000"/>
-                <w:sz w:val="14"/>
+                <w:sz w:val="22"/>
                 <w:u w:val="none"/>
               </w:rPr>
               <w:t xml:space="preserve"> </w:t>
@@ -616,71 +298,71 @@
           </w:p>
           <w:p>
             <w:pPr>
-              <w:spacing w:after="180"/>
+              <w:spacing w:before="100" w:after="40"/>
               <w:pBdr>
-                <w:bottom w:val="single" w:sz="3" w:space="1" w:color="AAAAAA"/>
+                <w:top w:val="single" w:sz="6" w:space="2" w:color="000000"/>
+                <w:left w:val="single" w:sz="6" w:space="2" w:color="000000"/>
+                <w:bottom w:val="single" w:sz="6" w:space="2" w:color="000000"/>
+                <w:right w:val="single" w:sz="6" w:space="2" w:color="000000"/>
               </w:pBdr>
             </w:pPr>
             <w:r>
               <w:rPr>
-                <w:rFonts w:ascii="Times New Roman" w:hAnsi="Times New Roman"/>
-                <w:b w:val="0"/>
+                <w:rFonts w:ascii="Calibri" w:hAnsi="Calibri"/>
+                <w:b/>
                 <w:i w:val="0"/>
                 <w:color w:val="000000"/>
-                <w:sz w:val="14"/>
+                <w:sz w:val="16"/>
                 <w:u w:val="none"/>
               </w:rPr>
-              <w:t xml:space="preserve"> </w:t>
+              <w:t xml:space="preserve"> ✓  Final Equation 1:  </w:t>
             </w:r>
-          </w:p>
-          <w:p>
-            <w:pPr>
-              <w:spacing w:after="180"/>
-              <w:pBdr>
-                <w:bottom w:val="single" w:sz="3" w:space="1" w:color="AAAAAA"/>
-              </w:pBdr>
-            </w:pPr>
-            <w:r>
-              <w:rPr>
-                <w:rFonts w:ascii="Times New Roman" w:hAnsi="Times New Roman"/>
-                <w:b w:val="0"/>
-                <w:i w:val="0"/>
-                <w:color w:val="000000"/>
-                <w:sz w:val="14"/>
-                <w:u w:val="none"/>
-              </w:rPr>
-              <w:t xml:space="preserve"> </w:t>
-            </w:r>
-          </w:p>
-          <w:p>
-            <w:pPr>
-              <w:spacing w:after="180"/>
-              <w:pBdr>
-                <w:bottom w:val="single" w:sz="3" w:space="1" w:color="AAAAAA"/>
-              </w:pBdr>
-            </w:pPr>
-            <w:r>
-              <w:rPr>
-                <w:rFonts w:ascii="Times New Roman" w:hAnsi="Times New Roman"/>
-                <w:b w:val="0"/>
-                <w:i w:val="0"/>
-                <w:color w:val="000000"/>
-                <w:sz w:val="14"/>
-                <w:u w:val="none"/>
-              </w:rPr>
-              <w:t xml:space="preserve"> </w:t>
-            </w:r>
+            <m:oMath>
+              <m:r>
+                <m:t>v</m:t>
+              </m:r>
+              <m:r>
+                <m:rPr>
+                  <m:sty m:val="p"/>
+                </m:rPr>
+                <m:t> = </m:t>
+              </m:r>
+              <m:sSub>
+                <m:e>
+                  <m:r>
+                    <m:t>v</m:t>
+                  </m:r>
+                </m:e>
+                <m:sub>
+                  <m:r>
+                    <m:rPr>
+                      <m:sty m:val="p"/>
+                    </m:rPr>
+                    <m:t>0</m:t>
+                  </m:r>
+                </m:sub>
+              </m:sSub>
+              <m:r>
+                <m:rPr>
+                  <m:sty m:val="p"/>
+                </m:rPr>
+                <m:t> + </m:t>
+              </m:r>
+              <m:r>
+                <m:t>at</m:t>
+              </m:r>
+            </m:oMath>
           </w:p>
         </w:tc>
         <w:tc>
           <w:tcPr>
-            <w:tcW w:type="dxa" w:w="4428"/>
-            <w:tcW w:w="4428" w:type="dxa"/>
+            <w:tcW w:type="dxa" w:w="7"/>
+            <w:tcW w:w="4464" w:type="dxa"/>
             <w:tcMar>
-              <w:top w:w="50" w:type="dxa"/>
-              <w:bottom w:w="50" w:type="dxa"/>
-              <w:left w:w="70" w:type="dxa"/>
-              <w:right w:w="70" w:type="dxa"/>
+              <w:top w:w="40" w:type="dxa"/>
+              <w:bottom w:w="30" w:type="dxa"/>
+              <w:left w:w="60" w:type="dxa"/>
+              <w:right w:w="60" w:type="dxa"/>
             </w:tcMar>
             <w:vAlign w:val="top"/>
             <w:tcBorders>
@@ -691,55 +373,199 @@
             </w:tcBorders>
           </w:tcPr>
           <w:p>
-            <w:r/>
+            <w:pPr>
+              <w:spacing w:after="0" w:before="0"/>
+            </w:pPr>
+            <w:r>
+              <w:rPr>
+                <w:rFonts w:ascii="Calibri" w:hAnsi="Calibri"/>
+                <w:b w:val="0"/>
+                <w:i w:val="0"/>
+                <w:color w:val="000000"/>
+                <w:sz w:val="16"/>
+                <w:u w:val="none"/>
+              </w:rPr>
+              <w:t>Name: ___________________________________</w:t>
+            </w:r>
           </w:p>
           <w:p>
             <w:pPr>
-              <w:spacing w:after="20"/>
+              <w:spacing w:before="40" w:after="0"/>
             </w:pPr>
             <w:r>
               <w:rPr>
-                <w:rFonts w:ascii="Times New Roman" w:hAnsi="Times New Roman"/>
+                <w:rFonts w:ascii="Calibri" w:hAnsi="Calibri"/>
+                <w:b w:val="0"/>
+                <w:i w:val="0"/>
+                <w:color w:val="000000"/>
+                <w:sz w:val="16"/>
+                <w:u w:val="none"/>
+              </w:rPr>
+              <w:t>Grade &amp; Section: _____________  Date: __________</w:t>
+            </w:r>
+          </w:p>
+          <w:p>
+            <w:pPr>
+              <w:spacing w:before="100" w:after="20"/>
+              <w:jc w:val="center"/>
+              <w:pBdr>
+                <w:top w:val="single" w:sz="8" w:space="2" w:color="000000"/>
+                <w:left w:val="single" w:sz="8" w:space="2" w:color="000000"/>
+                <w:bottom w:val="single" w:sz="8" w:space="2" w:color="000000"/>
+                <w:right w:val="single" w:sz="8" w:space="2" w:color="000000"/>
+              </w:pBdr>
+              <w:shd w:val="clear" w:color="auto" w:fill="EDEDED"/>
+            </w:pPr>
+            <w:r>
+              <w:rPr>
+                <w:rFonts w:ascii="Calibri" w:hAnsi="Calibri"/>
+                <w:b/>
+                <w:i w:val="0"/>
+                <w:color w:val="000000"/>
+                <w:sz w:val="18"/>
+                <w:u w:val="none"/>
+              </w:rPr>
+              <w:t xml:space="preserve">PART B: </w:t>
+            </w:r>
+            <w:r>
+              <w:rPr>
+                <w:rFonts w:ascii="Calibri" w:hAnsi="Calibri"/>
+                <w:b/>
+                <w:i w:val="0"/>
+                <w:color w:val="000000"/>
+                <w:sz w:val="18"/>
+                <w:u w:val="none"/>
+              </w:rPr>
+              <w:t>Deriving Kinematic Equation 4</w:t>
+            </w:r>
+          </w:p>
+          <w:p>
+            <w:pPr>
+              <w:spacing w:before="80" w:after="80"/>
+            </w:pPr>
+            <w:r>
+              <w:rPr>
+                <w:rFonts w:ascii="Calibri" w:hAnsi="Calibri"/>
                 <w:b/>
                 <w:i w:val="0"/>
                 <w:color w:val="000000"/>
                 <w:sz w:val="16"/>
                 <w:u w:val="none"/>
               </w:rPr>
-              <w:t xml:space="preserve">Name: </w:t>
+              <w:t xml:space="preserve">GOAL: Derive  </w:t>
             </w:r>
+            <m:oMath>
+              <m:r>
+                <m:t>x</m:t>
+              </m:r>
+              <m:r>
+                <m:rPr>
+                  <m:sty m:val="p"/>
+                </m:rPr>
+                <m:t> = </m:t>
+              </m:r>
+              <m:sSub>
+                <m:e>
+                  <m:r>
+                    <m:t>x</m:t>
+                  </m:r>
+                </m:e>
+                <m:sub>
+                  <m:r>
+                    <m:rPr>
+                      <m:sty m:val="p"/>
+                    </m:rPr>
+                    <m:t>0</m:t>
+                  </m:r>
+                </m:sub>
+              </m:sSub>
+              <m:r>
+                <m:rPr>
+                  <m:sty m:val="p"/>
+                </m:rPr>
+                <m:t> + </m:t>
+              </m:r>
+              <m:f>
+                <m:num>
+                  <m:r>
+                    <m:rPr>
+                      <m:sty m:val="p"/>
+                    </m:rPr>
+                    <m:t>1</m:t>
+                  </m:r>
+                </m:num>
+                <m:den>
+                  <m:r>
+                    <m:rPr>
+                      <m:sty m:val="p"/>
+                    </m:rPr>
+                    <m:t>2</m:t>
+                  </m:r>
+                </m:den>
+              </m:f>
+              <m:d>
+                <m:e>
+                  <m:sSub>
+                    <m:e>
+                      <m:r>
+                        <m:t>v</m:t>
+                      </m:r>
+                    </m:e>
+                    <m:sub>
+                      <m:r>
+                        <m:rPr>
+                          <m:sty m:val="p"/>
+                        </m:rPr>
+                        <m:t>0</m:t>
+                      </m:r>
+                    </m:sub>
+                  </m:sSub>
+                  <m:r>
+                    <m:rPr>
+                      <m:sty m:val="p"/>
+                    </m:rPr>
+                    <m:t> + </m:t>
+                  </m:r>
+                  <m:r>
+                    <m:t>v</m:t>
+                  </m:r>
+                </m:e>
+              </m:d>
+              <m:r>
+                <m:t>t</m:t>
+              </m:r>
+            </m:oMath>
+          </w:p>
+          <w:p>
+            <w:pPr>
+              <w:spacing w:before="60" w:after="0"/>
+            </w:pPr>
             <w:r>
               <w:rPr>
-                <w:rFonts w:ascii="Times New Roman" w:hAnsi="Times New Roman"/>
+                <w:rFonts w:ascii="Calibri" w:hAnsi="Calibri"/>
                 <w:b w:val="0"/>
                 <w:i w:val="0"/>
                 <w:color w:val="000000"/>
-                <w:sz w:val="16"/>
+                <w:sz w:val="18"/>
                 <w:u w:val="none"/>
               </w:rPr>
-              <w:tab/>
-              <w:tab/>
-              <w:tab/>
-              <w:tab/>
-              <w:tab/>
-              <w:tab/>
-              <w:tab/>
+              <w:t>1. Average velocity is defined as total displacement over total time. Write this definition as a formula (v_avg = ?):</w:t>
             </w:r>
           </w:p>
           <w:p>
             <w:pPr>
-              <w:spacing w:after="20"/>
+              <w:spacing w:before="60" w:after="0"/>
               <w:pBdr>
-                <w:bottom w:val="single" w:sz="4" w:space="1" w:color="000000"/>
+                <w:bottom w:val="single" w:sz="4" w:space="1" w:color="999999"/>
               </w:pBdr>
             </w:pPr>
             <w:r>
               <w:rPr>
-                <w:rFonts w:ascii="Times New Roman" w:hAnsi="Times New Roman"/>
+                <w:rFonts w:ascii="Calibri" w:hAnsi="Calibri"/>
                 <w:b w:val="0"/>
                 <w:i w:val="0"/>
                 <w:color w:val="000000"/>
-                <w:sz w:val="16"/>
+                <w:sz w:val="22"/>
                 <w:u w:val="none"/>
               </w:rPr>
               <w:t xml:space="preserve"> </w:t>
@@ -747,34 +573,34 @@
           </w:p>
           <w:p>
             <w:pPr>
-              <w:spacing w:after="20" w:before="60"/>
+              <w:spacing w:before="60" w:after="0"/>
             </w:pPr>
             <w:r>
               <w:rPr>
-                <w:rFonts w:ascii="Times New Roman" w:hAnsi="Times New Roman"/>
-                <w:b/>
+                <w:rFonts w:ascii="Calibri" w:hAnsi="Calibri"/>
+                <w:b w:val="0"/>
                 <w:i w:val="0"/>
                 <w:color w:val="000000"/>
-                <w:sz w:val="16"/>
+                <w:sz w:val="18"/>
                 <w:u w:val="none"/>
               </w:rPr>
-              <w:t xml:space="preserve">Grade &amp; Section: </w:t>
+              <w:t>2. Using the equation above, multiply both sides by t and then isolate the final position x on one side. Write the result:</w:t>
             </w:r>
           </w:p>
           <w:p>
             <w:pPr>
-              <w:spacing w:after="20"/>
+              <w:spacing w:before="60" w:after="0"/>
               <w:pBdr>
-                <w:bottom w:val="single" w:sz="4" w:space="1" w:color="000000"/>
+                <w:bottom w:val="single" w:sz="4" w:space="1" w:color="999999"/>
               </w:pBdr>
             </w:pPr>
             <w:r>
               <w:rPr>
-                <w:rFonts w:ascii="Times New Roman" w:hAnsi="Times New Roman"/>
+                <w:rFonts w:ascii="Calibri" w:hAnsi="Calibri"/>
                 <w:b w:val="0"/>
                 <w:i w:val="0"/>
                 <w:color w:val="000000"/>
-                <w:sz w:val="16"/>
+                <w:sz w:val="22"/>
                 <w:u w:val="none"/>
               </w:rPr>
               <w:t xml:space="preserve"> </w:t>
@@ -782,34 +608,34 @@
           </w:p>
           <w:p>
             <w:pPr>
-              <w:spacing w:after="20" w:before="60"/>
+              <w:spacing w:before="60" w:after="0"/>
             </w:pPr>
             <w:r>
               <w:rPr>
-                <w:rFonts w:ascii="Times New Roman" w:hAnsi="Times New Roman"/>
-                <w:b/>
+                <w:rFonts w:ascii="Calibri" w:hAnsi="Calibri"/>
+                <w:b w:val="0"/>
                 <w:i w:val="0"/>
                 <w:color w:val="000000"/>
-                <w:sz w:val="16"/>
+                <w:sz w:val="18"/>
                 <w:u w:val="none"/>
               </w:rPr>
-              <w:t xml:space="preserve">Date: </w:t>
+              <w:t>3. Under constant acceleration, velocity changes linearly. The average of any linear quantity is simply the mean of its start and end values. Write v_avg in terms of v₀ and v:</w:t>
             </w:r>
           </w:p>
           <w:p>
             <w:pPr>
-              <w:spacing w:after="80"/>
+              <w:spacing w:before="60" w:after="0"/>
               <w:pBdr>
-                <w:bottom w:val="single" w:sz="4" w:space="1" w:color="000000"/>
+                <w:bottom w:val="single" w:sz="4" w:space="1" w:color="999999"/>
               </w:pBdr>
             </w:pPr>
             <w:r>
               <w:rPr>
-                <w:rFonts w:ascii="Times New Roman" w:hAnsi="Times New Roman"/>
+                <w:rFonts w:ascii="Calibri" w:hAnsi="Calibri"/>
                 <w:b w:val="0"/>
                 <w:i w:val="0"/>
                 <w:color w:val="000000"/>
-                <w:sz w:val="16"/>
+                <w:sz w:val="22"/>
                 <w:u w:val="none"/>
               </w:rPr>
               <w:t xml:space="preserve"> </w:t>
@@ -817,522 +643,34 @@
           </w:p>
           <w:p>
             <w:pPr>
-              <w:spacing w:before="40" w:after="0"/>
-              <w:jc w:val="center"/>
-              <w:pBdr>
-                <w:top w:val="single" w:sz="10" w:space="4" w:color="000000"/>
-                <w:left w:val="single" w:sz="10" w:space="4" w:color="000000"/>
-                <w:bottom w:val="single" w:sz="10" w:space="4" w:color="000000"/>
-                <w:right w:val="single" w:sz="10" w:space="4" w:color="000000"/>
-              </w:pBdr>
+              <w:spacing w:before="60" w:after="0"/>
             </w:pPr>
             <w:r>
               <w:rPr>
-                <w:rFonts w:ascii="Times New Roman" w:hAnsi="Times New Roman"/>
-                <w:b/>
-                <w:i w:val="0"/>
-                <w:color w:val="000000"/>
-                <w:sz w:val="22"/>
-                <w:u w:val="none"/>
-              </w:rPr>
-              <w:t>PART B</w:t>
-            </w:r>
-          </w:p>
-          <w:p>
-            <w:pPr>
-              <w:spacing w:after="120"/>
-              <w:jc w:val="center"/>
-            </w:pPr>
-            <w:r>
-              <w:rPr>
-                <w:rFonts w:ascii="Times New Roman" w:hAnsi="Times New Roman"/>
+                <w:rFonts w:ascii="Calibri" w:hAnsi="Calibri"/>
                 <w:b w:val="0"/>
-                <w:i/>
-                <w:color w:val="000000"/>
-                <w:sz w:val="15"/>
-                <w:u w:val="none"/>
-              </w:rPr>
-              <w:t>Kinematics Activity Sheet</w:t>
-            </w:r>
-          </w:p>
-          <w:p>
-            <w:pPr>
-              <w:spacing w:after="60"/>
-              <w:pBdr>
-                <w:bottom w:val="single" w:sz="6" w:space="1" w:color="555555"/>
-              </w:pBdr>
-            </w:pPr>
-            <w:r>
-              <w:rPr>
-                <w:rFonts w:ascii="Times New Roman" w:hAnsi="Times New Roman"/>
-                <w:b/>
-                <w:i w:val="0"/>
-                <w:color w:val="000000"/>
-                <w:sz w:val="19"/>
-                <w:u w:val="none"/>
-              </w:rPr>
-              <w:t>DERIVING KINEMATIC EQUATION 4</w:t>
-            </w:r>
-          </w:p>
-          <w:p>
-            <w:pPr>
-              <w:spacing w:before="40" w:after="120"/>
-              <w:pBdr>
-                <w:top w:val="single" w:sz="8" w:space="4" w:color="000000"/>
-                <w:left w:val="single" w:sz="8" w:space="4" w:color="000000"/>
-                <w:bottom w:val="single" w:sz="8" w:space="4" w:color="000000"/>
-                <w:right w:val="single" w:sz="8" w:space="4" w:color="000000"/>
-              </w:pBdr>
-              <w:shd w:val="clear" w:color="auto" w:fill="E8E8E8"/>
-            </w:pPr>
-            <w:r>
-              <w:rPr>
-                <w:rFonts w:ascii="Times New Roman" w:hAnsi="Times New Roman"/>
-                <w:b/>
-                <w:i w:val="0"/>
-                <w:color w:val="000000"/>
-                <w:sz w:val="17"/>
-                <w:u w:val="none"/>
-              </w:rPr>
-              <w:t xml:space="preserve">Goal:  </w:t>
-            </w:r>
-            <w:r>
-              <w:rPr>
-                <w:rFonts w:ascii="Times New Roman" w:hAnsi="Times New Roman"/>
-                <w:b w:val="0"/>
-                <w:i w:val="0"/>
-                <w:color w:val="000000"/>
-                <w:sz w:val="17"/>
-                <w:u w:val="none"/>
-              </w:rPr>
-              <w:t xml:space="preserve">Derive the equation  </w:t>
-            </w:r>
-            <w:r>
-              <w:rPr>
-                <w:rFonts w:ascii="Times New Roman" w:hAnsi="Times New Roman"/>
-                <w:b/>
                 <w:i w:val="0"/>
                 <w:color w:val="000000"/>
                 <w:sz w:val="18"/>
                 <w:u w:val="none"/>
               </w:rPr>
-              <w:t>x = x</w:t>
-            </w:r>
-            <w:r>
-              <w:rPr>
-                <w:rFonts w:ascii="Times New Roman" w:hAnsi="Times New Roman"/>
-                <w:b/>
-                <w:i w:val="0"/>
-                <w:color w:val="000000"/>
-                <w:sz w:val="18"/>
-                <w:u w:val="none"/>
-                <w:vertAlign w:val="subscript"/>
-              </w:rPr>
-              <w:t>0</w:t>
-            </w:r>
-            <w:r>
-              <w:rPr>
-                <w:rFonts w:ascii="Times New Roman" w:hAnsi="Times New Roman"/>
-                <w:b/>
-                <w:i w:val="0"/>
-                <w:color w:val="000000"/>
-                <w:sz w:val="18"/>
-                <w:u w:val="none"/>
-              </w:rPr>
-              <w:t xml:space="preserve"> + ½(v</w:t>
-            </w:r>
-            <w:r>
-              <w:rPr>
-                <w:rFonts w:ascii="Times New Roman" w:hAnsi="Times New Roman"/>
-                <w:b/>
-                <w:i w:val="0"/>
-                <w:color w:val="000000"/>
-                <w:sz w:val="18"/>
-                <w:u w:val="none"/>
-                <w:vertAlign w:val="subscript"/>
-              </w:rPr>
-              <w:t>0</w:t>
-            </w:r>
-            <w:r>
-              <w:rPr>
-                <w:rFonts w:ascii="Times New Roman" w:hAnsi="Times New Roman"/>
-                <w:b/>
-                <w:i w:val="0"/>
-                <w:color w:val="000000"/>
-                <w:sz w:val="18"/>
-                <w:u w:val="none"/>
-              </w:rPr>
-              <w:t xml:space="preserve"> + v)t</w:t>
+              <w:t>4. Using the position equation from Step 2, replace v_avg with the expression you found in Step 3. Write the final equation:</w:t>
             </w:r>
           </w:p>
           <w:p>
             <w:pPr>
-              <w:spacing w:before="100" w:after="20"/>
-            </w:pPr>
-            <w:r>
-              <w:rPr>
-                <w:rFonts w:ascii="Times New Roman" w:hAnsi="Times New Roman"/>
-                <w:b/>
-                <w:i w:val="0"/>
-                <w:color w:val="000000"/>
-                <w:sz w:val="19"/>
-                <w:u w:val="none"/>
-              </w:rPr>
-              <w:t xml:space="preserve">1.  </w:t>
-            </w:r>
-            <w:r>
-              <w:rPr>
-                <w:rFonts w:ascii="Times New Roman" w:hAnsi="Times New Roman"/>
-                <w:b/>
-                <w:i w:val="0"/>
-                <w:color w:val="000000"/>
-                <w:sz w:val="18"/>
-                <w:u w:val="single"/>
-              </w:rPr>
-              <w:t>State the Definition of Average Velocity</w:t>
-            </w:r>
-          </w:p>
-          <w:p>
-            <w:pPr>
-              <w:spacing w:after="40"/>
-              <w:ind w:left="202"/>
-            </w:pPr>
-            <w:r>
-              <w:rPr>
-                <w:rFonts w:ascii="Times New Roman" w:hAnsi="Times New Roman"/>
-                <w:b w:val="0"/>
-                <w:i w:val="0"/>
-                <w:color w:val="000000"/>
-                <w:sz w:val="17"/>
-                <w:u w:val="none"/>
-              </w:rPr>
-              <w:t>Write the defining formula for average velocity as total displacement divided by total elapsed time:</w:t>
-            </w:r>
-          </w:p>
-          <w:p>
-            <w:pPr>
-              <w:spacing w:before="40" w:after="60"/>
-              <w:jc w:val="center"/>
-            </w:pPr>
-            <w:r>
-              <w:rPr>
-                <w:rFonts w:ascii="Times New Roman" w:hAnsi="Times New Roman"/>
-                <w:b w:val="0"/>
-                <w:i w:val="0"/>
-                <w:color w:val="000000"/>
-                <w:sz w:val="20"/>
-                <w:u w:val="none"/>
-              </w:rPr>
-              <w:t>v</w:t>
-            </w:r>
-            <w:r>
-              <w:rPr>
-                <w:rFonts w:ascii="Times New Roman" w:hAnsi="Times New Roman"/>
-                <w:b w:val="0"/>
-                <w:i w:val="0"/>
-                <w:color w:val="000000"/>
-                <w:sz w:val="20"/>
-                <w:u w:val="none"/>
-                <w:vertAlign w:val="subscript"/>
-              </w:rPr>
-              <w:t>avg</w:t>
-            </w:r>
-            <w:r>
-              <w:rPr>
-                <w:rFonts w:ascii="Times New Roman" w:hAnsi="Times New Roman"/>
-                <w:b w:val="0"/>
-                <w:i w:val="0"/>
-                <w:color w:val="000000"/>
-                <w:sz w:val="20"/>
-                <w:u w:val="none"/>
-              </w:rPr>
-              <w:t xml:space="preserve"> = (x − x</w:t>
-            </w:r>
-            <w:r>
-              <w:rPr>
-                <w:rFonts w:ascii="Times New Roman" w:hAnsi="Times New Roman"/>
-                <w:b w:val="0"/>
-                <w:i w:val="0"/>
-                <w:color w:val="000000"/>
-                <w:sz w:val="20"/>
-                <w:u w:val="none"/>
-                <w:vertAlign w:val="subscript"/>
-              </w:rPr>
-              <w:t>0</w:t>
-            </w:r>
-            <w:r>
-              <w:rPr>
-                <w:rFonts w:ascii="Times New Roman" w:hAnsi="Times New Roman"/>
-                <w:b w:val="0"/>
-                <w:i w:val="0"/>
-                <w:color w:val="000000"/>
-                <w:sz w:val="20"/>
-                <w:u w:val="none"/>
-              </w:rPr>
-              <w:t>) / t</w:t>
-            </w:r>
-          </w:p>
-          <w:p>
-            <w:pPr>
-              <w:spacing w:after="40"/>
-              <w:ind w:left="202"/>
-            </w:pPr>
-            <w:r>
-              <w:rPr>
-                <w:rFonts w:ascii="Times New Roman" w:hAnsi="Times New Roman"/>
-                <w:b w:val="0"/>
-                <w:i w:val="0"/>
-                <w:color w:val="000000"/>
-                <w:sz w:val="17"/>
-                <w:u w:val="none"/>
-              </w:rPr>
-              <w:t>Using this definition, multiply both sides by t and isolate the final position x on one side.</w:t>
-            </w:r>
-          </w:p>
-          <w:p>
-            <w:pPr>
-              <w:spacing w:before="100" w:after="20"/>
-            </w:pPr>
-            <w:r>
-              <w:rPr>
-                <w:rFonts w:ascii="Times New Roman" w:hAnsi="Times New Roman"/>
-                <w:b/>
-                <w:i w:val="0"/>
-                <w:color w:val="000000"/>
-                <w:sz w:val="19"/>
-                <w:u w:val="none"/>
-              </w:rPr>
-              <w:t xml:space="preserve">2.  </w:t>
-            </w:r>
-            <w:r>
-              <w:rPr>
-                <w:rFonts w:ascii="Times New Roman" w:hAnsi="Times New Roman"/>
-                <w:b/>
-                <w:i w:val="0"/>
-                <w:color w:val="000000"/>
-                <w:sz w:val="18"/>
-                <w:u w:val="single"/>
-              </w:rPr>
-              <w:t>Find the Average Velocity Under Constant Acceleration</w:t>
-            </w:r>
-          </w:p>
-          <w:p>
-            <w:pPr>
-              <w:spacing w:after="40"/>
-              <w:ind w:left="202"/>
-            </w:pPr>
-            <w:r>
-              <w:rPr>
-                <w:rFonts w:ascii="Times New Roman" w:hAnsi="Times New Roman"/>
-                <w:b w:val="0"/>
-                <w:i w:val="0"/>
-                <w:color w:val="000000"/>
-                <w:sz w:val="17"/>
-                <w:u w:val="none"/>
-              </w:rPr>
-              <w:t>Under constant acceleration, velocity changes at a uniform (linear) rate. For any quantity that changes linearly, its average value equals the arithmetic mean of its starting and ending values. Apply this to write:</w:t>
-            </w:r>
-          </w:p>
-          <w:p>
-            <w:pPr>
-              <w:spacing w:before="40" w:after="60"/>
-              <w:jc w:val="center"/>
-            </w:pPr>
-            <w:r>
-              <w:rPr>
-                <w:rFonts w:ascii="Times New Roman" w:hAnsi="Times New Roman"/>
-                <w:b w:val="0"/>
-                <w:i w:val="0"/>
-                <w:color w:val="000000"/>
-                <w:sz w:val="20"/>
-                <w:u w:val="none"/>
-              </w:rPr>
-              <w:t>v</w:t>
-            </w:r>
-            <w:r>
-              <w:rPr>
-                <w:rFonts w:ascii="Times New Roman" w:hAnsi="Times New Roman"/>
-                <w:b w:val="0"/>
-                <w:i w:val="0"/>
-                <w:color w:val="000000"/>
-                <w:sz w:val="20"/>
-                <w:u w:val="none"/>
-                <w:vertAlign w:val="subscript"/>
-              </w:rPr>
-              <w:t>avg</w:t>
-            </w:r>
-            <w:r>
-              <w:rPr>
-                <w:rFonts w:ascii="Times New Roman" w:hAnsi="Times New Roman"/>
-                <w:b w:val="0"/>
-                <w:i w:val="0"/>
-                <w:color w:val="000000"/>
-                <w:sz w:val="20"/>
-                <w:u w:val="none"/>
-              </w:rPr>
-              <w:t xml:space="preserve"> = (v</w:t>
-            </w:r>
-            <w:r>
-              <w:rPr>
-                <w:rFonts w:ascii="Times New Roman" w:hAnsi="Times New Roman"/>
-                <w:b w:val="0"/>
-                <w:i w:val="0"/>
-                <w:color w:val="000000"/>
-                <w:sz w:val="20"/>
-                <w:u w:val="none"/>
-                <w:vertAlign w:val="subscript"/>
-              </w:rPr>
-              <w:t>0</w:t>
-            </w:r>
-            <w:r>
-              <w:rPr>
-                <w:rFonts w:ascii="Times New Roman" w:hAnsi="Times New Roman"/>
-                <w:b w:val="0"/>
-                <w:i w:val="0"/>
-                <w:color w:val="000000"/>
-                <w:sz w:val="20"/>
-                <w:u w:val="none"/>
-              </w:rPr>
-              <w:t xml:space="preserve"> + v) / 2</w:t>
-            </w:r>
-          </w:p>
-          <w:p>
-            <w:pPr>
-              <w:spacing w:before="100" w:after="20"/>
-            </w:pPr>
-            <w:r>
-              <w:rPr>
-                <w:rFonts w:ascii="Times New Roman" w:hAnsi="Times New Roman"/>
-                <w:b/>
-                <w:i w:val="0"/>
-                <w:color w:val="000000"/>
-                <w:sz w:val="19"/>
-                <w:u w:val="none"/>
-              </w:rPr>
-              <w:t xml:space="preserve">3.  </w:t>
-            </w:r>
-            <w:r>
-              <w:rPr>
-                <w:rFonts w:ascii="Times New Roman" w:hAnsi="Times New Roman"/>
-                <w:b/>
-                <w:i w:val="0"/>
-                <w:color w:val="000000"/>
-                <w:sz w:val="18"/>
-                <w:u w:val="single"/>
-              </w:rPr>
-              <w:t>Substitute and Simplify</w:t>
-            </w:r>
-          </w:p>
-          <w:p>
-            <w:pPr>
-              <w:spacing w:after="40"/>
-              <w:ind w:left="202"/>
-            </w:pPr>
-            <w:r>
-              <w:rPr>
-                <w:rFonts w:ascii="Times New Roman" w:hAnsi="Times New Roman"/>
-                <w:b w:val="0"/>
-                <w:i w:val="0"/>
-                <w:color w:val="000000"/>
-                <w:sz w:val="17"/>
-                <w:u w:val="none"/>
-              </w:rPr>
-              <w:t>Using the position equation from Step 1, replace vavg with the expression you derived in Step 2. Substitute and simplify to obtain:</w:t>
-            </w:r>
-          </w:p>
-          <w:p>
-            <w:pPr>
-              <w:spacing w:before="40" w:after="60"/>
-              <w:jc w:val="center"/>
-            </w:pPr>
-            <w:r>
-              <w:rPr>
-                <w:rFonts w:ascii="Times New Roman" w:hAnsi="Times New Roman"/>
-                <w:b w:val="0"/>
-                <w:i w:val="0"/>
-                <w:color w:val="000000"/>
-                <w:sz w:val="20"/>
-                <w:u w:val="none"/>
-              </w:rPr>
-              <w:t>x = x</w:t>
-            </w:r>
-            <w:r>
-              <w:rPr>
-                <w:rFonts w:ascii="Times New Roman" w:hAnsi="Times New Roman"/>
-                <w:b w:val="0"/>
-                <w:i w:val="0"/>
-                <w:color w:val="000000"/>
-                <w:sz w:val="20"/>
-                <w:u w:val="none"/>
-                <w:vertAlign w:val="subscript"/>
-              </w:rPr>
-              <w:t>0</w:t>
-            </w:r>
-            <w:r>
-              <w:rPr>
-                <w:rFonts w:ascii="Times New Roman" w:hAnsi="Times New Roman"/>
-                <w:b w:val="0"/>
-                <w:i w:val="0"/>
-                <w:color w:val="000000"/>
-                <w:sz w:val="20"/>
-                <w:u w:val="none"/>
-              </w:rPr>
-              <w:t xml:space="preserve"> + ½(v</w:t>
-            </w:r>
-            <w:r>
-              <w:rPr>
-                <w:rFonts w:ascii="Times New Roman" w:hAnsi="Times New Roman"/>
-                <w:b w:val="0"/>
-                <w:i w:val="0"/>
-                <w:color w:val="000000"/>
-                <w:sz w:val="20"/>
-                <w:u w:val="none"/>
-                <w:vertAlign w:val="subscript"/>
-              </w:rPr>
-              <w:t>0</w:t>
-            </w:r>
-            <w:r>
-              <w:rPr>
-                <w:rFonts w:ascii="Times New Roman" w:hAnsi="Times New Roman"/>
-                <w:b w:val="0"/>
-                <w:i w:val="0"/>
-                <w:color w:val="000000"/>
-                <w:sz w:val="20"/>
-                <w:u w:val="none"/>
-              </w:rPr>
-              <w:t xml:space="preserve"> + v)t</w:t>
-            </w:r>
-          </w:p>
-          <w:p>
-            <w:pPr>
-              <w:spacing w:before="120" w:after="20"/>
-            </w:pPr>
-            <w:r>
-              <w:rPr>
-                <w:rFonts w:ascii="Times New Roman" w:hAnsi="Times New Roman"/>
-                <w:b w:val="0"/>
-                <w:i/>
-                <w:color w:val="555555"/>
-                <w:sz w:val="14"/>
-                <w:u w:val="none"/>
-              </w:rPr>
-              <w:t>Work Area</w:t>
-            </w:r>
-          </w:p>
-          <w:p>
-            <w:pPr>
-              <w:spacing w:after="180"/>
+              <w:spacing w:before="60" w:after="0"/>
               <w:pBdr>
-                <w:bottom w:val="single" w:sz="3" w:space="1" w:color="AAAAAA"/>
+                <w:bottom w:val="single" w:sz="4" w:space="1" w:color="999999"/>
               </w:pBdr>
             </w:pPr>
             <w:r>
               <w:rPr>
-                <w:rFonts w:ascii="Times New Roman" w:hAnsi="Times New Roman"/>
+                <w:rFonts w:ascii="Calibri" w:hAnsi="Calibri"/>
                 <w:b w:val="0"/>
                 <w:i w:val="0"/>
                 <w:color w:val="000000"/>
-                <w:sz w:val="14"/>
+                <w:sz w:val="22"/>
                 <w:u w:val="none"/>
               </w:rPr>
               <w:t xml:space="preserve"> </w:t>
@@ -1340,71 +678,117 @@
           </w:p>
           <w:p>
             <w:pPr>
-              <w:spacing w:after="180"/>
+              <w:spacing w:before="100" w:after="40"/>
               <w:pBdr>
-                <w:bottom w:val="single" w:sz="3" w:space="1" w:color="AAAAAA"/>
+                <w:top w:val="single" w:sz="6" w:space="2" w:color="000000"/>
+                <w:left w:val="single" w:sz="6" w:space="2" w:color="000000"/>
+                <w:bottom w:val="single" w:sz="6" w:space="2" w:color="000000"/>
+                <w:right w:val="single" w:sz="6" w:space="2" w:color="000000"/>
               </w:pBdr>
             </w:pPr>
             <w:r>
               <w:rPr>
-                <w:rFonts w:ascii="Times New Roman" w:hAnsi="Times New Roman"/>
-                <w:b w:val="0"/>
+                <w:rFonts w:ascii="Calibri" w:hAnsi="Calibri"/>
+                <w:b/>
                 <w:i w:val="0"/>
                 <w:color w:val="000000"/>
-                <w:sz w:val="14"/>
+                <w:sz w:val="16"/>
                 <w:u w:val="none"/>
               </w:rPr>
-              <w:t xml:space="preserve"> </w:t>
+              <w:t xml:space="preserve"> ✓  Final Equation 4:  </w:t>
             </w:r>
-          </w:p>
-          <w:p>
-            <w:pPr>
-              <w:spacing w:after="180"/>
-              <w:pBdr>
-                <w:bottom w:val="single" w:sz="3" w:space="1" w:color="AAAAAA"/>
-              </w:pBdr>
-            </w:pPr>
-            <w:r>
-              <w:rPr>
-                <w:rFonts w:ascii="Times New Roman" w:hAnsi="Times New Roman"/>
-                <w:b w:val="0"/>
-                <w:i w:val="0"/>
-                <w:color w:val="000000"/>
-                <w:sz w:val="14"/>
-                <w:u w:val="none"/>
-              </w:rPr>
-              <w:t xml:space="preserve"> </w:t>
-            </w:r>
-          </w:p>
-          <w:p>
-            <w:pPr>
-              <w:spacing w:after="180"/>
-              <w:pBdr>
-                <w:bottom w:val="single" w:sz="3" w:space="1" w:color="AAAAAA"/>
-              </w:pBdr>
-            </w:pPr>
-            <w:r>
-              <w:rPr>
-                <w:rFonts w:ascii="Times New Roman" w:hAnsi="Times New Roman"/>
-                <w:b w:val="0"/>
-                <w:i w:val="0"/>
-                <w:color w:val="000000"/>
-                <w:sz w:val="14"/>
-                <w:u w:val="none"/>
-              </w:rPr>
-              <w:t xml:space="preserve"> </w:t>
-            </w:r>
+            <m:oMath>
+              <m:r>
+                <m:t>x</m:t>
+              </m:r>
+              <m:r>
+                <m:rPr>
+                  <m:sty m:val="p"/>
+                </m:rPr>
+                <m:t> = </m:t>
+              </m:r>
+              <m:sSub>
+                <m:e>
+                  <m:r>
+                    <m:t>x</m:t>
+                  </m:r>
+                </m:e>
+                <m:sub>
+                  <m:r>
+                    <m:rPr>
+                      <m:sty m:val="p"/>
+                    </m:rPr>
+                    <m:t>0</m:t>
+                  </m:r>
+                </m:sub>
+              </m:sSub>
+              <m:r>
+                <m:rPr>
+                  <m:sty m:val="p"/>
+                </m:rPr>
+                <m:t> + </m:t>
+              </m:r>
+              <m:f>
+                <m:num>
+                  <m:r>
+                    <m:rPr>
+                      <m:sty m:val="p"/>
+                    </m:rPr>
+                    <m:t>1</m:t>
+                  </m:r>
+                </m:num>
+                <m:den>
+                  <m:r>
+                    <m:rPr>
+                      <m:sty m:val="p"/>
+                    </m:rPr>
+                    <m:t>2</m:t>
+                  </m:r>
+                </m:den>
+              </m:f>
+              <m:d>
+                <m:e>
+                  <m:sSub>
+                    <m:e>
+                      <m:r>
+                        <m:t>v</m:t>
+                      </m:r>
+                    </m:e>
+                    <m:sub>
+                      <m:r>
+                        <m:rPr>
+                          <m:sty m:val="p"/>
+                        </m:rPr>
+                        <m:t>0</m:t>
+                      </m:r>
+                    </m:sub>
+                  </m:sSub>
+                  <m:r>
+                    <m:rPr>
+                      <m:sty m:val="p"/>
+                    </m:rPr>
+                    <m:t> + </m:t>
+                  </m:r>
+                  <m:r>
+                    <m:t>v</m:t>
+                  </m:r>
+                </m:e>
+              </m:d>
+              <m:r>
+                <m:t>t</m:t>
+              </m:r>
+            </m:oMath>
           </w:p>
         </w:tc>
         <w:tc>
           <w:tcPr>
-            <w:tcW w:type="dxa" w:w="4428"/>
-            <w:tcW w:w="4428" w:type="dxa"/>
+            <w:tcW w:type="dxa" w:w="7"/>
+            <w:tcW w:w="4464" w:type="dxa"/>
             <w:tcMar>
-              <w:top w:w="50" w:type="dxa"/>
-              <w:bottom w:w="50" w:type="dxa"/>
-              <w:left w:w="70" w:type="dxa"/>
-              <w:right w:w="70" w:type="dxa"/>
+              <w:top w:w="40" w:type="dxa"/>
+              <w:bottom w:w="30" w:type="dxa"/>
+              <w:left w:w="60" w:type="dxa"/>
+              <w:right w:w="60" w:type="dxa"/>
             </w:tcMar>
             <w:vAlign w:val="top"/>
             <w:tcBorders>
@@ -1415,55 +799,230 @@
             </w:tcBorders>
           </w:tcPr>
           <w:p>
-            <w:r/>
+            <w:pPr>
+              <w:spacing w:after="0" w:before="0"/>
+            </w:pPr>
+            <w:r>
+              <w:rPr>
+                <w:rFonts w:ascii="Calibri" w:hAnsi="Calibri"/>
+                <w:b w:val="0"/>
+                <w:i w:val="0"/>
+                <w:color w:val="000000"/>
+                <w:sz w:val="16"/>
+                <w:u w:val="none"/>
+              </w:rPr>
+              <w:t>Name: ___________________________________</w:t>
+            </w:r>
           </w:p>
           <w:p>
             <w:pPr>
-              <w:spacing w:after="20"/>
+              <w:spacing w:before="40" w:after="0"/>
             </w:pPr>
             <w:r>
               <w:rPr>
-                <w:rFonts w:ascii="Times New Roman" w:hAnsi="Times New Roman"/>
+                <w:rFonts w:ascii="Calibri" w:hAnsi="Calibri"/>
+                <w:b w:val="0"/>
+                <w:i w:val="0"/>
+                <w:color w:val="000000"/>
+                <w:sz w:val="16"/>
+                <w:u w:val="none"/>
+              </w:rPr>
+              <w:t>Grade &amp; Section: _____________  Date: __________</w:t>
+            </w:r>
+          </w:p>
+          <w:p>
+            <w:pPr>
+              <w:spacing w:before="100" w:after="20"/>
+              <w:jc w:val="center"/>
+              <w:pBdr>
+                <w:top w:val="single" w:sz="8" w:space="2" w:color="000000"/>
+                <w:left w:val="single" w:sz="8" w:space="2" w:color="000000"/>
+                <w:bottom w:val="single" w:sz="8" w:space="2" w:color="000000"/>
+                <w:right w:val="single" w:sz="8" w:space="2" w:color="000000"/>
+              </w:pBdr>
+              <w:shd w:val="clear" w:color="auto" w:fill="EDEDED"/>
+            </w:pPr>
+            <w:r>
+              <w:rPr>
+                <w:rFonts w:ascii="Calibri" w:hAnsi="Calibri"/>
+                <w:b/>
+                <w:i w:val="0"/>
+                <w:color w:val="000000"/>
+                <w:sz w:val="18"/>
+                <w:u w:val="none"/>
+              </w:rPr>
+              <w:t xml:space="preserve">PART C: </w:t>
+            </w:r>
+            <w:r>
+              <w:rPr>
+                <w:rFonts w:ascii="Calibri" w:hAnsi="Calibri"/>
+                <w:b/>
+                <w:i w:val="0"/>
+                <w:color w:val="000000"/>
+                <w:sz w:val="18"/>
+                <w:u w:val="none"/>
+              </w:rPr>
+              <w:t>Deriving Kinematic Equation 2</w:t>
+            </w:r>
+          </w:p>
+          <w:p>
+            <w:pPr>
+              <w:spacing w:before="80" w:after="80"/>
+            </w:pPr>
+            <w:r>
+              <w:rPr>
+                <w:rFonts w:ascii="Calibri" w:hAnsi="Calibri"/>
                 <w:b/>
                 <w:i w:val="0"/>
                 <w:color w:val="000000"/>
                 <w:sz w:val="16"/>
                 <w:u w:val="none"/>
               </w:rPr>
-              <w:t xml:space="preserve">Name: </w:t>
+              <w:t xml:space="preserve">GOAL: Derive  </w:t>
             </w:r>
+            <m:oMath>
+              <m:r>
+                <m:t>x</m:t>
+              </m:r>
+              <m:r>
+                <m:rPr>
+                  <m:sty m:val="p"/>
+                </m:rPr>
+                <m:t> = </m:t>
+              </m:r>
+              <m:sSub>
+                <m:e>
+                  <m:r>
+                    <m:t>x</m:t>
+                  </m:r>
+                </m:e>
+                <m:sub>
+                  <m:r>
+                    <m:rPr>
+                      <m:sty m:val="p"/>
+                    </m:rPr>
+                    <m:t>0</m:t>
+                  </m:r>
+                </m:sub>
+              </m:sSub>
+              <m:r>
+                <m:rPr>
+                  <m:sty m:val="p"/>
+                </m:rPr>
+                <m:t> + </m:t>
+              </m:r>
+              <m:sSub>
+                <m:e>
+                  <m:r>
+                    <m:t>v</m:t>
+                  </m:r>
+                </m:e>
+                <m:sub>
+                  <m:r>
+                    <m:rPr>
+                      <m:sty m:val="p"/>
+                    </m:rPr>
+                    <m:t>0</m:t>
+                  </m:r>
+                </m:sub>
+              </m:sSub>
+              <m:r>
+                <m:t>t</m:t>
+              </m:r>
+              <m:r>
+                <m:rPr>
+                  <m:sty m:val="p"/>
+                </m:rPr>
+                <m:t> + </m:t>
+              </m:r>
+              <m:f>
+                <m:num>
+                  <m:r>
+                    <m:rPr>
+                      <m:sty m:val="p"/>
+                    </m:rPr>
+                    <m:t>1</m:t>
+                  </m:r>
+                </m:num>
+                <m:den>
+                  <m:r>
+                    <m:rPr>
+                      <m:sty m:val="p"/>
+                    </m:rPr>
+                    <m:t>2</m:t>
+                  </m:r>
+                </m:den>
+              </m:f>
+              <m:r>
+                <m:t>a</m:t>
+              </m:r>
+              <m:sSup>
+                <m:e>
+                  <m:r>
+                    <m:t>t</m:t>
+                  </m:r>
+                </m:e>
+                <m:sup>
+                  <m:r>
+                    <m:rPr>
+                      <m:sty m:val="p"/>
+                    </m:rPr>
+                    <m:t>2</m:t>
+                  </m:r>
+                </m:sup>
+              </m:sSup>
+            </m:oMath>
+          </w:p>
+          <w:p>
+            <w:pPr>
+              <w:spacing w:before="60" w:after="0"/>
+            </w:pPr>
             <w:r>
               <w:rPr>
-                <w:rFonts w:ascii="Times New Roman" w:hAnsi="Times New Roman"/>
+                <w:rFonts w:ascii="Calibri" w:hAnsi="Calibri"/>
                 <w:b w:val="0"/>
                 <w:i w:val="0"/>
                 <w:color w:val="000000"/>
-                <w:sz w:val="16"/>
+                <w:sz w:val="18"/>
                 <w:u w:val="none"/>
               </w:rPr>
-              <w:tab/>
-              <w:tab/>
-              <w:tab/>
-              <w:tab/>
-              <w:tab/>
-              <w:tab/>
-              <w:tab/>
+              <w:t>1. Write down the two source equations you will combine:</w:t>
+              <w:br/>
+              <w:t xml:space="preserve">    Equation 1 (velocity):  v = v₀ + at</w:t>
+              <w:br/>
+              <w:t xml:space="preserve">    Equation 4 (position):  x = x₀ + ½(v₀ + v)t</w:t>
             </w:r>
           </w:p>
           <w:p>
             <w:pPr>
-              <w:spacing w:after="20"/>
+              <w:spacing w:before="60" w:after="0"/>
+            </w:pPr>
+            <w:r>
+              <w:rPr>
+                <w:rFonts w:ascii="Calibri" w:hAnsi="Calibri"/>
+                <w:b w:val="0"/>
+                <w:i w:val="0"/>
+                <w:color w:val="000000"/>
+                <w:sz w:val="18"/>
+                <w:u w:val="none"/>
+              </w:rPr>
+              <w:t>2. In Equation 4, locate the variable v. Replace it entirely with the right-hand side of Equation 1 (v₀ + at). Write the substitution:</w:t>
+            </w:r>
+          </w:p>
+          <w:p>
+            <w:pPr>
+              <w:spacing w:before="60" w:after="0"/>
               <w:pBdr>
-                <w:bottom w:val="single" w:sz="4" w:space="1" w:color="000000"/>
+                <w:bottom w:val="single" w:sz="4" w:space="1" w:color="999999"/>
               </w:pBdr>
             </w:pPr>
             <w:r>
               <w:rPr>
-                <w:rFonts w:ascii="Times New Roman" w:hAnsi="Times New Roman"/>
+                <w:rFonts w:ascii="Calibri" w:hAnsi="Calibri"/>
                 <w:b w:val="0"/>
                 <w:i w:val="0"/>
                 <w:color w:val="000000"/>
-                <w:sz w:val="16"/>
+                <w:sz w:val="22"/>
                 <w:u w:val="none"/>
               </w:rPr>
               <w:t xml:space="preserve"> </w:t>
@@ -1471,34 +1030,34 @@
           </w:p>
           <w:p>
             <w:pPr>
-              <w:spacing w:after="20" w:before="60"/>
+              <w:spacing w:before="60" w:after="0"/>
             </w:pPr>
             <w:r>
               <w:rPr>
-                <w:rFonts w:ascii="Times New Roman" w:hAnsi="Times New Roman"/>
-                <w:b/>
+                <w:rFonts w:ascii="Calibri" w:hAnsi="Calibri"/>
+                <w:b w:val="0"/>
                 <w:i w:val="0"/>
                 <w:color w:val="000000"/>
-                <w:sz w:val="16"/>
+                <w:sz w:val="18"/>
                 <w:u w:val="none"/>
               </w:rPr>
-              <w:t xml:space="preserve">Grade &amp; Section: </w:t>
+              <w:t>3. Inside the brackets, combine the two v₀ terms (v₀ + v₀ = 2v₀). Write the simplified expression:</w:t>
             </w:r>
           </w:p>
           <w:p>
             <w:pPr>
-              <w:spacing w:after="20"/>
+              <w:spacing w:before="60" w:after="0"/>
               <w:pBdr>
-                <w:bottom w:val="single" w:sz="4" w:space="1" w:color="000000"/>
+                <w:bottom w:val="single" w:sz="4" w:space="1" w:color="999999"/>
               </w:pBdr>
             </w:pPr>
             <w:r>
               <w:rPr>
-                <w:rFonts w:ascii="Times New Roman" w:hAnsi="Times New Roman"/>
+                <w:rFonts w:ascii="Calibri" w:hAnsi="Calibri"/>
                 <w:b w:val="0"/>
                 <w:i w:val="0"/>
                 <w:color w:val="000000"/>
-                <w:sz w:val="16"/>
+                <w:sz w:val="22"/>
                 <w:u w:val="none"/>
               </w:rPr>
               <w:t xml:space="preserve"> </w:t>
@@ -1506,34 +1065,34 @@
           </w:p>
           <w:p>
             <w:pPr>
-              <w:spacing w:after="20" w:before="60"/>
+              <w:spacing w:before="60" w:after="0"/>
             </w:pPr>
             <w:r>
               <w:rPr>
-                <w:rFonts w:ascii="Times New Roman" w:hAnsi="Times New Roman"/>
-                <w:b/>
+                <w:rFonts w:ascii="Calibri" w:hAnsi="Calibri"/>
+                <w:b w:val="0"/>
                 <w:i w:val="0"/>
                 <w:color w:val="000000"/>
-                <w:sz w:val="16"/>
+                <w:sz w:val="18"/>
                 <w:u w:val="none"/>
               </w:rPr>
-              <w:t xml:space="preserve">Date: </w:t>
+              <w:t>4. Distribute t into the bracket, then distribute the ½ to each term. Simplify the coefficients. Write the final equation:</w:t>
             </w:r>
           </w:p>
           <w:p>
             <w:pPr>
-              <w:spacing w:after="80"/>
+              <w:spacing w:before="60" w:after="0"/>
               <w:pBdr>
-                <w:bottom w:val="single" w:sz="4" w:space="1" w:color="000000"/>
+                <w:bottom w:val="single" w:sz="4" w:space="1" w:color="999999"/>
               </w:pBdr>
             </w:pPr>
             <w:r>
               <w:rPr>
-                <w:rFonts w:ascii="Times New Roman" w:hAnsi="Times New Roman"/>
+                <w:rFonts w:ascii="Calibri" w:hAnsi="Calibri"/>
                 <w:b w:val="0"/>
                 <w:i w:val="0"/>
                 <w:color w:val="000000"/>
-                <w:sz w:val="16"/>
+                <w:sz w:val="22"/>
                 <w:u w:val="none"/>
               </w:rPr>
               <w:t xml:space="preserve"> </w:t>
@@ -1541,664 +1100,128 @@
           </w:p>
           <w:p>
             <w:pPr>
-              <w:spacing w:before="40" w:after="0"/>
-              <w:jc w:val="center"/>
+              <w:spacing w:before="100" w:after="40"/>
               <w:pBdr>
-                <w:top w:val="single" w:sz="10" w:space="4" w:color="000000"/>
-                <w:left w:val="single" w:sz="10" w:space="4" w:color="000000"/>
-                <w:bottom w:val="single" w:sz="10" w:space="4" w:color="000000"/>
-                <w:right w:val="single" w:sz="10" w:space="4" w:color="000000"/>
+                <w:top w:val="single" w:sz="6" w:space="2" w:color="000000"/>
+                <w:left w:val="single" w:sz="6" w:space="2" w:color="000000"/>
+                <w:bottom w:val="single" w:sz="6" w:space="2" w:color="000000"/>
+                <w:right w:val="single" w:sz="6" w:space="2" w:color="000000"/>
               </w:pBdr>
             </w:pPr>
             <w:r>
               <w:rPr>
-                <w:rFonts w:ascii="Times New Roman" w:hAnsi="Times New Roman"/>
+                <w:rFonts w:ascii="Calibri" w:hAnsi="Calibri"/>
                 <w:b/>
                 <w:i w:val="0"/>
                 <w:color w:val="000000"/>
-                <w:sz w:val="22"/>
+                <w:sz w:val="16"/>
                 <w:u w:val="none"/>
               </w:rPr>
-              <w:t>PART C</w:t>
+              <w:t xml:space="preserve"> ✓  Final Equation 2:  </w:t>
             </w:r>
-          </w:p>
-          <w:p>
-            <w:pPr>
-              <w:spacing w:after="120"/>
-              <w:jc w:val="center"/>
-            </w:pPr>
-            <w:r>
-              <w:rPr>
-                <w:rFonts w:ascii="Times New Roman" w:hAnsi="Times New Roman"/>
-                <w:b w:val="0"/>
-                <w:i/>
-                <w:color w:val="000000"/>
-                <w:sz w:val="15"/>
-                <w:u w:val="none"/>
-              </w:rPr>
-              <w:t>Kinematics Activity Sheet</w:t>
-            </w:r>
-          </w:p>
-          <w:p>
-            <w:pPr>
-              <w:spacing w:after="60"/>
-              <w:pBdr>
-                <w:bottom w:val="single" w:sz="6" w:space="1" w:color="555555"/>
-              </w:pBdr>
-            </w:pPr>
-            <w:r>
-              <w:rPr>
-                <w:rFonts w:ascii="Times New Roman" w:hAnsi="Times New Roman"/>
-                <w:b/>
-                <w:i w:val="0"/>
-                <w:color w:val="000000"/>
-                <w:sz w:val="19"/>
-                <w:u w:val="none"/>
-              </w:rPr>
-              <w:t>DERIVING KINEMATIC EQUATION 2</w:t>
-            </w:r>
-          </w:p>
-          <w:p>
-            <w:pPr>
-              <w:spacing w:before="40" w:after="120"/>
-              <w:pBdr>
-                <w:top w:val="single" w:sz="8" w:space="4" w:color="000000"/>
-                <w:left w:val="single" w:sz="8" w:space="4" w:color="000000"/>
-                <w:bottom w:val="single" w:sz="8" w:space="4" w:color="000000"/>
-                <w:right w:val="single" w:sz="8" w:space="4" w:color="000000"/>
-              </w:pBdr>
-              <w:shd w:val="clear" w:color="auto" w:fill="E8E8E8"/>
-            </w:pPr>
-            <w:r>
-              <w:rPr>
-                <w:rFonts w:ascii="Times New Roman" w:hAnsi="Times New Roman"/>
-                <w:b/>
-                <w:i w:val="0"/>
-                <w:color w:val="000000"/>
-                <w:sz w:val="17"/>
-                <w:u w:val="none"/>
-              </w:rPr>
-              <w:t xml:space="preserve">Goal:  </w:t>
-            </w:r>
-            <w:r>
-              <w:rPr>
-                <w:rFonts w:ascii="Times New Roman" w:hAnsi="Times New Roman"/>
-                <w:b w:val="0"/>
-                <w:i w:val="0"/>
-                <w:color w:val="000000"/>
-                <w:sz w:val="17"/>
-                <w:u w:val="none"/>
-              </w:rPr>
-              <w:t xml:space="preserve">Derive the equation  </w:t>
-            </w:r>
-            <w:r>
-              <w:rPr>
-                <w:rFonts w:ascii="Times New Roman" w:hAnsi="Times New Roman"/>
-                <w:b/>
-                <w:i w:val="0"/>
-                <w:color w:val="000000"/>
-                <w:sz w:val="18"/>
-                <w:u w:val="none"/>
-              </w:rPr>
-              <w:t>x = x</w:t>
-            </w:r>
-            <w:r>
-              <w:rPr>
-                <w:rFonts w:ascii="Times New Roman" w:hAnsi="Times New Roman"/>
-                <w:b/>
-                <w:i w:val="0"/>
-                <w:color w:val="000000"/>
-                <w:sz w:val="18"/>
-                <w:u w:val="none"/>
-                <w:vertAlign w:val="subscript"/>
-              </w:rPr>
-              <w:t>0</w:t>
-            </w:r>
-            <w:r>
-              <w:rPr>
-                <w:rFonts w:ascii="Times New Roman" w:hAnsi="Times New Roman"/>
-                <w:b/>
-                <w:i w:val="0"/>
-                <w:color w:val="000000"/>
-                <w:sz w:val="18"/>
-                <w:u w:val="none"/>
-              </w:rPr>
-              <w:t xml:space="preserve"> + v</w:t>
-            </w:r>
-            <w:r>
-              <w:rPr>
-                <w:rFonts w:ascii="Times New Roman" w:hAnsi="Times New Roman"/>
-                <w:b/>
-                <w:i w:val="0"/>
-                <w:color w:val="000000"/>
-                <w:sz w:val="18"/>
-                <w:u w:val="none"/>
-                <w:vertAlign w:val="subscript"/>
-              </w:rPr>
-              <w:t>0</w:t>
-            </w:r>
-            <w:r>
-              <w:rPr>
-                <w:rFonts w:ascii="Times New Roman" w:hAnsi="Times New Roman"/>
-                <w:b/>
-                <w:i w:val="0"/>
-                <w:color w:val="000000"/>
-                <w:sz w:val="18"/>
-                <w:u w:val="none"/>
-              </w:rPr>
-              <w:t>t + ½at</w:t>
-            </w:r>
-            <w:r>
-              <w:rPr>
-                <w:rFonts w:ascii="Times New Roman" w:hAnsi="Times New Roman"/>
-                <w:b/>
-                <w:i w:val="0"/>
-                <w:color w:val="000000"/>
-                <w:sz w:val="18"/>
-                <w:u w:val="none"/>
-                <w:vertAlign w:val="superscript"/>
-              </w:rPr>
-              <w:t>2</w:t>
-            </w:r>
-          </w:p>
-          <w:p>
-            <w:pPr>
-              <w:spacing w:before="100" w:after="20"/>
-            </w:pPr>
-            <w:r>
-              <w:rPr>
-                <w:rFonts w:ascii="Times New Roman" w:hAnsi="Times New Roman"/>
-                <w:b/>
-                <w:i w:val="0"/>
-                <w:color w:val="000000"/>
-                <w:sz w:val="19"/>
-                <w:u w:val="none"/>
-              </w:rPr>
-              <w:t xml:space="preserve">1.  </w:t>
-            </w:r>
-            <w:r>
-              <w:rPr>
-                <w:rFonts w:ascii="Times New Roman" w:hAnsi="Times New Roman"/>
-                <w:b/>
-                <w:i w:val="0"/>
-                <w:color w:val="000000"/>
-                <w:sz w:val="18"/>
-                <w:u w:val="single"/>
-              </w:rPr>
-              <w:t>Identify the Two Source Equations</w:t>
-            </w:r>
-          </w:p>
-          <w:p>
-            <w:pPr>
-              <w:spacing w:after="40"/>
-              <w:ind w:left="202"/>
-            </w:pPr>
-            <w:r>
-              <w:rPr>
-                <w:rFonts w:ascii="Times New Roman" w:hAnsi="Times New Roman"/>
-                <w:b w:val="0"/>
-                <w:i w:val="0"/>
-                <w:color w:val="000000"/>
-                <w:sz w:val="17"/>
-                <w:u w:val="none"/>
-              </w:rPr>
-              <w:t>Write out both equations you will combine. The first gives velocity as a function of time; the second gives position from average velocity:</w:t>
-            </w:r>
-          </w:p>
-          <w:p>
-            <w:pPr>
-              <w:spacing w:before="40" w:after="60"/>
-              <w:jc w:val="center"/>
-            </w:pPr>
-            <w:r>
-              <w:rPr>
-                <w:rFonts w:ascii="Times New Roman" w:hAnsi="Times New Roman"/>
-                <w:b w:val="0"/>
-                <w:i w:val="0"/>
-                <w:color w:val="000000"/>
-                <w:sz w:val="20"/>
-                <w:u w:val="none"/>
-              </w:rPr>
-              <w:t>v = v</w:t>
-            </w:r>
-            <w:r>
-              <w:rPr>
-                <w:rFonts w:ascii="Times New Roman" w:hAnsi="Times New Roman"/>
-                <w:b w:val="0"/>
-                <w:i w:val="0"/>
-                <w:color w:val="000000"/>
-                <w:sz w:val="20"/>
-                <w:u w:val="none"/>
-                <w:vertAlign w:val="subscript"/>
-              </w:rPr>
-              <w:t>0</w:t>
-            </w:r>
-            <w:r>
-              <w:rPr>
-                <w:rFonts w:ascii="Times New Roman" w:hAnsi="Times New Roman"/>
-                <w:b w:val="0"/>
-                <w:i w:val="0"/>
-                <w:color w:val="000000"/>
-                <w:sz w:val="20"/>
-                <w:u w:val="none"/>
-              </w:rPr>
-              <w:t xml:space="preserve"> + at</w:t>
-            </w:r>
-          </w:p>
-          <w:p>
-            <w:pPr>
-              <w:spacing w:before="40" w:after="60"/>
-              <w:jc w:val="center"/>
-            </w:pPr>
-            <w:r>
-              <w:rPr>
-                <w:rFonts w:ascii="Times New Roman" w:hAnsi="Times New Roman"/>
-                <w:b w:val="0"/>
-                <w:i w:val="0"/>
-                <w:color w:val="000000"/>
-                <w:sz w:val="20"/>
-                <w:u w:val="none"/>
-              </w:rPr>
-              <w:t>x = x</w:t>
-            </w:r>
-            <w:r>
-              <w:rPr>
-                <w:rFonts w:ascii="Times New Roman" w:hAnsi="Times New Roman"/>
-                <w:b w:val="0"/>
-                <w:i w:val="0"/>
-                <w:color w:val="000000"/>
-                <w:sz w:val="20"/>
-                <w:u w:val="none"/>
-                <w:vertAlign w:val="subscript"/>
-              </w:rPr>
-              <w:t>0</w:t>
-            </w:r>
-            <w:r>
-              <w:rPr>
-                <w:rFonts w:ascii="Times New Roman" w:hAnsi="Times New Roman"/>
-                <w:b w:val="0"/>
-                <w:i w:val="0"/>
-                <w:color w:val="000000"/>
-                <w:sz w:val="20"/>
-                <w:u w:val="none"/>
-              </w:rPr>
-              <w:t xml:space="preserve"> + ½(v</w:t>
-            </w:r>
-            <w:r>
-              <w:rPr>
-                <w:rFonts w:ascii="Times New Roman" w:hAnsi="Times New Roman"/>
-                <w:b w:val="0"/>
-                <w:i w:val="0"/>
-                <w:color w:val="000000"/>
-                <w:sz w:val="20"/>
-                <w:u w:val="none"/>
-                <w:vertAlign w:val="subscript"/>
-              </w:rPr>
-              <w:t>0</w:t>
-            </w:r>
-            <w:r>
-              <w:rPr>
-                <w:rFonts w:ascii="Times New Roman" w:hAnsi="Times New Roman"/>
-                <w:b w:val="0"/>
-                <w:i w:val="0"/>
-                <w:color w:val="000000"/>
-                <w:sz w:val="20"/>
-                <w:u w:val="none"/>
-              </w:rPr>
-              <w:t xml:space="preserve"> + v)t</w:t>
-            </w:r>
-          </w:p>
-          <w:p>
-            <w:pPr>
-              <w:spacing w:before="100" w:after="20"/>
-            </w:pPr>
-            <w:r>
-              <w:rPr>
-                <w:rFonts w:ascii="Times New Roman" w:hAnsi="Times New Roman"/>
-                <w:b/>
-                <w:i w:val="0"/>
-                <w:color w:val="000000"/>
-                <w:sz w:val="19"/>
-                <w:u w:val="none"/>
-              </w:rPr>
-              <w:t xml:space="preserve">2.  </w:t>
-            </w:r>
-            <w:r>
-              <w:rPr>
-                <w:rFonts w:ascii="Times New Roman" w:hAnsi="Times New Roman"/>
-                <w:b/>
-                <w:i w:val="0"/>
-                <w:color w:val="000000"/>
-                <w:sz w:val="18"/>
-                <w:u w:val="single"/>
-              </w:rPr>
-              <w:t>Substitute the Velocity Equation</w:t>
-            </w:r>
-          </w:p>
-          <w:p>
-            <w:pPr>
-              <w:spacing w:after="40"/>
-              <w:ind w:left="202"/>
-            </w:pPr>
-            <w:r>
-              <w:rPr>
-                <w:rFonts w:ascii="Times New Roman" w:hAnsi="Times New Roman"/>
-                <w:b w:val="0"/>
-                <w:i w:val="0"/>
-                <w:color w:val="000000"/>
-                <w:sz w:val="17"/>
-                <w:u w:val="none"/>
-              </w:rPr>
-              <w:t>In the position equation, locate the variable v. Replace it entirely with the right-hand side of the velocity equation, writing the full substitution explicitly:</w:t>
-            </w:r>
-          </w:p>
-          <w:p>
-            <w:pPr>
-              <w:spacing w:before="40" w:after="60"/>
-              <w:jc w:val="center"/>
-            </w:pPr>
-            <w:r>
-              <w:rPr>
-                <w:rFonts w:ascii="Times New Roman" w:hAnsi="Times New Roman"/>
-                <w:b w:val="0"/>
-                <w:i w:val="0"/>
-                <w:color w:val="000000"/>
-                <w:sz w:val="20"/>
-                <w:u w:val="none"/>
-              </w:rPr>
-              <w:t>x = x</w:t>
-            </w:r>
-            <w:r>
-              <w:rPr>
-                <w:rFonts w:ascii="Times New Roman" w:hAnsi="Times New Roman"/>
-                <w:b w:val="0"/>
-                <w:i w:val="0"/>
-                <w:color w:val="000000"/>
-                <w:sz w:val="20"/>
-                <w:u w:val="none"/>
-                <w:vertAlign w:val="subscript"/>
-              </w:rPr>
-              <w:t>0</w:t>
-            </w:r>
-            <w:r>
-              <w:rPr>
-                <w:rFonts w:ascii="Times New Roman" w:hAnsi="Times New Roman"/>
-                <w:b w:val="0"/>
-                <w:i w:val="0"/>
-                <w:color w:val="000000"/>
-                <w:sz w:val="20"/>
-                <w:u w:val="none"/>
-              </w:rPr>
-              <w:t xml:space="preserve"> + ½[v</w:t>
-            </w:r>
-            <w:r>
-              <w:rPr>
-                <w:rFonts w:ascii="Times New Roman" w:hAnsi="Times New Roman"/>
-                <w:b w:val="0"/>
-                <w:i w:val="0"/>
-                <w:color w:val="000000"/>
-                <w:sz w:val="20"/>
-                <w:u w:val="none"/>
-                <w:vertAlign w:val="subscript"/>
-              </w:rPr>
-              <w:t>0</w:t>
-            </w:r>
-            <w:r>
-              <w:rPr>
-                <w:rFonts w:ascii="Times New Roman" w:hAnsi="Times New Roman"/>
-                <w:b w:val="0"/>
-                <w:i w:val="0"/>
-                <w:color w:val="000000"/>
-                <w:sz w:val="20"/>
-                <w:u w:val="none"/>
-              </w:rPr>
-              <w:t xml:space="preserve"> + (v</w:t>
-            </w:r>
-            <w:r>
-              <w:rPr>
-                <w:rFonts w:ascii="Times New Roman" w:hAnsi="Times New Roman"/>
-                <w:b w:val="0"/>
-                <w:i w:val="0"/>
-                <w:color w:val="000000"/>
-                <w:sz w:val="20"/>
-                <w:u w:val="none"/>
-                <w:vertAlign w:val="subscript"/>
-              </w:rPr>
-              <w:t>0</w:t>
-            </w:r>
-            <w:r>
-              <w:rPr>
-                <w:rFonts w:ascii="Times New Roman" w:hAnsi="Times New Roman"/>
-                <w:b w:val="0"/>
-                <w:i w:val="0"/>
-                <w:color w:val="000000"/>
-                <w:sz w:val="20"/>
-                <w:u w:val="none"/>
-              </w:rPr>
-              <w:t xml:space="preserve"> + at)]t</w:t>
-            </w:r>
-          </w:p>
-          <w:p>
-            <w:pPr>
-              <w:spacing w:before="100" w:after="20"/>
-            </w:pPr>
-            <w:r>
-              <w:rPr>
-                <w:rFonts w:ascii="Times New Roman" w:hAnsi="Times New Roman"/>
-                <w:b/>
-                <w:i w:val="0"/>
-                <w:color w:val="000000"/>
-                <w:sz w:val="19"/>
-                <w:u w:val="none"/>
-              </w:rPr>
-              <w:t xml:space="preserve">3.  </w:t>
-            </w:r>
-            <w:r>
-              <w:rPr>
-                <w:rFonts w:ascii="Times New Roman" w:hAnsi="Times New Roman"/>
-                <w:b/>
-                <w:i w:val="0"/>
-                <w:color w:val="000000"/>
-                <w:sz w:val="18"/>
-                <w:u w:val="single"/>
-              </w:rPr>
-              <w:t>Expand and Simplify</w:t>
-            </w:r>
-          </w:p>
-          <w:p>
-            <w:pPr>
-              <w:spacing w:after="40"/>
-              <w:ind w:left="202"/>
-            </w:pPr>
-            <w:r>
-              <w:rPr>
-                <w:rFonts w:ascii="Times New Roman" w:hAnsi="Times New Roman"/>
-                <w:b w:val="0"/>
-                <w:i w:val="0"/>
-                <w:color w:val="000000"/>
-                <w:sz w:val="17"/>
-                <w:u w:val="none"/>
-              </w:rPr>
-              <w:t>Using the expression from Step 2, combine the like terms inside the brackets (v0 + v0 = 2v0), distribute t into the bracket, and then distribute the factor of ½ to each term. Simplify the coefficients until you reach:</w:t>
-            </w:r>
-          </w:p>
-          <w:p>
-            <w:pPr>
-              <w:spacing w:before="40" w:after="60"/>
-              <w:jc w:val="center"/>
-            </w:pPr>
-            <w:r>
-              <w:rPr>
-                <w:rFonts w:ascii="Times New Roman" w:hAnsi="Times New Roman"/>
-                <w:b w:val="0"/>
-                <w:i w:val="0"/>
-                <w:color w:val="000000"/>
-                <w:sz w:val="20"/>
-                <w:u w:val="none"/>
-              </w:rPr>
-              <w:t>x = x</w:t>
-            </w:r>
-            <w:r>
-              <w:rPr>
-                <w:rFonts w:ascii="Times New Roman" w:hAnsi="Times New Roman"/>
-                <w:b w:val="0"/>
-                <w:i w:val="0"/>
-                <w:color w:val="000000"/>
-                <w:sz w:val="20"/>
-                <w:u w:val="none"/>
-                <w:vertAlign w:val="subscript"/>
-              </w:rPr>
-              <w:t>0</w:t>
-            </w:r>
-            <w:r>
-              <w:rPr>
-                <w:rFonts w:ascii="Times New Roman" w:hAnsi="Times New Roman"/>
-                <w:b w:val="0"/>
-                <w:i w:val="0"/>
-                <w:color w:val="000000"/>
-                <w:sz w:val="20"/>
-                <w:u w:val="none"/>
-              </w:rPr>
-              <w:t xml:space="preserve"> + v</w:t>
-            </w:r>
-            <w:r>
-              <w:rPr>
-                <w:rFonts w:ascii="Times New Roman" w:hAnsi="Times New Roman"/>
-                <w:b w:val="0"/>
-                <w:i w:val="0"/>
-                <w:color w:val="000000"/>
-                <w:sz w:val="20"/>
-                <w:u w:val="none"/>
-                <w:vertAlign w:val="subscript"/>
-              </w:rPr>
-              <w:t>0</w:t>
-            </w:r>
-            <w:r>
-              <w:rPr>
-                <w:rFonts w:ascii="Times New Roman" w:hAnsi="Times New Roman"/>
-                <w:b w:val="0"/>
-                <w:i w:val="0"/>
-                <w:color w:val="000000"/>
-                <w:sz w:val="20"/>
-                <w:u w:val="none"/>
-              </w:rPr>
-              <w:t>t + ½at</w:t>
-            </w:r>
-            <w:r>
-              <w:rPr>
-                <w:rFonts w:ascii="Times New Roman" w:hAnsi="Times New Roman"/>
-                <w:b w:val="0"/>
-                <w:i w:val="0"/>
-                <w:color w:val="000000"/>
-                <w:sz w:val="20"/>
-                <w:u w:val="none"/>
-                <w:vertAlign w:val="superscript"/>
-              </w:rPr>
-              <w:t>2</w:t>
-            </w:r>
-          </w:p>
-          <w:p>
-            <w:pPr>
-              <w:spacing w:before="120" w:after="20"/>
-            </w:pPr>
-            <w:r>
-              <w:rPr>
-                <w:rFonts w:ascii="Times New Roman" w:hAnsi="Times New Roman"/>
-                <w:b w:val="0"/>
-                <w:i/>
-                <w:color w:val="555555"/>
-                <w:sz w:val="14"/>
-                <w:u w:val="none"/>
-              </w:rPr>
-              <w:t>Work Area</w:t>
-            </w:r>
-          </w:p>
-          <w:p>
-            <w:pPr>
-              <w:spacing w:after="180"/>
-              <w:pBdr>
-                <w:bottom w:val="single" w:sz="3" w:space="1" w:color="AAAAAA"/>
-              </w:pBdr>
-            </w:pPr>
-            <w:r>
-              <w:rPr>
-                <w:rFonts w:ascii="Times New Roman" w:hAnsi="Times New Roman"/>
-                <w:b w:val="0"/>
-                <w:i w:val="0"/>
-                <w:color w:val="000000"/>
-                <w:sz w:val="14"/>
-                <w:u w:val="none"/>
-              </w:rPr>
-              <w:t xml:space="preserve"> </w:t>
-            </w:r>
-          </w:p>
-          <w:p>
-            <w:pPr>
-              <w:spacing w:after="180"/>
-              <w:pBdr>
-                <w:bottom w:val="single" w:sz="3" w:space="1" w:color="AAAAAA"/>
-              </w:pBdr>
-            </w:pPr>
-            <w:r>
-              <w:rPr>
-                <w:rFonts w:ascii="Times New Roman" w:hAnsi="Times New Roman"/>
-                <w:b w:val="0"/>
-                <w:i w:val="0"/>
-                <w:color w:val="000000"/>
-                <w:sz w:val="14"/>
-                <w:u w:val="none"/>
-              </w:rPr>
-              <w:t xml:space="preserve"> </w:t>
-            </w:r>
-          </w:p>
-          <w:p>
-            <w:pPr>
-              <w:spacing w:after="180"/>
-              <w:pBdr>
-                <w:bottom w:val="single" w:sz="3" w:space="1" w:color="AAAAAA"/>
-              </w:pBdr>
-            </w:pPr>
-            <w:r>
-              <w:rPr>
-                <w:rFonts w:ascii="Times New Roman" w:hAnsi="Times New Roman"/>
-                <w:b w:val="0"/>
-                <w:i w:val="0"/>
-                <w:color w:val="000000"/>
-                <w:sz w:val="14"/>
-                <w:u w:val="none"/>
-              </w:rPr>
-              <w:t xml:space="preserve"> </w:t>
-            </w:r>
-          </w:p>
-          <w:p>
-            <w:pPr>
-              <w:spacing w:after="180"/>
-              <w:pBdr>
-                <w:bottom w:val="single" w:sz="3" w:space="1" w:color="AAAAAA"/>
-              </w:pBdr>
-            </w:pPr>
-            <w:r>
-              <w:rPr>
-                <w:rFonts w:ascii="Times New Roman" w:hAnsi="Times New Roman"/>
-                <w:b w:val="0"/>
-                <w:i w:val="0"/>
-                <w:color w:val="000000"/>
-                <w:sz w:val="14"/>
-                <w:u w:val="none"/>
-              </w:rPr>
-              <w:t xml:space="preserve"> </w:t>
-            </w:r>
+            <m:oMath>
+              <m:r>
+                <m:t>x</m:t>
+              </m:r>
+              <m:r>
+                <m:rPr>
+                  <m:sty m:val="p"/>
+                </m:rPr>
+                <m:t> = </m:t>
+              </m:r>
+              <m:sSub>
+                <m:e>
+                  <m:r>
+                    <m:t>x</m:t>
+                  </m:r>
+                </m:e>
+                <m:sub>
+                  <m:r>
+                    <m:rPr>
+                      <m:sty m:val="p"/>
+                    </m:rPr>
+                    <m:t>0</m:t>
+                  </m:r>
+                </m:sub>
+              </m:sSub>
+              <m:r>
+                <m:rPr>
+                  <m:sty m:val="p"/>
+                </m:rPr>
+                <m:t> + </m:t>
+              </m:r>
+              <m:sSub>
+                <m:e>
+                  <m:r>
+                    <m:t>v</m:t>
+                  </m:r>
+                </m:e>
+                <m:sub>
+                  <m:r>
+                    <m:rPr>
+                      <m:sty m:val="p"/>
+                    </m:rPr>
+                    <m:t>0</m:t>
+                  </m:r>
+                </m:sub>
+              </m:sSub>
+              <m:r>
+                <m:t>t</m:t>
+              </m:r>
+              <m:r>
+                <m:rPr>
+                  <m:sty m:val="p"/>
+                </m:rPr>
+                <m:t> + </m:t>
+              </m:r>
+              <m:f>
+                <m:num>
+                  <m:r>
+                    <m:rPr>
+                      <m:sty m:val="p"/>
+                    </m:rPr>
+                    <m:t>1</m:t>
+                  </m:r>
+                </m:num>
+                <m:den>
+                  <m:r>
+                    <m:rPr>
+                      <m:sty m:val="p"/>
+                    </m:rPr>
+                    <m:t>2</m:t>
+                  </m:r>
+                </m:den>
+              </m:f>
+              <m:r>
+                <m:t>a</m:t>
+              </m:r>
+              <m:sSup>
+                <m:e>
+                  <m:r>
+                    <m:t>t</m:t>
+                  </m:r>
+                </m:e>
+                <m:sup>
+                  <m:r>
+                    <m:rPr>
+                      <m:sty m:val="p"/>
+                    </m:rPr>
+                    <m:t>2</m:t>
+                  </m:r>
+                </m:sup>
+              </m:sSup>
+            </m:oMath>
           </w:p>
         </w:tc>
         <w:tc>
           <w:tcPr>
-            <w:tcW w:type="dxa" w:w="4428"/>
-            <w:tcW w:w="4428" w:type="dxa"/>
+            <w:tcW w:type="dxa" w:w="7"/>
+            <w:tcW w:w="4464" w:type="dxa"/>
             <w:tcMar>
-              <w:top w:w="50" w:type="dxa"/>
-              <w:bottom w:w="50" w:type="dxa"/>
-              <w:left w:w="70" w:type="dxa"/>
-              <w:right w:w="70" w:type="dxa"/>
+              <w:top w:w="40" w:type="dxa"/>
+              <w:bottom w:w="30" w:type="dxa"/>
+              <w:left w:w="60" w:type="dxa"/>
+              <w:right w:w="60" w:type="dxa"/>
             </w:tcMar>
             <w:vAlign w:val="top"/>
             <w:tcBorders>
@@ -2209,55 +1232,201 @@
             </w:tcBorders>
           </w:tcPr>
           <w:p>
-            <w:r/>
+            <w:pPr>
+              <w:spacing w:after="0" w:before="0"/>
+            </w:pPr>
+            <w:r>
+              <w:rPr>
+                <w:rFonts w:ascii="Calibri" w:hAnsi="Calibri"/>
+                <w:b w:val="0"/>
+                <w:i w:val="0"/>
+                <w:color w:val="000000"/>
+                <w:sz w:val="16"/>
+                <w:u w:val="none"/>
+              </w:rPr>
+              <w:t>Name: ___________________________________</w:t>
+            </w:r>
           </w:p>
           <w:p>
             <w:pPr>
-              <w:spacing w:after="20"/>
+              <w:spacing w:before="40" w:after="0"/>
             </w:pPr>
             <w:r>
               <w:rPr>
-                <w:rFonts w:ascii="Times New Roman" w:hAnsi="Times New Roman"/>
+                <w:rFonts w:ascii="Calibri" w:hAnsi="Calibri"/>
+                <w:b w:val="0"/>
+                <w:i w:val="0"/>
+                <w:color w:val="000000"/>
+                <w:sz w:val="16"/>
+                <w:u w:val="none"/>
+              </w:rPr>
+              <w:t>Grade &amp; Section: _____________  Date: __________</w:t>
+            </w:r>
+          </w:p>
+          <w:p>
+            <w:pPr>
+              <w:spacing w:before="100" w:after="20"/>
+              <w:jc w:val="center"/>
+              <w:pBdr>
+                <w:top w:val="single" w:sz="8" w:space="2" w:color="000000"/>
+                <w:left w:val="single" w:sz="8" w:space="2" w:color="000000"/>
+                <w:bottom w:val="single" w:sz="8" w:space="2" w:color="000000"/>
+                <w:right w:val="single" w:sz="8" w:space="2" w:color="000000"/>
+              </w:pBdr>
+              <w:shd w:val="clear" w:color="auto" w:fill="EDEDED"/>
+            </w:pPr>
+            <w:r>
+              <w:rPr>
+                <w:rFonts w:ascii="Calibri" w:hAnsi="Calibri"/>
+                <w:b/>
+                <w:i w:val="0"/>
+                <w:color w:val="000000"/>
+                <w:sz w:val="18"/>
+                <w:u w:val="none"/>
+              </w:rPr>
+              <w:t xml:space="preserve">PART D: </w:t>
+            </w:r>
+            <w:r>
+              <w:rPr>
+                <w:rFonts w:ascii="Calibri" w:hAnsi="Calibri"/>
+                <w:b/>
+                <w:i w:val="0"/>
+                <w:color w:val="000000"/>
+                <w:sz w:val="18"/>
+                <w:u w:val="none"/>
+              </w:rPr>
+              <w:t>Deriving Kinematic Equation 3</w:t>
+            </w:r>
+          </w:p>
+          <w:p>
+            <w:pPr>
+              <w:spacing w:before="80" w:after="80"/>
+            </w:pPr>
+            <w:r>
+              <w:rPr>
+                <w:rFonts w:ascii="Calibri" w:hAnsi="Calibri"/>
                 <w:b/>
                 <w:i w:val="0"/>
                 <w:color w:val="000000"/>
                 <w:sz w:val="16"/>
                 <w:u w:val="none"/>
               </w:rPr>
-              <w:t xml:space="preserve">Name: </w:t>
+              <w:t xml:space="preserve">GOAL: Derive  </w:t>
             </w:r>
+            <m:oMath>
+              <m:sSup>
+                <m:e>
+                  <m:r>
+                    <m:t>v</m:t>
+                  </m:r>
+                </m:e>
+                <m:sup>
+                  <m:r>
+                    <m:rPr>
+                      <m:sty m:val="p"/>
+                    </m:rPr>
+                    <m:t>2</m:t>
+                  </m:r>
+                </m:sup>
+              </m:sSup>
+              <m:r>
+                <m:rPr>
+                  <m:sty m:val="p"/>
+                </m:rPr>
+                <m:t> = </m:t>
+              </m:r>
+              <m:sSubSup>
+                <m:e>
+                  <m:r>
+                    <m:t>v</m:t>
+                  </m:r>
+                </m:e>
+                <m:sub>
+                  <m:r>
+                    <m:rPr>
+                      <m:sty m:val="p"/>
+                    </m:rPr>
+                    <m:t>0</m:t>
+                  </m:r>
+                </m:sub>
+                <m:sup>
+                  <m:r>
+                    <m:rPr>
+                      <m:sty m:val="p"/>
+                    </m:rPr>
+                    <m:t>2</m:t>
+                  </m:r>
+                </m:sup>
+              </m:sSubSup>
+              <m:r>
+                <m:rPr>
+                  <m:sty m:val="p"/>
+                </m:rPr>
+                <m:t> + 2</m:t>
+              </m:r>
+              <m:r>
+                <m:t>a</m:t>
+              </m:r>
+              <m:d>
+                <m:e>
+                  <m:r>
+                    <m:t>x</m:t>
+                  </m:r>
+                  <m:r>
+                    <m:rPr>
+                      <m:sty m:val="p"/>
+                    </m:rPr>
+                    <m:t> − </m:t>
+                  </m:r>
+                  <m:sSub>
+                    <m:e>
+                      <m:r>
+                        <m:t>x</m:t>
+                      </m:r>
+                    </m:e>
+                    <m:sub>
+                      <m:r>
+                        <m:rPr>
+                          <m:sty m:val="p"/>
+                        </m:rPr>
+                        <m:t>0</m:t>
+                      </m:r>
+                    </m:sub>
+                  </m:sSub>
+                </m:e>
+              </m:d>
+            </m:oMath>
+          </w:p>
+          <w:p>
+            <w:pPr>
+              <w:spacing w:before="60" w:after="0"/>
+            </w:pPr>
             <w:r>
               <w:rPr>
-                <w:rFonts w:ascii="Times New Roman" w:hAnsi="Times New Roman"/>
+                <w:rFonts w:ascii="Calibri" w:hAnsi="Calibri"/>
                 <w:b w:val="0"/>
                 <w:i w:val="0"/>
                 <w:color w:val="000000"/>
-                <w:sz w:val="16"/>
+                <w:sz w:val="18"/>
                 <w:u w:val="none"/>
               </w:rPr>
-              <w:tab/>
-              <w:tab/>
-              <w:tab/>
-              <w:tab/>
-              <w:tab/>
-              <w:tab/>
-              <w:tab/>
+              <w:t>1. Start with Equation 1: v = v₀ + at. Isolate t by first subtracting v₀, then dividing by a. Write t = :</w:t>
             </w:r>
           </w:p>
           <w:p>
             <w:pPr>
-              <w:spacing w:after="20"/>
+              <w:spacing w:before="60" w:after="0"/>
               <w:pBdr>
-                <w:bottom w:val="single" w:sz="4" w:space="1" w:color="000000"/>
+                <w:bottom w:val="single" w:sz="4" w:space="1" w:color="999999"/>
               </w:pBdr>
             </w:pPr>
             <w:r>
               <w:rPr>
-                <w:rFonts w:ascii="Times New Roman" w:hAnsi="Times New Roman"/>
+                <w:rFonts w:ascii="Calibri" w:hAnsi="Calibri"/>
                 <w:b w:val="0"/>
                 <w:i w:val="0"/>
                 <w:color w:val="000000"/>
-                <w:sz w:val="16"/>
+                <w:sz w:val="22"/>
                 <w:u w:val="none"/>
               </w:rPr>
               <w:t xml:space="preserve"> </w:t>
@@ -2265,34 +1434,34 @@
           </w:p>
           <w:p>
             <w:pPr>
-              <w:spacing w:after="20" w:before="60"/>
+              <w:spacing w:before="60" w:after="0"/>
             </w:pPr>
             <w:r>
               <w:rPr>
-                <w:rFonts w:ascii="Times New Roman" w:hAnsi="Times New Roman"/>
-                <w:b/>
+                <w:rFonts w:ascii="Calibri" w:hAnsi="Calibri"/>
+                <w:b w:val="0"/>
                 <w:i w:val="0"/>
                 <w:color w:val="000000"/>
-                <w:sz w:val="16"/>
+                <w:sz w:val="18"/>
                 <w:u w:val="none"/>
               </w:rPr>
-              <w:t xml:space="preserve">Grade &amp; Section: </w:t>
+              <w:t>2. Write the displacement equation: x − x₀ = ½(v₀ + v)·t. Using the expression for t from Step 1, substitute it into this equation:</w:t>
             </w:r>
           </w:p>
           <w:p>
             <w:pPr>
-              <w:spacing w:after="20"/>
+              <w:spacing w:before="60" w:after="0"/>
               <w:pBdr>
-                <w:bottom w:val="single" w:sz="4" w:space="1" w:color="000000"/>
+                <w:bottom w:val="single" w:sz="4" w:space="1" w:color="999999"/>
               </w:pBdr>
             </w:pPr>
             <w:r>
               <w:rPr>
-                <w:rFonts w:ascii="Times New Roman" w:hAnsi="Times New Roman"/>
+                <w:rFonts w:ascii="Calibri" w:hAnsi="Calibri"/>
                 <w:b w:val="0"/>
                 <w:i w:val="0"/>
                 <w:color w:val="000000"/>
-                <w:sz w:val="16"/>
+                <w:sz w:val="22"/>
                 <w:u w:val="none"/>
               </w:rPr>
               <w:t xml:space="preserve"> </w:t>
@@ -2300,34 +1469,34 @@
           </w:p>
           <w:p>
             <w:pPr>
-              <w:spacing w:after="20" w:before="60"/>
+              <w:spacing w:before="60" w:after="0"/>
             </w:pPr>
             <w:r>
               <w:rPr>
-                <w:rFonts w:ascii="Times New Roman" w:hAnsi="Times New Roman"/>
-                <w:b/>
+                <w:rFonts w:ascii="Calibri" w:hAnsi="Calibri"/>
+                <w:b w:val="0"/>
                 <w:i w:val="0"/>
                 <w:color w:val="000000"/>
-                <w:sz w:val="16"/>
+                <w:sz w:val="18"/>
                 <w:u w:val="none"/>
               </w:rPr>
-              <w:t xml:space="preserve">Date: </w:t>
+              <w:t>3. Combine the fractions into one. Recognize that the numerator (v + v₀)(v − v₀) follows the difference of squares pattern: (a+b)(a−b) = a² − b². Simplify the numerator:</w:t>
             </w:r>
           </w:p>
           <w:p>
             <w:pPr>
-              <w:spacing w:after="80"/>
+              <w:spacing w:before="60" w:after="0"/>
               <w:pBdr>
-                <w:bottom w:val="single" w:sz="4" w:space="1" w:color="000000"/>
+                <w:bottom w:val="single" w:sz="4" w:space="1" w:color="999999"/>
               </w:pBdr>
             </w:pPr>
             <w:r>
               <w:rPr>
-                <w:rFonts w:ascii="Times New Roman" w:hAnsi="Times New Roman"/>
+                <w:rFonts w:ascii="Calibri" w:hAnsi="Calibri"/>
                 <w:b w:val="0"/>
                 <w:i w:val="0"/>
                 <w:color w:val="000000"/>
-                <w:sz w:val="16"/>
+                <w:sz w:val="22"/>
                 <w:u w:val="none"/>
               </w:rPr>
               <w:t xml:space="preserve"> </w:t>
@@ -2335,573 +1504,34 @@
           </w:p>
           <w:p>
             <w:pPr>
-              <w:spacing w:before="40" w:after="0"/>
-              <w:jc w:val="center"/>
-              <w:pBdr>
-                <w:top w:val="single" w:sz="10" w:space="4" w:color="000000"/>
-                <w:left w:val="single" w:sz="10" w:space="4" w:color="000000"/>
-                <w:bottom w:val="single" w:sz="10" w:space="4" w:color="000000"/>
-                <w:right w:val="single" w:sz="10" w:space="4" w:color="000000"/>
-              </w:pBdr>
+              <w:spacing w:before="60" w:after="0"/>
             </w:pPr>
             <w:r>
               <w:rPr>
-                <w:rFonts w:ascii="Times New Roman" w:hAnsi="Times New Roman"/>
-                <w:b/>
-                <w:i w:val="0"/>
-                <w:color w:val="000000"/>
-                <w:sz w:val="22"/>
-                <w:u w:val="none"/>
-              </w:rPr>
-              <w:t>PART D</w:t>
-            </w:r>
-          </w:p>
-          <w:p>
-            <w:pPr>
-              <w:spacing w:after="120"/>
-              <w:jc w:val="center"/>
-            </w:pPr>
-            <w:r>
-              <w:rPr>
-                <w:rFonts w:ascii="Times New Roman" w:hAnsi="Times New Roman"/>
+                <w:rFonts w:ascii="Calibri" w:hAnsi="Calibri"/>
                 <w:b w:val="0"/>
-                <w:i/>
-                <w:color w:val="000000"/>
-                <w:sz w:val="15"/>
-                <w:u w:val="none"/>
-              </w:rPr>
-              <w:t>Kinematics Activity Sheet</w:t>
-            </w:r>
-          </w:p>
-          <w:p>
-            <w:pPr>
-              <w:spacing w:after="60"/>
-              <w:pBdr>
-                <w:bottom w:val="single" w:sz="6" w:space="1" w:color="555555"/>
-              </w:pBdr>
-            </w:pPr>
-            <w:r>
-              <w:rPr>
-                <w:rFonts w:ascii="Times New Roman" w:hAnsi="Times New Roman"/>
-                <w:b/>
-                <w:i w:val="0"/>
-                <w:color w:val="000000"/>
-                <w:sz w:val="19"/>
-                <w:u w:val="none"/>
-              </w:rPr>
-              <w:t>DERIVING KINEMATIC EQUATION 3</w:t>
-            </w:r>
-          </w:p>
-          <w:p>
-            <w:pPr>
-              <w:spacing w:before="40" w:after="120"/>
-              <w:pBdr>
-                <w:top w:val="single" w:sz="8" w:space="4" w:color="000000"/>
-                <w:left w:val="single" w:sz="8" w:space="4" w:color="000000"/>
-                <w:bottom w:val="single" w:sz="8" w:space="4" w:color="000000"/>
-                <w:right w:val="single" w:sz="8" w:space="4" w:color="000000"/>
-              </w:pBdr>
-              <w:shd w:val="clear" w:color="auto" w:fill="E8E8E8"/>
-            </w:pPr>
-            <w:r>
-              <w:rPr>
-                <w:rFonts w:ascii="Times New Roman" w:hAnsi="Times New Roman"/>
-                <w:b/>
-                <w:i w:val="0"/>
-                <w:color w:val="000000"/>
-                <w:sz w:val="17"/>
-                <w:u w:val="none"/>
-              </w:rPr>
-              <w:t xml:space="preserve">Goal:  </w:t>
-            </w:r>
-            <w:r>
-              <w:rPr>
-                <w:rFonts w:ascii="Times New Roman" w:hAnsi="Times New Roman"/>
-                <w:b w:val="0"/>
-                <w:i w:val="0"/>
-                <w:color w:val="000000"/>
-                <w:sz w:val="17"/>
-                <w:u w:val="none"/>
-              </w:rPr>
-              <w:t xml:space="preserve">Derive the equation  </w:t>
-            </w:r>
-            <w:r>
-              <w:rPr>
-                <w:rFonts w:ascii="Times New Roman" w:hAnsi="Times New Roman"/>
-                <w:b/>
                 <w:i w:val="0"/>
                 <w:color w:val="000000"/>
                 <w:sz w:val="18"/>
                 <w:u w:val="none"/>
               </w:rPr>
-              <w:t>v</w:t>
-            </w:r>
-            <w:r>
-              <w:rPr>
-                <w:rFonts w:ascii="Times New Roman" w:hAnsi="Times New Roman"/>
-                <w:b/>
-                <w:i w:val="0"/>
-                <w:color w:val="000000"/>
-                <w:sz w:val="18"/>
-                <w:u w:val="none"/>
-                <w:vertAlign w:val="superscript"/>
-              </w:rPr>
-              <w:t>2</w:t>
-            </w:r>
-            <w:r>
-              <w:rPr>
-                <w:rFonts w:ascii="Times New Roman" w:hAnsi="Times New Roman"/>
-                <w:b/>
-                <w:i w:val="0"/>
-                <w:color w:val="000000"/>
-                <w:sz w:val="18"/>
-                <w:u w:val="none"/>
-              </w:rPr>
-              <w:t xml:space="preserve"> = v</w:t>
-            </w:r>
-            <w:r>
-              <w:rPr>
-                <w:rFonts w:ascii="Times New Roman" w:hAnsi="Times New Roman"/>
-                <w:b/>
-                <w:i w:val="0"/>
-                <w:color w:val="000000"/>
-                <w:sz w:val="18"/>
-                <w:u w:val="none"/>
-                <w:vertAlign w:val="subscript"/>
-              </w:rPr>
-              <w:t>0</w:t>
-            </w:r>
-            <w:r>
-              <w:rPr>
-                <w:rFonts w:ascii="Times New Roman" w:hAnsi="Times New Roman"/>
-                <w:b/>
-                <w:i w:val="0"/>
-                <w:color w:val="000000"/>
-                <w:sz w:val="18"/>
-                <w:u w:val="none"/>
-                <w:vertAlign w:val="superscript"/>
-              </w:rPr>
-              <w:t>2</w:t>
-            </w:r>
-            <w:r>
-              <w:rPr>
-                <w:rFonts w:ascii="Times New Roman" w:hAnsi="Times New Roman"/>
-                <w:b/>
-                <w:i w:val="0"/>
-                <w:color w:val="000000"/>
-                <w:sz w:val="18"/>
-                <w:u w:val="none"/>
-              </w:rPr>
-              <w:t xml:space="preserve"> + 2a(x − x</w:t>
-            </w:r>
-            <w:r>
-              <w:rPr>
-                <w:rFonts w:ascii="Times New Roman" w:hAnsi="Times New Roman"/>
-                <w:b/>
-                <w:i w:val="0"/>
-                <w:color w:val="000000"/>
-                <w:sz w:val="18"/>
-                <w:u w:val="none"/>
-                <w:vertAlign w:val="subscript"/>
-              </w:rPr>
-              <w:t>0</w:t>
-            </w:r>
-            <w:r>
-              <w:rPr>
-                <w:rFonts w:ascii="Times New Roman" w:hAnsi="Times New Roman"/>
-                <w:b/>
-                <w:i w:val="0"/>
-                <w:color w:val="000000"/>
-                <w:sz w:val="18"/>
-                <w:u w:val="none"/>
-              </w:rPr>
-              <w:t>)</w:t>
+              <w:t>4. Multiply both sides by 2a to clear the denominator. Then add v₀² to both sides. Write the final equation:</w:t>
             </w:r>
           </w:p>
           <w:p>
             <w:pPr>
-              <w:spacing w:before="100" w:after="20"/>
-            </w:pPr>
-            <w:r>
-              <w:rPr>
-                <w:rFonts w:ascii="Times New Roman" w:hAnsi="Times New Roman"/>
-                <w:b/>
-                <w:i w:val="0"/>
-                <w:color w:val="000000"/>
-                <w:sz w:val="19"/>
-                <w:u w:val="none"/>
-              </w:rPr>
-              <w:t xml:space="preserve">1.  </w:t>
-            </w:r>
-            <w:r>
-              <w:rPr>
-                <w:rFonts w:ascii="Times New Roman" w:hAnsi="Times New Roman"/>
-                <w:b/>
-                <w:i w:val="0"/>
-                <w:color w:val="000000"/>
-                <w:sz w:val="18"/>
-                <w:u w:val="single"/>
-              </w:rPr>
-              <w:t>Solve the Velocity Equation for Time</w:t>
-            </w:r>
-          </w:p>
-          <w:p>
-            <w:pPr>
-              <w:spacing w:after="40"/>
-              <w:ind w:left="202"/>
-            </w:pPr>
-            <w:r>
-              <w:rPr>
-                <w:rFonts w:ascii="Times New Roman" w:hAnsi="Times New Roman"/>
-                <w:b w:val="0"/>
-                <w:i w:val="0"/>
-                <w:color w:val="000000"/>
-                <w:sz w:val="17"/>
-                <w:u w:val="none"/>
-              </w:rPr>
-              <w:t>Begin with v = v0 + at. To eliminate time from the derivation, isolate t by subtracting v0 from both sides and then dividing by a. Write the resulting expression for t before moving to the next step.</w:t>
-            </w:r>
-          </w:p>
-          <w:p>
-            <w:pPr>
-              <w:spacing w:before="100" w:after="20"/>
-            </w:pPr>
-            <w:r>
-              <w:rPr>
-                <w:rFonts w:ascii="Times New Roman" w:hAnsi="Times New Roman"/>
-                <w:b/>
-                <w:i w:val="0"/>
-                <w:color w:val="000000"/>
-                <w:sz w:val="19"/>
-                <w:u w:val="none"/>
-              </w:rPr>
-              <w:t xml:space="preserve">2.  </w:t>
-            </w:r>
-            <w:r>
-              <w:rPr>
-                <w:rFonts w:ascii="Times New Roman" w:hAnsi="Times New Roman"/>
-                <w:b/>
-                <w:i w:val="0"/>
-                <w:color w:val="000000"/>
-                <w:sz w:val="18"/>
-                <w:u w:val="single"/>
-              </w:rPr>
-              <w:t>Substitute into the Displacement Equation</w:t>
-            </w:r>
-          </w:p>
-          <w:p>
-            <w:pPr>
-              <w:spacing w:after="40"/>
-              <w:ind w:left="202"/>
-            </w:pPr>
-            <w:r>
-              <w:rPr>
-                <w:rFonts w:ascii="Times New Roman" w:hAnsi="Times New Roman"/>
-                <w:b w:val="0"/>
-                <w:i w:val="0"/>
-                <w:color w:val="000000"/>
-                <w:sz w:val="17"/>
-                <w:u w:val="none"/>
-              </w:rPr>
-              <w:t>Write the displacement-average velocity equation:</w:t>
-            </w:r>
-          </w:p>
-          <w:p>
-            <w:pPr>
-              <w:spacing w:before="40" w:after="60"/>
-              <w:jc w:val="center"/>
-            </w:pPr>
-            <w:r>
-              <w:rPr>
-                <w:rFonts w:ascii="Times New Roman" w:hAnsi="Times New Roman"/>
-                <w:b w:val="0"/>
-                <w:i w:val="0"/>
-                <w:color w:val="000000"/>
-                <w:sz w:val="20"/>
-                <w:u w:val="none"/>
-              </w:rPr>
-              <w:t>x − x</w:t>
-            </w:r>
-            <w:r>
-              <w:rPr>
-                <w:rFonts w:ascii="Times New Roman" w:hAnsi="Times New Roman"/>
-                <w:b w:val="0"/>
-                <w:i w:val="0"/>
-                <w:color w:val="000000"/>
-                <w:sz w:val="20"/>
-                <w:u w:val="none"/>
-                <w:vertAlign w:val="subscript"/>
-              </w:rPr>
-              <w:t>0</w:t>
-            </w:r>
-            <w:r>
-              <w:rPr>
-                <w:rFonts w:ascii="Times New Roman" w:hAnsi="Times New Roman"/>
-                <w:b w:val="0"/>
-                <w:i w:val="0"/>
-                <w:color w:val="000000"/>
-                <w:sz w:val="20"/>
-                <w:u w:val="none"/>
-              </w:rPr>
-              <w:t xml:space="preserve"> = ½(v</w:t>
-            </w:r>
-            <w:r>
-              <w:rPr>
-                <w:rFonts w:ascii="Times New Roman" w:hAnsi="Times New Roman"/>
-                <w:b w:val="0"/>
-                <w:i w:val="0"/>
-                <w:color w:val="000000"/>
-                <w:sz w:val="20"/>
-                <w:u w:val="none"/>
-                <w:vertAlign w:val="subscript"/>
-              </w:rPr>
-              <w:t>0</w:t>
-            </w:r>
-            <w:r>
-              <w:rPr>
-                <w:rFonts w:ascii="Times New Roman" w:hAnsi="Times New Roman"/>
-                <w:b w:val="0"/>
-                <w:i w:val="0"/>
-                <w:color w:val="000000"/>
-                <w:sz w:val="20"/>
-                <w:u w:val="none"/>
-              </w:rPr>
-              <w:t xml:space="preserve"> + v)t</w:t>
-            </w:r>
-          </w:p>
-          <w:p>
-            <w:pPr>
-              <w:spacing w:after="40"/>
-              <w:ind w:left="202"/>
-            </w:pPr>
-            <w:r>
-              <w:rPr>
-                <w:rFonts w:ascii="Times New Roman" w:hAnsi="Times New Roman"/>
-                <w:b w:val="0"/>
-                <w:i w:val="0"/>
-                <w:color w:val="000000"/>
-                <w:sz w:val="17"/>
-                <w:u w:val="none"/>
-              </w:rPr>
-              <w:t>Using the expression for t from Step 1, replace t in this equation with that expression. Write out the substitution in full.</w:t>
-            </w:r>
-          </w:p>
-          <w:p>
-            <w:pPr>
-              <w:spacing w:before="100" w:after="20"/>
-            </w:pPr>
-            <w:r>
-              <w:rPr>
-                <w:rFonts w:ascii="Times New Roman" w:hAnsi="Times New Roman"/>
-                <w:b/>
-                <w:i w:val="0"/>
-                <w:color w:val="000000"/>
-                <w:sz w:val="19"/>
-                <w:u w:val="none"/>
-              </w:rPr>
-              <w:t xml:space="preserve">3.  </w:t>
-            </w:r>
-            <w:r>
-              <w:rPr>
-                <w:rFonts w:ascii="Times New Roman" w:hAnsi="Times New Roman"/>
-                <w:b/>
-                <w:i w:val="0"/>
-                <w:color w:val="000000"/>
-                <w:sz w:val="18"/>
-                <w:u w:val="single"/>
-              </w:rPr>
-              <w:t>Apply the Difference of Squares</w:t>
-            </w:r>
-          </w:p>
-          <w:p>
-            <w:pPr>
-              <w:spacing w:after="40"/>
-              <w:ind w:left="202"/>
-            </w:pPr>
-            <w:r>
-              <w:rPr>
-                <w:rFonts w:ascii="Times New Roman" w:hAnsi="Times New Roman"/>
-                <w:b w:val="0"/>
-                <w:i w:val="0"/>
-                <w:color w:val="000000"/>
-                <w:sz w:val="17"/>
-                <w:u w:val="none"/>
-              </w:rPr>
-              <w:t>Combine the two fractions from Step 2 into a single fraction. Recognize that the numerator follows the pattern (a+b)(a−b) = a² − b². Apply that identity to simplify the numerator, yielding v² − v0².</w:t>
-            </w:r>
-          </w:p>
-          <w:p>
-            <w:pPr>
-              <w:spacing w:before="100" w:after="20"/>
-            </w:pPr>
-            <w:r>
-              <w:rPr>
-                <w:rFonts w:ascii="Times New Roman" w:hAnsi="Times New Roman"/>
-                <w:b/>
-                <w:i w:val="0"/>
-                <w:color w:val="000000"/>
-                <w:sz w:val="19"/>
-                <w:u w:val="none"/>
-              </w:rPr>
-              <w:t xml:space="preserve">4.  </w:t>
-            </w:r>
-            <w:r>
-              <w:rPr>
-                <w:rFonts w:ascii="Times New Roman" w:hAnsi="Times New Roman"/>
-                <w:b/>
-                <w:i w:val="0"/>
-                <w:color w:val="000000"/>
-                <w:sz w:val="18"/>
-                <w:u w:val="single"/>
-              </w:rPr>
-              <w:t>Isolate the Final Velocity Squared</w:t>
-            </w:r>
-          </w:p>
-          <w:p>
-            <w:pPr>
-              <w:spacing w:after="40"/>
-              <w:ind w:left="202"/>
-            </w:pPr>
-            <w:r>
-              <w:rPr>
-                <w:rFonts w:ascii="Times New Roman" w:hAnsi="Times New Roman"/>
-                <w:b w:val="0"/>
-                <w:i w:val="0"/>
-                <w:color w:val="000000"/>
-                <w:sz w:val="17"/>
-                <w:u w:val="none"/>
-              </w:rPr>
-              <w:t>Multiply both sides by 2a to clear the denominator. Then move v0² to the right-hand side. Show each operation explicitly until you arrive at the final form:</w:t>
-            </w:r>
-          </w:p>
-          <w:p>
-            <w:pPr>
-              <w:spacing w:before="40" w:after="60"/>
-              <w:jc w:val="center"/>
-            </w:pPr>
-            <w:r>
-              <w:rPr>
-                <w:rFonts w:ascii="Times New Roman" w:hAnsi="Times New Roman"/>
-                <w:b w:val="0"/>
-                <w:i w:val="0"/>
-                <w:color w:val="000000"/>
-                <w:sz w:val="20"/>
-                <w:u w:val="none"/>
-              </w:rPr>
-              <w:t>v</w:t>
-            </w:r>
-            <w:r>
-              <w:rPr>
-                <w:rFonts w:ascii="Times New Roman" w:hAnsi="Times New Roman"/>
-                <w:b w:val="0"/>
-                <w:i w:val="0"/>
-                <w:color w:val="000000"/>
-                <w:sz w:val="20"/>
-                <w:u w:val="none"/>
-                <w:vertAlign w:val="superscript"/>
-              </w:rPr>
-              <w:t>2</w:t>
-            </w:r>
-            <w:r>
-              <w:rPr>
-                <w:rFonts w:ascii="Times New Roman" w:hAnsi="Times New Roman"/>
-                <w:b w:val="0"/>
-                <w:i w:val="0"/>
-                <w:color w:val="000000"/>
-                <w:sz w:val="20"/>
-                <w:u w:val="none"/>
-              </w:rPr>
-              <w:t xml:space="preserve"> = v</w:t>
-            </w:r>
-            <w:r>
-              <w:rPr>
-                <w:rFonts w:ascii="Times New Roman" w:hAnsi="Times New Roman"/>
-                <w:b w:val="0"/>
-                <w:i w:val="0"/>
-                <w:color w:val="000000"/>
-                <w:sz w:val="20"/>
-                <w:u w:val="none"/>
-                <w:vertAlign w:val="subscript"/>
-              </w:rPr>
-              <w:t>0</w:t>
-            </w:r>
-            <w:r>
-              <w:rPr>
-                <w:rFonts w:ascii="Times New Roman" w:hAnsi="Times New Roman"/>
-                <w:b w:val="0"/>
-                <w:i w:val="0"/>
-                <w:color w:val="000000"/>
-                <w:sz w:val="20"/>
-                <w:u w:val="none"/>
-                <w:vertAlign w:val="superscript"/>
-              </w:rPr>
-              <w:t>2</w:t>
-            </w:r>
-            <w:r>
-              <w:rPr>
-                <w:rFonts w:ascii="Times New Roman" w:hAnsi="Times New Roman"/>
-                <w:b w:val="0"/>
-                <w:i w:val="0"/>
-                <w:color w:val="000000"/>
-                <w:sz w:val="20"/>
-                <w:u w:val="none"/>
-              </w:rPr>
-              <w:t xml:space="preserve"> + 2a(x − x</w:t>
-            </w:r>
-            <w:r>
-              <w:rPr>
-                <w:rFonts w:ascii="Times New Roman" w:hAnsi="Times New Roman"/>
-                <w:b w:val="0"/>
-                <w:i w:val="0"/>
-                <w:color w:val="000000"/>
-                <w:sz w:val="20"/>
-                <w:u w:val="none"/>
-                <w:vertAlign w:val="subscript"/>
-              </w:rPr>
-              <w:t>0</w:t>
-            </w:r>
-            <w:r>
-              <w:rPr>
-                <w:rFonts w:ascii="Times New Roman" w:hAnsi="Times New Roman"/>
-                <w:b w:val="0"/>
-                <w:i w:val="0"/>
-                <w:color w:val="000000"/>
-                <w:sz w:val="20"/>
-                <w:u w:val="none"/>
-              </w:rPr>
-              <w:t>)</w:t>
-            </w:r>
-          </w:p>
-          <w:p>
-            <w:pPr>
-              <w:spacing w:before="120" w:after="20"/>
-            </w:pPr>
-            <w:r>
-              <w:rPr>
-                <w:rFonts w:ascii="Times New Roman" w:hAnsi="Times New Roman"/>
-                <w:b w:val="0"/>
-                <w:i/>
-                <w:color w:val="555555"/>
-                <w:sz w:val="14"/>
-                <w:u w:val="none"/>
-              </w:rPr>
-              <w:t>Work Area</w:t>
-            </w:r>
-          </w:p>
-          <w:p>
-            <w:pPr>
-              <w:spacing w:after="180"/>
+              <w:spacing w:before="60" w:after="0"/>
               <w:pBdr>
-                <w:bottom w:val="single" w:sz="3" w:space="1" w:color="AAAAAA"/>
+                <w:bottom w:val="single" w:sz="4" w:space="1" w:color="999999"/>
               </w:pBdr>
             </w:pPr>
             <w:r>
               <w:rPr>
-                <w:rFonts w:ascii="Times New Roman" w:hAnsi="Times New Roman"/>
+                <w:rFonts w:ascii="Calibri" w:hAnsi="Calibri"/>
                 <w:b w:val="0"/>
                 <w:i w:val="0"/>
                 <w:color w:val="000000"/>
-                <w:sz w:val="14"/>
+                <w:sz w:val="22"/>
                 <w:u w:val="none"/>
               </w:rPr>
               <w:t xml:space="preserve"> </w:t>
@@ -2909,48 +1539,115 @@
           </w:p>
           <w:p>
             <w:pPr>
-              <w:spacing w:after="180"/>
+              <w:spacing w:before="100" w:after="40"/>
               <w:pBdr>
-                <w:bottom w:val="single" w:sz="3" w:space="1" w:color="AAAAAA"/>
+                <w:top w:val="single" w:sz="6" w:space="2" w:color="000000"/>
+                <w:left w:val="single" w:sz="6" w:space="2" w:color="000000"/>
+                <w:bottom w:val="single" w:sz="6" w:space="2" w:color="000000"/>
+                <w:right w:val="single" w:sz="6" w:space="2" w:color="000000"/>
               </w:pBdr>
             </w:pPr>
             <w:r>
               <w:rPr>
-                <w:rFonts w:ascii="Times New Roman" w:hAnsi="Times New Roman"/>
-                <w:b w:val="0"/>
+                <w:rFonts w:ascii="Calibri" w:hAnsi="Calibri"/>
+                <w:b/>
                 <w:i w:val="0"/>
                 <w:color w:val="000000"/>
-                <w:sz w:val="14"/>
+                <w:sz w:val="16"/>
                 <w:u w:val="none"/>
               </w:rPr>
-              <w:t xml:space="preserve"> </w:t>
+              <w:t xml:space="preserve"> ✓  Final Equation 3:  </w:t>
             </w:r>
-          </w:p>
-          <w:p>
-            <w:pPr>
-              <w:spacing w:after="180"/>
-              <w:pBdr>
-                <w:bottom w:val="single" w:sz="3" w:space="1" w:color="AAAAAA"/>
-              </w:pBdr>
-            </w:pPr>
-            <w:r>
-              <w:rPr>
-                <w:rFonts w:ascii="Times New Roman" w:hAnsi="Times New Roman"/>
-                <w:b w:val="0"/>
-                <w:i w:val="0"/>
-                <w:color w:val="000000"/>
-                <w:sz w:val="14"/>
-                <w:u w:val="none"/>
-              </w:rPr>
-              <w:t xml:space="preserve"> </w:t>
-            </w:r>
+            <m:oMath>
+              <m:sSup>
+                <m:e>
+                  <m:r>
+                    <m:t>v</m:t>
+                  </m:r>
+                </m:e>
+                <m:sup>
+                  <m:r>
+                    <m:rPr>
+                      <m:sty m:val="p"/>
+                    </m:rPr>
+                    <m:t>2</m:t>
+                  </m:r>
+                </m:sup>
+              </m:sSup>
+              <m:r>
+                <m:rPr>
+                  <m:sty m:val="p"/>
+                </m:rPr>
+                <m:t> = </m:t>
+              </m:r>
+              <m:sSubSup>
+                <m:e>
+                  <m:r>
+                    <m:t>v</m:t>
+                  </m:r>
+                </m:e>
+                <m:sub>
+                  <m:r>
+                    <m:rPr>
+                      <m:sty m:val="p"/>
+                    </m:rPr>
+                    <m:t>0</m:t>
+                  </m:r>
+                </m:sub>
+                <m:sup>
+                  <m:r>
+                    <m:rPr>
+                      <m:sty m:val="p"/>
+                    </m:rPr>
+                    <m:t>2</m:t>
+                  </m:r>
+                </m:sup>
+              </m:sSubSup>
+              <m:r>
+                <m:rPr>
+                  <m:sty m:val="p"/>
+                </m:rPr>
+                <m:t> + 2</m:t>
+              </m:r>
+              <m:r>
+                <m:t>a</m:t>
+              </m:r>
+              <m:d>
+                <m:e>
+                  <m:r>
+                    <m:t>x</m:t>
+                  </m:r>
+                  <m:r>
+                    <m:rPr>
+                      <m:sty m:val="p"/>
+                    </m:rPr>
+                    <m:t> − </m:t>
+                  </m:r>
+                  <m:sSub>
+                    <m:e>
+                      <m:r>
+                        <m:t>x</m:t>
+                      </m:r>
+                    </m:e>
+                    <m:sub>
+                      <m:r>
+                        <m:rPr>
+                          <m:sty m:val="p"/>
+                        </m:rPr>
+                        <m:t>0</m:t>
+                      </m:r>
+                    </m:sub>
+                  </m:sSub>
+                </m:e>
+              </m:d>
+            </m:oMath>
           </w:p>
         </w:tc>
       </w:tr>
     </w:tbl>
     <w:sectPr>
       <w:pgSz w:w="18720" w:h="12240" w:orient="landscape"/>
-      <w:pgMar w:top="504" w:right="504" w:bottom="504" w:left="504" w:header="720" w:footer="720" w:gutter="0"/>
+      <w:pgMar w:top="432" w:right="432" w:bottom="432" w:left="432" w:header="720" w:footer="720" w:gutter="0"/>
       <w:cols w:space="720"/>
       <w:docGrid w:linePitch="360"/>
     </w:sectPr>
@@ -3321,8 +2018,11 @@
     <w:name w:val="Normal"/>
     <w:qFormat/>
     <w:rsid w:val="00FC693F"/>
+    <w:pPr>
+      <w:spacing w:before="0" w:after="0" w:line="240" w:lineRule="auto"/>
+    </w:pPr>
     <w:rPr>
-      <w:rFonts w:ascii="Times New Roman" w:hAnsi="Times New Roman"/>
+      <w:rFonts w:ascii="Calibri" w:hAnsi="Calibri"/>
       <w:sz w:val="18"/>
     </w:rPr>
   </w:style>

</xml_diff>

<commit_message>
Revise worksheet: remove final eq boxes, all OMML, add answer key page
Changes:
- Removed the boxed 'Final Equation' at the bottom of each part
- All mathematical expressions now rendered as OMML (Office Math)
- Increased blank space (2 lines per response) for student answers
- Added Page 2: Teacher's Answer Key with red OMML equations
- Font: Calibri 9pt throughout
- Layout maintained: 4 vertical columns, landscape 13x8.5in, narrow margins
</commit_message>
<xml_diff>
--- a/kinematics_worksheet.docx
+++ b/kinematics_worksheet.docx
@@ -51,7 +51,7 @@
                 <w:sz w:val="16"/>
                 <w:u w:val="none"/>
               </w:rPr>
-              <w:t>Name: ___________________________________</w:t>
+              <w:t>Name: ________________________________________</w:t>
             </w:r>
           </w:p>
           <w:p>
@@ -67,12 +67,12 @@
                 <w:sz w:val="16"/>
                 <w:u w:val="none"/>
               </w:rPr>
-              <w:t>Grade &amp; Section: _____________  Date: __________</w:t>
+              <w:t>Grade &amp; Section: ______________  Date: ___________</w:t>
             </w:r>
           </w:p>
           <w:p>
             <w:pPr>
-              <w:spacing w:before="100" w:after="20"/>
+              <w:spacing w:before="80" w:after="40"/>
               <w:jc w:val="center"/>
               <w:pBdr>
                 <w:top w:val="single" w:sz="8" w:space="2" w:color="000000"/>
@@ -80,7 +80,7 @@
                 <w:bottom w:val="single" w:sz="8" w:space="2" w:color="000000"/>
                 <w:right w:val="single" w:sz="8" w:space="2" w:color="000000"/>
               </w:pBdr>
-              <w:shd w:val="clear" w:color="auto" w:fill="EDEDED"/>
+              <w:shd w:val="clear" w:color="auto" w:fill="E8E8E8"/>
             </w:pPr>
             <w:r>
               <w:rPr>
@@ -107,7 +107,7 @@
           </w:p>
           <w:p>
             <w:pPr>
-              <w:spacing w:before="80" w:after="80"/>
+              <w:spacing w:before="60" w:after="100"/>
             </w:pPr>
             <w:r>
               <w:rPr>
@@ -118,7 +118,18 @@
                 <w:sz w:val="16"/>
                 <w:u w:val="none"/>
               </w:rPr>
-              <w:t xml:space="preserve">GOAL: Derive  </w:t>
+              <w:t xml:space="preserve">GOAL:  </w:t>
+            </w:r>
+            <w:r>
+              <w:rPr>
+                <w:rFonts w:ascii="Calibri" w:hAnsi="Calibri"/>
+                <w:b w:val="0"/>
+                <w:i w:val="0"/>
+                <w:color w:val="000000"/>
+                <w:sz w:val="16"/>
+                <w:u w:val="none"/>
+              </w:rPr>
+              <w:t xml:space="preserve">Derive  </w:t>
             </w:r>
             <m:oMath>
               <m:r>
@@ -158,7 +169,7 @@
           </w:p>
           <w:p>
             <w:pPr>
-              <w:spacing w:before="60" w:after="0"/>
+              <w:spacing w:before="80" w:after="20"/>
             </w:pPr>
             <w:r>
               <w:rPr>
@@ -169,12 +180,12 @@
                 <w:sz w:val="18"/>
                 <w:u w:val="none"/>
               </w:rPr>
-              <w:t>1. Acceleration is defined as the rate of change of velocity over time. Write the general definition of acceleration using delta notation (a = ?):</w:t>
+              <w:t>1. Acceleration is defined as the rate of change of velocity over time. Write the defining formula for acceleration using delta notation:</w:t>
             </w:r>
           </w:p>
           <w:p>
             <w:pPr>
-              <w:spacing w:before="60" w:after="0"/>
+              <w:spacing w:before="80" w:after="0"/>
               <w:pBdr>
                 <w:bottom w:val="single" w:sz="4" w:space="1" w:color="999999"/>
               </w:pBdr>
@@ -185,7 +196,7 @@
                 <w:b w:val="0"/>
                 <w:i w:val="0"/>
                 <w:color w:val="000000"/>
-                <w:sz w:val="22"/>
+                <w:sz w:val="26"/>
                 <w:u w:val="none"/>
               </w:rPr>
               <w:t xml:space="preserve"> </w:t>
@@ -193,7 +204,26 @@
           </w:p>
           <w:p>
             <w:pPr>
-              <w:spacing w:before="60" w:after="0"/>
+              <w:spacing w:before="40" w:after="0"/>
+              <w:pBdr>
+                <w:bottom w:val="single" w:sz="4" w:space="1" w:color="999999"/>
+              </w:pBdr>
+            </w:pPr>
+            <w:r>
+              <w:rPr>
+                <w:rFonts w:ascii="Calibri" w:hAnsi="Calibri"/>
+                <w:b w:val="0"/>
+                <w:i w:val="0"/>
+                <w:color w:val="000000"/>
+                <w:sz w:val="26"/>
+                <w:u w:val="none"/>
+              </w:rPr>
+              <w:t xml:space="preserve"> </w:t>
+            </w:r>
+          </w:p>
+          <w:p>
+            <w:pPr>
+              <w:spacing w:before="80" w:after="20"/>
             </w:pPr>
             <w:r>
               <w:rPr>
@@ -209,7 +239,7 @@
           </w:p>
           <w:p>
             <w:pPr>
-              <w:spacing w:before="60" w:after="0"/>
+              <w:spacing w:before="80" w:after="0"/>
               <w:pBdr>
                 <w:bottom w:val="single" w:sz="4" w:space="1" w:color="999999"/>
               </w:pBdr>
@@ -220,7 +250,7 @@
                 <w:b w:val="0"/>
                 <w:i w:val="0"/>
                 <w:color w:val="000000"/>
-                <w:sz w:val="22"/>
+                <w:sz w:val="26"/>
                 <w:u w:val="none"/>
               </w:rPr>
               <w:t xml:space="preserve"> </w:t>
@@ -228,7 +258,26 @@
           </w:p>
           <w:p>
             <w:pPr>
-              <w:spacing w:before="60" w:after="0"/>
+              <w:spacing w:before="40" w:after="0"/>
+              <w:pBdr>
+                <w:bottom w:val="single" w:sz="4" w:space="1" w:color="999999"/>
+              </w:pBdr>
+            </w:pPr>
+            <w:r>
+              <w:rPr>
+                <w:rFonts w:ascii="Calibri" w:hAnsi="Calibri"/>
+                <w:b w:val="0"/>
+                <w:i w:val="0"/>
+                <w:color w:val="000000"/>
+                <w:sz w:val="26"/>
+                <w:u w:val="none"/>
+              </w:rPr>
+              <w:t xml:space="preserve"> </w:t>
+            </w:r>
+          </w:p>
+          <w:p>
+            <w:pPr>
+              <w:spacing w:before="80" w:after="20"/>
             </w:pPr>
             <w:r>
               <w:rPr>
@@ -239,12 +288,12 @@
                 <w:sz w:val="18"/>
                 <w:u w:val="none"/>
               </w:rPr>
-              <w:t>3. Using the equation you arrived at, multiply both sides by t to eliminate the fraction. Write the result:</w:t>
+              <w:t>3. Using the equation you arrived at in Step 2, multiply both sides by t to eliminate the fraction. Write the result:</w:t>
             </w:r>
           </w:p>
           <w:p>
             <w:pPr>
-              <w:spacing w:before="60" w:after="0"/>
+              <w:spacing w:before="80" w:after="0"/>
               <w:pBdr>
                 <w:bottom w:val="single" w:sz="4" w:space="1" w:color="999999"/>
               </w:pBdr>
@@ -255,7 +304,7 @@
                 <w:b w:val="0"/>
                 <w:i w:val="0"/>
                 <w:color w:val="000000"/>
-                <w:sz w:val="22"/>
+                <w:sz w:val="26"/>
                 <w:u w:val="none"/>
               </w:rPr>
               <w:t xml:space="preserve"> </w:t>
@@ -263,7 +312,26 @@
           </w:p>
           <w:p>
             <w:pPr>
-              <w:spacing w:before="60" w:after="0"/>
+              <w:spacing w:before="40" w:after="0"/>
+              <w:pBdr>
+                <w:bottom w:val="single" w:sz="4" w:space="1" w:color="999999"/>
+              </w:pBdr>
+            </w:pPr>
+            <w:r>
+              <w:rPr>
+                <w:rFonts w:ascii="Calibri" w:hAnsi="Calibri"/>
+                <w:b w:val="0"/>
+                <w:i w:val="0"/>
+                <w:color w:val="000000"/>
+                <w:sz w:val="26"/>
+                <w:u w:val="none"/>
+              </w:rPr>
+              <w:t xml:space="preserve"> </w:t>
+            </w:r>
+          </w:p>
+          <w:p>
+            <w:pPr>
+              <w:spacing w:before="80" w:after="20"/>
             </w:pPr>
             <w:r>
               <w:rPr>
@@ -279,7 +347,7 @@
           </w:p>
           <w:p>
             <w:pPr>
-              <w:spacing w:before="60" w:after="0"/>
+              <w:spacing w:before="80" w:after="0"/>
               <w:pBdr>
                 <w:bottom w:val="single" w:sz="4" w:space="1" w:color="999999"/>
               </w:pBdr>
@@ -290,7 +358,7 @@
                 <w:b w:val="0"/>
                 <w:i w:val="0"/>
                 <w:color w:val="000000"/>
-                <w:sz w:val="22"/>
+                <w:sz w:val="26"/>
                 <w:u w:val="none"/>
               </w:rPr>
               <w:t xml:space="preserve"> </w:t>
@@ -298,60 +366,22 @@
           </w:p>
           <w:p>
             <w:pPr>
-              <w:spacing w:before="100" w:after="40"/>
+              <w:spacing w:before="40" w:after="0"/>
               <w:pBdr>
-                <w:top w:val="single" w:sz="6" w:space="2" w:color="000000"/>
-                <w:left w:val="single" w:sz="6" w:space="2" w:color="000000"/>
-                <w:bottom w:val="single" w:sz="6" w:space="2" w:color="000000"/>
-                <w:right w:val="single" w:sz="6" w:space="2" w:color="000000"/>
+                <w:bottom w:val="single" w:sz="4" w:space="1" w:color="999999"/>
               </w:pBdr>
             </w:pPr>
             <w:r>
               <w:rPr>
                 <w:rFonts w:ascii="Calibri" w:hAnsi="Calibri"/>
-                <w:b/>
+                <w:b w:val="0"/>
                 <w:i w:val="0"/>
                 <w:color w:val="000000"/>
-                <w:sz w:val="16"/>
+                <w:sz w:val="26"/>
                 <w:u w:val="none"/>
               </w:rPr>
-              <w:t xml:space="preserve"> ✓  Final Equation 1:  </w:t>
+              <w:t xml:space="preserve"> </w:t>
             </w:r>
-            <m:oMath>
-              <m:r>
-                <m:t>v</m:t>
-              </m:r>
-              <m:r>
-                <m:rPr>
-                  <m:sty m:val="p"/>
-                </m:rPr>
-                <m:t> = </m:t>
-              </m:r>
-              <m:sSub>
-                <m:e>
-                  <m:r>
-                    <m:t>v</m:t>
-                  </m:r>
-                </m:e>
-                <m:sub>
-                  <m:r>
-                    <m:rPr>
-                      <m:sty m:val="p"/>
-                    </m:rPr>
-                    <m:t>0</m:t>
-                  </m:r>
-                </m:sub>
-              </m:sSub>
-              <m:r>
-                <m:rPr>
-                  <m:sty m:val="p"/>
-                </m:rPr>
-                <m:t> + </m:t>
-              </m:r>
-              <m:r>
-                <m:t>at</m:t>
-              </m:r>
-            </m:oMath>
           </w:p>
         </w:tc>
         <w:tc>
@@ -385,7 +415,7 @@
                 <w:sz w:val="16"/>
                 <w:u w:val="none"/>
               </w:rPr>
-              <w:t>Name: ___________________________________</w:t>
+              <w:t>Name: ________________________________________</w:t>
             </w:r>
           </w:p>
           <w:p>
@@ -401,12 +431,12 @@
                 <w:sz w:val="16"/>
                 <w:u w:val="none"/>
               </w:rPr>
-              <w:t>Grade &amp; Section: _____________  Date: __________</w:t>
+              <w:t>Grade &amp; Section: ______________  Date: ___________</w:t>
             </w:r>
           </w:p>
           <w:p>
             <w:pPr>
-              <w:spacing w:before="100" w:after="20"/>
+              <w:spacing w:before="80" w:after="40"/>
               <w:jc w:val="center"/>
               <w:pBdr>
                 <w:top w:val="single" w:sz="8" w:space="2" w:color="000000"/>
@@ -414,7 +444,7 @@
                 <w:bottom w:val="single" w:sz="8" w:space="2" w:color="000000"/>
                 <w:right w:val="single" w:sz="8" w:space="2" w:color="000000"/>
               </w:pBdr>
-              <w:shd w:val="clear" w:color="auto" w:fill="EDEDED"/>
+              <w:shd w:val="clear" w:color="auto" w:fill="E8E8E8"/>
             </w:pPr>
             <w:r>
               <w:rPr>
@@ -441,7 +471,7 @@
           </w:p>
           <w:p>
             <w:pPr>
-              <w:spacing w:before="80" w:after="80"/>
+              <w:spacing w:before="60" w:after="100"/>
             </w:pPr>
             <w:r>
               <w:rPr>
@@ -452,7 +482,18 @@
                 <w:sz w:val="16"/>
                 <w:u w:val="none"/>
               </w:rPr>
-              <w:t xml:space="preserve">GOAL: Derive  </w:t>
+              <w:t xml:space="preserve">GOAL:  </w:t>
+            </w:r>
+            <w:r>
+              <w:rPr>
+                <w:rFonts w:ascii="Calibri" w:hAnsi="Calibri"/>
+                <w:b w:val="0"/>
+                <w:i w:val="0"/>
+                <w:color w:val="000000"/>
+                <w:sz w:val="16"/>
+                <w:u w:val="none"/>
+              </w:rPr>
+              <w:t xml:space="preserve">Derive  </w:t>
             </w:r>
             <m:oMath>
               <m:r>
@@ -538,7 +579,7 @@
           </w:p>
           <w:p>
             <w:pPr>
-              <w:spacing w:before="60" w:after="0"/>
+              <w:spacing w:before="80" w:after="20"/>
             </w:pPr>
             <w:r>
               <w:rPr>
@@ -549,12 +590,12 @@
                 <w:sz w:val="18"/>
                 <w:u w:val="none"/>
               </w:rPr>
-              <w:t>1. Average velocity is defined as total displacement over total time. Write this definition as a formula (v_avg = ?):</w:t>
+              <w:t>1. Average velocity is defined as total displacement over total time. Write the definition as a formula:</w:t>
             </w:r>
           </w:p>
           <w:p>
             <w:pPr>
-              <w:spacing w:before="60" w:after="0"/>
+              <w:spacing w:before="80" w:after="0"/>
               <w:pBdr>
                 <w:bottom w:val="single" w:sz="4" w:space="1" w:color="999999"/>
               </w:pBdr>
@@ -565,7 +606,7 @@
                 <w:b w:val="0"/>
                 <w:i w:val="0"/>
                 <w:color w:val="000000"/>
-                <w:sz w:val="22"/>
+                <w:sz w:val="26"/>
                 <w:u w:val="none"/>
               </w:rPr>
               <w:t xml:space="preserve"> </w:t>
@@ -573,7 +614,26 @@
           </w:p>
           <w:p>
             <w:pPr>
-              <w:spacing w:before="60" w:after="0"/>
+              <w:spacing w:before="40" w:after="0"/>
+              <w:pBdr>
+                <w:bottom w:val="single" w:sz="4" w:space="1" w:color="999999"/>
+              </w:pBdr>
+            </w:pPr>
+            <w:r>
+              <w:rPr>
+                <w:rFonts w:ascii="Calibri" w:hAnsi="Calibri"/>
+                <w:b w:val="0"/>
+                <w:i w:val="0"/>
+                <w:color w:val="000000"/>
+                <w:sz w:val="26"/>
+                <w:u w:val="none"/>
+              </w:rPr>
+              <w:t xml:space="preserve"> </w:t>
+            </w:r>
+          </w:p>
+          <w:p>
+            <w:pPr>
+              <w:spacing w:before="80" w:after="20"/>
             </w:pPr>
             <w:r>
               <w:rPr>
@@ -584,12 +644,12 @@
                 <w:sz w:val="18"/>
                 <w:u w:val="none"/>
               </w:rPr>
-              <w:t>2. Using the equation above, multiply both sides by t and then isolate the final position x on one side. Write the result:</w:t>
+              <w:t>2. Using the equation above, multiply both sides by t then isolate the final position x on one side. Write the result:</w:t>
             </w:r>
           </w:p>
           <w:p>
             <w:pPr>
-              <w:spacing w:before="60" w:after="0"/>
+              <w:spacing w:before="80" w:after="0"/>
               <w:pBdr>
                 <w:bottom w:val="single" w:sz="4" w:space="1" w:color="999999"/>
               </w:pBdr>
@@ -600,7 +660,7 @@
                 <w:b w:val="0"/>
                 <w:i w:val="0"/>
                 <w:color w:val="000000"/>
-                <w:sz w:val="22"/>
+                <w:sz w:val="26"/>
                 <w:u w:val="none"/>
               </w:rPr>
               <w:t xml:space="preserve"> </w:t>
@@ -608,7 +668,26 @@
           </w:p>
           <w:p>
             <w:pPr>
-              <w:spacing w:before="60" w:after="0"/>
+              <w:spacing w:before="40" w:after="0"/>
+              <w:pBdr>
+                <w:bottom w:val="single" w:sz="4" w:space="1" w:color="999999"/>
+              </w:pBdr>
+            </w:pPr>
+            <w:r>
+              <w:rPr>
+                <w:rFonts w:ascii="Calibri" w:hAnsi="Calibri"/>
+                <w:b w:val="0"/>
+                <w:i w:val="0"/>
+                <w:color w:val="000000"/>
+                <w:sz w:val="26"/>
+                <w:u w:val="none"/>
+              </w:rPr>
+              <w:t xml:space="preserve"> </w:t>
+            </w:r>
+          </w:p>
+          <w:p>
+            <w:pPr>
+              <w:spacing w:before="80" w:after="20"/>
             </w:pPr>
             <w:r>
               <w:rPr>
@@ -619,12 +698,12 @@
                 <w:sz w:val="18"/>
                 <w:u w:val="none"/>
               </w:rPr>
-              <w:t>3. Under constant acceleration, velocity changes linearly. The average of any linear quantity is simply the mean of its start and end values. Write v_avg in terms of v₀ and v:</w:t>
+              <w:t>3. Under constant acceleration, velocity changes linearly. The average of any linear quantity equals the mean of its start and end values. Express the average velocity in terms of v₀ and v:</w:t>
             </w:r>
           </w:p>
           <w:p>
             <w:pPr>
-              <w:spacing w:before="60" w:after="0"/>
+              <w:spacing w:before="80" w:after="0"/>
               <w:pBdr>
                 <w:bottom w:val="single" w:sz="4" w:space="1" w:color="999999"/>
               </w:pBdr>
@@ -635,7 +714,7 @@
                 <w:b w:val="0"/>
                 <w:i w:val="0"/>
                 <w:color w:val="000000"/>
-                <w:sz w:val="22"/>
+                <w:sz w:val="26"/>
                 <w:u w:val="none"/>
               </w:rPr>
               <w:t xml:space="preserve"> </w:t>
@@ -643,7 +722,26 @@
           </w:p>
           <w:p>
             <w:pPr>
-              <w:spacing w:before="60" w:after="0"/>
+              <w:spacing w:before="40" w:after="0"/>
+              <w:pBdr>
+                <w:bottom w:val="single" w:sz="4" w:space="1" w:color="999999"/>
+              </w:pBdr>
+            </w:pPr>
+            <w:r>
+              <w:rPr>
+                <w:rFonts w:ascii="Calibri" w:hAnsi="Calibri"/>
+                <w:b w:val="0"/>
+                <w:i w:val="0"/>
+                <w:color w:val="000000"/>
+                <w:sz w:val="26"/>
+                <w:u w:val="none"/>
+              </w:rPr>
+              <w:t xml:space="preserve"> </w:t>
+            </w:r>
+          </w:p>
+          <w:p>
+            <w:pPr>
+              <w:spacing w:before="80" w:after="20"/>
             </w:pPr>
             <w:r>
               <w:rPr>
@@ -654,12 +752,12 @@
                 <w:sz w:val="18"/>
                 <w:u w:val="none"/>
               </w:rPr>
-              <w:t>4. Using the position equation from Step 2, replace v_avg with the expression you found in Step 3. Write the final equation:</w:t>
+              <w:t>4. Using the position equation from Step 2, replace the average velocity with the expression you found in Step 3. Write the final equation:</w:t>
             </w:r>
           </w:p>
           <w:p>
             <w:pPr>
-              <w:spacing w:before="60" w:after="0"/>
+              <w:spacing w:before="80" w:after="0"/>
               <w:pBdr>
                 <w:bottom w:val="single" w:sz="4" w:space="1" w:color="999999"/>
               </w:pBdr>
@@ -670,7 +768,7 @@
                 <w:b w:val="0"/>
                 <w:i w:val="0"/>
                 <w:color w:val="000000"/>
-                <w:sz w:val="22"/>
+                <w:sz w:val="26"/>
                 <w:u w:val="none"/>
               </w:rPr>
               <w:t xml:space="preserve"> </w:t>
@@ -678,106 +776,22 @@
           </w:p>
           <w:p>
             <w:pPr>
-              <w:spacing w:before="100" w:after="40"/>
+              <w:spacing w:before="40" w:after="0"/>
               <w:pBdr>
-                <w:top w:val="single" w:sz="6" w:space="2" w:color="000000"/>
-                <w:left w:val="single" w:sz="6" w:space="2" w:color="000000"/>
-                <w:bottom w:val="single" w:sz="6" w:space="2" w:color="000000"/>
-                <w:right w:val="single" w:sz="6" w:space="2" w:color="000000"/>
+                <w:bottom w:val="single" w:sz="4" w:space="1" w:color="999999"/>
               </w:pBdr>
             </w:pPr>
             <w:r>
               <w:rPr>
                 <w:rFonts w:ascii="Calibri" w:hAnsi="Calibri"/>
-                <w:b/>
+                <w:b w:val="0"/>
                 <w:i w:val="0"/>
                 <w:color w:val="000000"/>
-                <w:sz w:val="16"/>
+                <w:sz w:val="26"/>
                 <w:u w:val="none"/>
               </w:rPr>
-              <w:t xml:space="preserve"> ✓  Final Equation 4:  </w:t>
+              <w:t xml:space="preserve"> </w:t>
             </w:r>
-            <m:oMath>
-              <m:r>
-                <m:t>x</m:t>
-              </m:r>
-              <m:r>
-                <m:rPr>
-                  <m:sty m:val="p"/>
-                </m:rPr>
-                <m:t> = </m:t>
-              </m:r>
-              <m:sSub>
-                <m:e>
-                  <m:r>
-                    <m:t>x</m:t>
-                  </m:r>
-                </m:e>
-                <m:sub>
-                  <m:r>
-                    <m:rPr>
-                      <m:sty m:val="p"/>
-                    </m:rPr>
-                    <m:t>0</m:t>
-                  </m:r>
-                </m:sub>
-              </m:sSub>
-              <m:r>
-                <m:rPr>
-                  <m:sty m:val="p"/>
-                </m:rPr>
-                <m:t> + </m:t>
-              </m:r>
-              <m:f>
-                <m:num>
-                  <m:r>
-                    <m:rPr>
-                      <m:sty m:val="p"/>
-                    </m:rPr>
-                    <m:t>1</m:t>
-                  </m:r>
-                </m:num>
-                <m:den>
-                  <m:r>
-                    <m:rPr>
-                      <m:sty m:val="p"/>
-                    </m:rPr>
-                    <m:t>2</m:t>
-                  </m:r>
-                </m:den>
-              </m:f>
-              <m:d>
-                <m:e>
-                  <m:sSub>
-                    <m:e>
-                      <m:r>
-                        <m:t>v</m:t>
-                      </m:r>
-                    </m:e>
-                    <m:sub>
-                      <m:r>
-                        <m:rPr>
-                          <m:sty m:val="p"/>
-                        </m:rPr>
-                        <m:t>0</m:t>
-                      </m:r>
-                    </m:sub>
-                  </m:sSub>
-                  <m:r>
-                    <m:rPr>
-                      <m:sty m:val="p"/>
-                    </m:rPr>
-                    <m:t> + </m:t>
-                  </m:r>
-                  <m:r>
-                    <m:t>v</m:t>
-                  </m:r>
-                </m:e>
-              </m:d>
-              <m:r>
-                <m:t>t</m:t>
-              </m:r>
-            </m:oMath>
           </w:p>
         </w:tc>
         <w:tc>
@@ -811,7 +825,7 @@
                 <w:sz w:val="16"/>
                 <w:u w:val="none"/>
               </w:rPr>
-              <w:t>Name: ___________________________________</w:t>
+              <w:t>Name: ________________________________________</w:t>
             </w:r>
           </w:p>
           <w:p>
@@ -827,12 +841,12 @@
                 <w:sz w:val="16"/>
                 <w:u w:val="none"/>
               </w:rPr>
-              <w:t>Grade &amp; Section: _____________  Date: __________</w:t>
+              <w:t>Grade &amp; Section: ______________  Date: ___________</w:t>
             </w:r>
           </w:p>
           <w:p>
             <w:pPr>
-              <w:spacing w:before="100" w:after="20"/>
+              <w:spacing w:before="80" w:after="40"/>
               <w:jc w:val="center"/>
               <w:pBdr>
                 <w:top w:val="single" w:sz="8" w:space="2" w:color="000000"/>
@@ -840,7 +854,7 @@
                 <w:bottom w:val="single" w:sz="8" w:space="2" w:color="000000"/>
                 <w:right w:val="single" w:sz="8" w:space="2" w:color="000000"/>
               </w:pBdr>
-              <w:shd w:val="clear" w:color="auto" w:fill="EDEDED"/>
+              <w:shd w:val="clear" w:color="auto" w:fill="E8E8E8"/>
             </w:pPr>
             <w:r>
               <w:rPr>
@@ -867,7 +881,7 @@
           </w:p>
           <w:p>
             <w:pPr>
-              <w:spacing w:before="80" w:after="80"/>
+              <w:spacing w:before="60" w:after="100"/>
             </w:pPr>
             <w:r>
               <w:rPr>
@@ -878,7 +892,18 @@
                 <w:sz w:val="16"/>
                 <w:u w:val="none"/>
               </w:rPr>
-              <w:t xml:space="preserve">GOAL: Derive  </w:t>
+              <w:t xml:space="preserve">GOAL:  </w:t>
+            </w:r>
+            <w:r>
+              <w:rPr>
+                <w:rFonts w:ascii="Calibri" w:hAnsi="Calibri"/>
+                <w:b w:val="0"/>
+                <w:i w:val="0"/>
+                <w:color w:val="000000"/>
+                <w:sz w:val="16"/>
+                <w:u w:val="none"/>
+              </w:rPr>
+              <w:t xml:space="preserve">Derive  </w:t>
             </w:r>
             <m:oMath>
               <m:r>
@@ -975,7 +1000,7 @@
           </w:p>
           <w:p>
             <w:pPr>
-              <w:spacing w:before="60" w:after="0"/>
+              <w:spacing w:before="80" w:after="20"/>
             </w:pPr>
             <w:r>
               <w:rPr>
@@ -987,15 +1012,159 @@
                 <w:u w:val="none"/>
               </w:rPr>
               <w:t>1. Write down the two source equations you will combine:</w:t>
-              <w:br/>
-              <w:t xml:space="preserve">    Equation 1 (velocity):  v = v₀ + at</w:t>
-              <w:br/>
-              <w:t xml:space="preserve">    Equation 4 (position):  x = x₀ + ½(v₀ + v)t</w:t>
             </w:r>
           </w:p>
           <w:p>
             <w:pPr>
-              <w:spacing w:before="60" w:after="0"/>
+              <w:spacing w:before="40" w:after="0"/>
+            </w:pPr>
+            <w:r>
+              <w:rPr>
+                <w:rFonts w:ascii="Calibri" w:hAnsi="Calibri"/>
+                <w:b w:val="0"/>
+                <w:i/>
+                <w:color w:val="000000"/>
+                <w:sz w:val="16"/>
+                <w:u w:val="none"/>
+              </w:rPr>
+              <w:t xml:space="preserve">     Equation 1:  </w:t>
+            </w:r>
+            <m:oMath>
+              <m:r>
+                <m:t>v</m:t>
+              </m:r>
+              <m:r>
+                <m:rPr>
+                  <m:sty m:val="p"/>
+                </m:rPr>
+                <m:t> = </m:t>
+              </m:r>
+              <m:sSub>
+                <m:e>
+                  <m:r>
+                    <m:t>v</m:t>
+                  </m:r>
+                </m:e>
+                <m:sub>
+                  <m:r>
+                    <m:rPr>
+                      <m:sty m:val="p"/>
+                    </m:rPr>
+                    <m:t>0</m:t>
+                  </m:r>
+                </m:sub>
+              </m:sSub>
+              <m:r>
+                <m:rPr>
+                  <m:sty m:val="p"/>
+                </m:rPr>
+                <m:t> + </m:t>
+              </m:r>
+              <m:r>
+                <m:t>at</m:t>
+              </m:r>
+            </m:oMath>
+          </w:p>
+          <w:p>
+            <w:pPr>
+              <w:spacing w:before="20" w:after="40"/>
+            </w:pPr>
+            <w:r>
+              <w:rPr>
+                <w:rFonts w:ascii="Calibri" w:hAnsi="Calibri"/>
+                <w:b w:val="0"/>
+                <w:i/>
+                <w:color w:val="000000"/>
+                <w:sz w:val="16"/>
+                <w:u w:val="none"/>
+              </w:rPr>
+              <w:t xml:space="preserve">     Equation 4:  </w:t>
+            </w:r>
+            <m:oMath>
+              <m:r>
+                <m:t>x</m:t>
+              </m:r>
+              <m:r>
+                <m:rPr>
+                  <m:sty m:val="p"/>
+                </m:rPr>
+                <m:t> = </m:t>
+              </m:r>
+              <m:sSub>
+                <m:e>
+                  <m:r>
+                    <m:t>x</m:t>
+                  </m:r>
+                </m:e>
+                <m:sub>
+                  <m:r>
+                    <m:rPr>
+                      <m:sty m:val="p"/>
+                    </m:rPr>
+                    <m:t>0</m:t>
+                  </m:r>
+                </m:sub>
+              </m:sSub>
+              <m:r>
+                <m:rPr>
+                  <m:sty m:val="p"/>
+                </m:rPr>
+                <m:t> + </m:t>
+              </m:r>
+              <m:f>
+                <m:num>
+                  <m:r>
+                    <m:rPr>
+                      <m:sty m:val="p"/>
+                    </m:rPr>
+                    <m:t>1</m:t>
+                  </m:r>
+                </m:num>
+                <m:den>
+                  <m:r>
+                    <m:rPr>
+                      <m:sty m:val="p"/>
+                    </m:rPr>
+                    <m:t>2</m:t>
+                  </m:r>
+                </m:den>
+              </m:f>
+              <m:d>
+                <m:e>
+                  <m:sSub>
+                    <m:e>
+                      <m:r>
+                        <m:t>v</m:t>
+                      </m:r>
+                    </m:e>
+                    <m:sub>
+                      <m:r>
+                        <m:rPr>
+                          <m:sty m:val="p"/>
+                        </m:rPr>
+                        <m:t>0</m:t>
+                      </m:r>
+                    </m:sub>
+                  </m:sSub>
+                  <m:r>
+                    <m:rPr>
+                      <m:sty m:val="p"/>
+                    </m:rPr>
+                    <m:t> + </m:t>
+                  </m:r>
+                  <m:r>
+                    <m:t>v</m:t>
+                  </m:r>
+                </m:e>
+              </m:d>
+              <m:r>
+                <m:t>t</m:t>
+              </m:r>
+            </m:oMath>
+          </w:p>
+          <w:p>
+            <w:pPr>
+              <w:spacing w:before="80" w:after="20"/>
             </w:pPr>
             <w:r>
               <w:rPr>
@@ -1006,12 +1175,12 @@
                 <w:sz w:val="18"/>
                 <w:u w:val="none"/>
               </w:rPr>
-              <w:t>2. In Equation 4, locate the variable v. Replace it entirely with the right-hand side of Equation 1 (v₀ + at). Write the substitution:</w:t>
+              <w:t>2. In Equation 4, replace v with the right-hand side of Equation 1. Write the full substitution:</w:t>
             </w:r>
           </w:p>
           <w:p>
             <w:pPr>
-              <w:spacing w:before="60" w:after="0"/>
+              <w:spacing w:before="80" w:after="0"/>
               <w:pBdr>
                 <w:bottom w:val="single" w:sz="4" w:space="1" w:color="999999"/>
               </w:pBdr>
@@ -1022,7 +1191,7 @@
                 <w:b w:val="0"/>
                 <w:i w:val="0"/>
                 <w:color w:val="000000"/>
-                <w:sz w:val="22"/>
+                <w:sz w:val="26"/>
                 <w:u w:val="none"/>
               </w:rPr>
               <w:t xml:space="preserve"> </w:t>
@@ -1030,7 +1199,26 @@
           </w:p>
           <w:p>
             <w:pPr>
-              <w:spacing w:before="60" w:after="0"/>
+              <w:spacing w:before="40" w:after="0"/>
+              <w:pBdr>
+                <w:bottom w:val="single" w:sz="4" w:space="1" w:color="999999"/>
+              </w:pBdr>
+            </w:pPr>
+            <w:r>
+              <w:rPr>
+                <w:rFonts w:ascii="Calibri" w:hAnsi="Calibri"/>
+                <w:b w:val="0"/>
+                <w:i w:val="0"/>
+                <w:color w:val="000000"/>
+                <w:sz w:val="26"/>
+                <w:u w:val="none"/>
+              </w:rPr>
+              <w:t xml:space="preserve"> </w:t>
+            </w:r>
+          </w:p>
+          <w:p>
+            <w:pPr>
+              <w:spacing w:before="80" w:after="20"/>
             </w:pPr>
             <w:r>
               <w:rPr>
@@ -1041,12 +1229,12 @@
                 <w:sz w:val="18"/>
                 <w:u w:val="none"/>
               </w:rPr>
-              <w:t>3. Inside the brackets, combine the two v₀ terms (v₀ + v₀ = 2v₀). Write the simplified expression:</w:t>
+              <w:t>3. Using the expression from Step 2, combine the like terms inside the brackets (v₀ + v₀ = 2v₀). Write the simplified expression:</w:t>
             </w:r>
           </w:p>
           <w:p>
             <w:pPr>
-              <w:spacing w:before="60" w:after="0"/>
+              <w:spacing w:before="80" w:after="0"/>
               <w:pBdr>
                 <w:bottom w:val="single" w:sz="4" w:space="1" w:color="999999"/>
               </w:pBdr>
@@ -1057,7 +1245,7 @@
                 <w:b w:val="0"/>
                 <w:i w:val="0"/>
                 <w:color w:val="000000"/>
-                <w:sz w:val="22"/>
+                <w:sz w:val="26"/>
                 <w:u w:val="none"/>
               </w:rPr>
               <w:t xml:space="preserve"> </w:t>
@@ -1065,7 +1253,26 @@
           </w:p>
           <w:p>
             <w:pPr>
-              <w:spacing w:before="60" w:after="0"/>
+              <w:spacing w:before="40" w:after="0"/>
+              <w:pBdr>
+                <w:bottom w:val="single" w:sz="4" w:space="1" w:color="999999"/>
+              </w:pBdr>
+            </w:pPr>
+            <w:r>
+              <w:rPr>
+                <w:rFonts w:ascii="Calibri" w:hAnsi="Calibri"/>
+                <w:b w:val="0"/>
+                <w:i w:val="0"/>
+                <w:color w:val="000000"/>
+                <w:sz w:val="26"/>
+                <w:u w:val="none"/>
+              </w:rPr>
+              <w:t xml:space="preserve"> </w:t>
+            </w:r>
+          </w:p>
+          <w:p>
+            <w:pPr>
+              <w:spacing w:before="80" w:after="20"/>
             </w:pPr>
             <w:r>
               <w:rPr>
@@ -1076,12 +1283,12 @@
                 <w:sz w:val="18"/>
                 <w:u w:val="none"/>
               </w:rPr>
-              <w:t>4. Distribute t into the bracket, then distribute the ½ to each term. Simplify the coefficients. Write the final equation:</w:t>
+              <w:t>4. Distribute t into the bracket, then distribute ½ to each term. Simplify the coefficients and write the final equation:</w:t>
             </w:r>
           </w:p>
           <w:p>
             <w:pPr>
-              <w:spacing w:before="60" w:after="0"/>
+              <w:spacing w:before="80" w:after="0"/>
               <w:pBdr>
                 <w:bottom w:val="single" w:sz="4" w:space="1" w:color="999999"/>
               </w:pBdr>
@@ -1092,7 +1299,7 @@
                 <w:b w:val="0"/>
                 <w:i w:val="0"/>
                 <w:color w:val="000000"/>
-                <w:sz w:val="22"/>
+                <w:sz w:val="26"/>
                 <w:u w:val="none"/>
               </w:rPr>
               <w:t xml:space="preserve"> </w:t>
@@ -1100,13 +1307,112 @@
           </w:p>
           <w:p>
             <w:pPr>
-              <w:spacing w:before="100" w:after="40"/>
+              <w:spacing w:before="40" w:after="0"/>
               <w:pBdr>
-                <w:top w:val="single" w:sz="6" w:space="2" w:color="000000"/>
-                <w:left w:val="single" w:sz="6" w:space="2" w:color="000000"/>
-                <w:bottom w:val="single" w:sz="6" w:space="2" w:color="000000"/>
-                <w:right w:val="single" w:sz="6" w:space="2" w:color="000000"/>
+                <w:bottom w:val="single" w:sz="4" w:space="1" w:color="999999"/>
               </w:pBdr>
+            </w:pPr>
+            <w:r>
+              <w:rPr>
+                <w:rFonts w:ascii="Calibri" w:hAnsi="Calibri"/>
+                <w:b w:val="0"/>
+                <w:i w:val="0"/>
+                <w:color w:val="000000"/>
+                <w:sz w:val="26"/>
+                <w:u w:val="none"/>
+              </w:rPr>
+              <w:t xml:space="preserve"> </w:t>
+            </w:r>
+          </w:p>
+        </w:tc>
+        <w:tc>
+          <w:tcPr>
+            <w:tcW w:type="dxa" w:w="7"/>
+            <w:tcW w:w="4464" w:type="dxa"/>
+            <w:tcMar>
+              <w:top w:w="40" w:type="dxa"/>
+              <w:bottom w:w="30" w:type="dxa"/>
+              <w:left w:w="60" w:type="dxa"/>
+              <w:right w:w="60" w:type="dxa"/>
+            </w:tcMar>
+            <w:vAlign w:val="top"/>
+            <w:tcBorders>
+              <w:top w:val="single" w:sz="10" w:space="0" w:color="000000"/>
+              <w:left w:val="single" w:sz="10" w:space="0" w:color="000000"/>
+              <w:bottom w:val="single" w:sz="10" w:space="0" w:color="000000"/>
+              <w:right w:val="single" w:sz="10" w:space="0" w:color="000000"/>
+            </w:tcBorders>
+          </w:tcPr>
+          <w:p>
+            <w:pPr>
+              <w:spacing w:after="0" w:before="0"/>
+            </w:pPr>
+            <w:r>
+              <w:rPr>
+                <w:rFonts w:ascii="Calibri" w:hAnsi="Calibri"/>
+                <w:b w:val="0"/>
+                <w:i w:val="0"/>
+                <w:color w:val="000000"/>
+                <w:sz w:val="16"/>
+                <w:u w:val="none"/>
+              </w:rPr>
+              <w:t>Name: ________________________________________</w:t>
+            </w:r>
+          </w:p>
+          <w:p>
+            <w:pPr>
+              <w:spacing w:before="40" w:after="0"/>
+            </w:pPr>
+            <w:r>
+              <w:rPr>
+                <w:rFonts w:ascii="Calibri" w:hAnsi="Calibri"/>
+                <w:b w:val="0"/>
+                <w:i w:val="0"/>
+                <w:color w:val="000000"/>
+                <w:sz w:val="16"/>
+                <w:u w:val="none"/>
+              </w:rPr>
+              <w:t>Grade &amp; Section: ______________  Date: ___________</w:t>
+            </w:r>
+          </w:p>
+          <w:p>
+            <w:pPr>
+              <w:spacing w:before="80" w:after="40"/>
+              <w:jc w:val="center"/>
+              <w:pBdr>
+                <w:top w:val="single" w:sz="8" w:space="2" w:color="000000"/>
+                <w:left w:val="single" w:sz="8" w:space="2" w:color="000000"/>
+                <w:bottom w:val="single" w:sz="8" w:space="2" w:color="000000"/>
+                <w:right w:val="single" w:sz="8" w:space="2" w:color="000000"/>
+              </w:pBdr>
+              <w:shd w:val="clear" w:color="auto" w:fill="E8E8E8"/>
+            </w:pPr>
+            <w:r>
+              <w:rPr>
+                <w:rFonts w:ascii="Calibri" w:hAnsi="Calibri"/>
+                <w:b/>
+                <w:i w:val="0"/>
+                <w:color w:val="000000"/>
+                <w:sz w:val="18"/>
+                <w:u w:val="none"/>
+              </w:rPr>
+              <w:t xml:space="preserve">PART D: </w:t>
+            </w:r>
+            <w:r>
+              <w:rPr>
+                <w:rFonts w:ascii="Calibri" w:hAnsi="Calibri"/>
+                <w:b/>
+                <w:i w:val="0"/>
+                <w:color w:val="000000"/>
+                <w:sz w:val="18"/>
+                <w:u w:val="none"/>
+              </w:rPr>
+              <w:t>Deriving Kinematic Equation 3</w:t>
+            </w:r>
+          </w:p>
+          <w:p>
+            <w:pPr>
+              <w:spacing w:before="60" w:after="100"/>
             </w:pPr>
             <w:r>
               <w:rPr>
@@ -1117,7 +1423,1563 @@
                 <w:sz w:val="16"/>
                 <w:u w:val="none"/>
               </w:rPr>
-              <w:t xml:space="preserve"> ✓  Final Equation 2:  </w:t>
+              <w:t xml:space="preserve">GOAL:  </w:t>
+            </w:r>
+            <w:r>
+              <w:rPr>
+                <w:rFonts w:ascii="Calibri" w:hAnsi="Calibri"/>
+                <w:b w:val="0"/>
+                <w:i w:val="0"/>
+                <w:color w:val="000000"/>
+                <w:sz w:val="16"/>
+                <w:u w:val="none"/>
+              </w:rPr>
+              <w:t xml:space="preserve">Derive  </w:t>
+            </w:r>
+            <m:oMath>
+              <m:sSup>
+                <m:e>
+                  <m:r>
+                    <m:t>v</m:t>
+                  </m:r>
+                </m:e>
+                <m:sup>
+                  <m:r>
+                    <m:rPr>
+                      <m:sty m:val="p"/>
+                    </m:rPr>
+                    <m:t>2</m:t>
+                  </m:r>
+                </m:sup>
+              </m:sSup>
+              <m:r>
+                <m:rPr>
+                  <m:sty m:val="p"/>
+                </m:rPr>
+                <m:t> = </m:t>
+              </m:r>
+              <m:sSubSup>
+                <m:e>
+                  <m:r>
+                    <m:t>v</m:t>
+                  </m:r>
+                </m:e>
+                <m:sub>
+                  <m:r>
+                    <m:rPr>
+                      <m:sty m:val="p"/>
+                    </m:rPr>
+                    <m:t>0</m:t>
+                  </m:r>
+                </m:sub>
+                <m:sup>
+                  <m:r>
+                    <m:rPr>
+                      <m:sty m:val="p"/>
+                    </m:rPr>
+                    <m:t>2</m:t>
+                  </m:r>
+                </m:sup>
+              </m:sSubSup>
+              <m:r>
+                <m:rPr>
+                  <m:sty m:val="p"/>
+                </m:rPr>
+                <m:t> + 2</m:t>
+              </m:r>
+              <m:r>
+                <m:t>a</m:t>
+              </m:r>
+              <m:d>
+                <m:e>
+                  <m:r>
+                    <m:t>x</m:t>
+                  </m:r>
+                  <m:r>
+                    <m:rPr>
+                      <m:sty m:val="p"/>
+                    </m:rPr>
+                    <m:t> − </m:t>
+                  </m:r>
+                  <m:sSub>
+                    <m:e>
+                      <m:r>
+                        <m:t>x</m:t>
+                      </m:r>
+                    </m:e>
+                    <m:sub>
+                      <m:r>
+                        <m:rPr>
+                          <m:sty m:val="p"/>
+                        </m:rPr>
+                        <m:t>0</m:t>
+                      </m:r>
+                    </m:sub>
+                  </m:sSub>
+                </m:e>
+              </m:d>
+            </m:oMath>
+          </w:p>
+          <w:p>
+            <w:pPr>
+              <w:spacing w:before="80" w:after="20"/>
+            </w:pPr>
+            <w:r>
+              <w:rPr>
+                <w:rFonts w:ascii="Calibri" w:hAnsi="Calibri"/>
+                <w:b w:val="0"/>
+                <w:i w:val="0"/>
+                <w:color w:val="000000"/>
+                <w:sz w:val="18"/>
+                <w:u w:val="none"/>
+              </w:rPr>
+              <w:t>1. Start with Equation 1: v = v₀ + at. Isolate t (subtract v₀, then divide by a). Write t =</w:t>
+            </w:r>
+          </w:p>
+          <w:p>
+            <w:pPr>
+              <w:spacing w:before="80" w:after="0"/>
+              <w:pBdr>
+                <w:bottom w:val="single" w:sz="4" w:space="1" w:color="999999"/>
+              </w:pBdr>
+            </w:pPr>
+            <w:r>
+              <w:rPr>
+                <w:rFonts w:ascii="Calibri" w:hAnsi="Calibri"/>
+                <w:b w:val="0"/>
+                <w:i w:val="0"/>
+                <w:color w:val="000000"/>
+                <w:sz w:val="26"/>
+                <w:u w:val="none"/>
+              </w:rPr>
+              <w:t xml:space="preserve"> </w:t>
+            </w:r>
+          </w:p>
+          <w:p>
+            <w:pPr>
+              <w:spacing w:before="40" w:after="0"/>
+              <w:pBdr>
+                <w:bottom w:val="single" w:sz="4" w:space="1" w:color="999999"/>
+              </w:pBdr>
+            </w:pPr>
+            <w:r>
+              <w:rPr>
+                <w:rFonts w:ascii="Calibri" w:hAnsi="Calibri"/>
+                <w:b w:val="0"/>
+                <w:i w:val="0"/>
+                <w:color w:val="000000"/>
+                <w:sz w:val="26"/>
+                <w:u w:val="none"/>
+              </w:rPr>
+              <w:t xml:space="preserve"> </w:t>
+            </w:r>
+          </w:p>
+          <w:p>
+            <w:pPr>
+              <w:spacing w:before="80" w:after="20"/>
+            </w:pPr>
+            <w:r>
+              <w:rPr>
+                <w:rFonts w:ascii="Calibri" w:hAnsi="Calibri"/>
+                <w:b w:val="0"/>
+                <w:i w:val="0"/>
+                <w:color w:val="000000"/>
+                <w:sz w:val="18"/>
+                <w:u w:val="none"/>
+              </w:rPr>
+              <w:t>2. Write the displacement equation: x − x₀ = ½(v₀ + v)·t. Replace t with the expression from Step 1. Write the substitution:</w:t>
+            </w:r>
+          </w:p>
+          <w:p>
+            <w:pPr>
+              <w:spacing w:before="80" w:after="0"/>
+              <w:pBdr>
+                <w:bottom w:val="single" w:sz="4" w:space="1" w:color="999999"/>
+              </w:pBdr>
+            </w:pPr>
+            <w:r>
+              <w:rPr>
+                <w:rFonts w:ascii="Calibri" w:hAnsi="Calibri"/>
+                <w:b w:val="0"/>
+                <w:i w:val="0"/>
+                <w:color w:val="000000"/>
+                <w:sz w:val="26"/>
+                <w:u w:val="none"/>
+              </w:rPr>
+              <w:t xml:space="preserve"> </w:t>
+            </w:r>
+          </w:p>
+          <w:p>
+            <w:pPr>
+              <w:spacing w:before="40" w:after="0"/>
+              <w:pBdr>
+                <w:bottom w:val="single" w:sz="4" w:space="1" w:color="999999"/>
+              </w:pBdr>
+            </w:pPr>
+            <w:r>
+              <w:rPr>
+                <w:rFonts w:ascii="Calibri" w:hAnsi="Calibri"/>
+                <w:b w:val="0"/>
+                <w:i w:val="0"/>
+                <w:color w:val="000000"/>
+                <w:sz w:val="26"/>
+                <w:u w:val="none"/>
+              </w:rPr>
+              <w:t xml:space="preserve"> </w:t>
+            </w:r>
+          </w:p>
+          <w:p>
+            <w:pPr>
+              <w:spacing w:before="80" w:after="20"/>
+            </w:pPr>
+            <w:r>
+              <w:rPr>
+                <w:rFonts w:ascii="Calibri" w:hAnsi="Calibri"/>
+                <w:b w:val="0"/>
+                <w:i w:val="0"/>
+                <w:color w:val="000000"/>
+                <w:sz w:val="18"/>
+                <w:u w:val="none"/>
+              </w:rPr>
+              <w:t>3. Combine into a single fraction. Apply the difference of squares: (v+v₀)(v−v₀) = v² − v₀². Simplify:</w:t>
+            </w:r>
+          </w:p>
+          <w:p>
+            <w:pPr>
+              <w:spacing w:before="80" w:after="0"/>
+              <w:pBdr>
+                <w:bottom w:val="single" w:sz="4" w:space="1" w:color="999999"/>
+              </w:pBdr>
+            </w:pPr>
+            <w:r>
+              <w:rPr>
+                <w:rFonts w:ascii="Calibri" w:hAnsi="Calibri"/>
+                <w:b w:val="0"/>
+                <w:i w:val="0"/>
+                <w:color w:val="000000"/>
+                <w:sz w:val="26"/>
+                <w:u w:val="none"/>
+              </w:rPr>
+              <w:t xml:space="preserve"> </w:t>
+            </w:r>
+          </w:p>
+          <w:p>
+            <w:pPr>
+              <w:spacing w:before="40" w:after="0"/>
+              <w:pBdr>
+                <w:bottom w:val="single" w:sz="4" w:space="1" w:color="999999"/>
+              </w:pBdr>
+            </w:pPr>
+            <w:r>
+              <w:rPr>
+                <w:rFonts w:ascii="Calibri" w:hAnsi="Calibri"/>
+                <w:b w:val="0"/>
+                <w:i w:val="0"/>
+                <w:color w:val="000000"/>
+                <w:sz w:val="26"/>
+                <w:u w:val="none"/>
+              </w:rPr>
+              <w:t xml:space="preserve"> </w:t>
+            </w:r>
+          </w:p>
+          <w:p>
+            <w:pPr>
+              <w:spacing w:before="80" w:after="20"/>
+            </w:pPr>
+            <w:r>
+              <w:rPr>
+                <w:rFonts w:ascii="Calibri" w:hAnsi="Calibri"/>
+                <w:b w:val="0"/>
+                <w:i w:val="0"/>
+                <w:color w:val="000000"/>
+                <w:sz w:val="18"/>
+                <w:u w:val="none"/>
+              </w:rPr>
+              <w:t>4. Multiply both sides by 2a to clear the denominator, then add v₀² to both sides. Write the final equation:</w:t>
+            </w:r>
+          </w:p>
+          <w:p>
+            <w:pPr>
+              <w:spacing w:before="80" w:after="0"/>
+              <w:pBdr>
+                <w:bottom w:val="single" w:sz="4" w:space="1" w:color="999999"/>
+              </w:pBdr>
+            </w:pPr>
+            <w:r>
+              <w:rPr>
+                <w:rFonts w:ascii="Calibri" w:hAnsi="Calibri"/>
+                <w:b w:val="0"/>
+                <w:i w:val="0"/>
+                <w:color w:val="000000"/>
+                <w:sz w:val="26"/>
+                <w:u w:val="none"/>
+              </w:rPr>
+              <w:t xml:space="preserve"> </w:t>
+            </w:r>
+          </w:p>
+          <w:p>
+            <w:pPr>
+              <w:spacing w:before="40" w:after="0"/>
+              <w:pBdr>
+                <w:bottom w:val="single" w:sz="4" w:space="1" w:color="999999"/>
+              </w:pBdr>
+            </w:pPr>
+            <w:r>
+              <w:rPr>
+                <w:rFonts w:ascii="Calibri" w:hAnsi="Calibri"/>
+                <w:b w:val="0"/>
+                <w:i w:val="0"/>
+                <w:color w:val="000000"/>
+                <w:sz w:val="26"/>
+                <w:u w:val="none"/>
+              </w:rPr>
+              <w:t xml:space="preserve"> </w:t>
+            </w:r>
+          </w:p>
+        </w:tc>
+      </w:tr>
+    </w:tbl>
+    <w:p>
+      <w:pPr>
+        <w:sectPr>
+          <w:pgSz w:w="18720" w:h="12240" w:orient="landscape"/>
+          <w:pgMar w:top="432" w:right="432" w:bottom="432" w:left="432" w:header="720" w:footer="720" w:gutter="0"/>
+          <w:cols w:space="720"/>
+          <w:docGrid w:linePitch="360"/>
+        </w:sectPr>
+      </w:pPr>
+    </w:p>
+    <w:tbl>
+      <w:tblPr>
+        <w:tblW w:type="auto" w:w="0"/>
+        <w:jc w:val="center"/>
+        <w:tblLook w:firstColumn="1" w:firstRow="1" w:lastColumn="0" w:lastRow="0" w:noHBand="0" w:noVBand="1" w:val="04A0"/>
+        <w:tblLayout w:type="fixed"/>
+        <w:tblCellSpacing w:w="0" w:type="dxa"/>
+      </w:tblPr>
+      <w:tblGrid>
+        <w:gridCol w:w="4464"/>
+        <w:gridCol w:w="4464"/>
+        <w:gridCol w:w="4464"/>
+        <w:gridCol w:w="4464"/>
+      </w:tblGrid>
+      <w:tr>
+        <w:trPr>
+          <w:trHeight w:val="11376" w:hRule="exact"/>
+        </w:trPr>
+        <w:tc>
+          <w:tcPr>
+            <w:tcW w:type="dxa" w:w="7"/>
+            <w:tcW w:w="4464" w:type="dxa"/>
+            <w:tcMar>
+              <w:top w:w="40" w:type="dxa"/>
+              <w:bottom w:w="30" w:type="dxa"/>
+              <w:left w:w="60" w:type="dxa"/>
+              <w:right w:w="60" w:type="dxa"/>
+            </w:tcMar>
+            <w:vAlign w:val="top"/>
+            <w:tcBorders>
+              <w:top w:val="single" w:sz="10" w:space="0" w:color="000000"/>
+              <w:left w:val="single" w:sz="10" w:space="0" w:color="000000"/>
+              <w:bottom w:val="single" w:sz="10" w:space="0" w:color="000000"/>
+              <w:right w:val="dashed" w:sz="8" w:space="0" w:color="555555"/>
+            </w:tcBorders>
+          </w:tcPr>
+          <w:p>
+            <w:pPr>
+              <w:spacing w:after="0" w:before="0"/>
+            </w:pPr>
+            <w:r>
+              <w:rPr>
+                <w:rFonts w:ascii="Calibri" w:hAnsi="Calibri"/>
+                <w:b/>
+                <w:i w:val="0"/>
+                <w:color w:val="FF0000"/>
+                <w:sz w:val="16"/>
+                <w:u w:val="none"/>
+              </w:rPr>
+              <w:t>TEACHER’S ANSWER KEY</w:t>
+            </w:r>
+          </w:p>
+          <w:p>
+            <w:pPr>
+              <w:spacing w:before="40" w:after="0"/>
+            </w:pPr>
+            <w:r>
+              <w:rPr>
+                <w:rFonts w:ascii="Calibri" w:hAnsi="Calibri"/>
+                <w:b w:val="0"/>
+                <w:i w:val="0"/>
+                <w:color w:val="000000"/>
+                <w:sz w:val="16"/>
+                <w:u w:val="none"/>
+              </w:rPr>
+              <w:t xml:space="preserve"> </w:t>
+            </w:r>
+          </w:p>
+          <w:p>
+            <w:pPr>
+              <w:spacing w:before="80" w:after="40"/>
+              <w:jc w:val="center"/>
+              <w:pBdr>
+                <w:top w:val="single" w:sz="8" w:space="2" w:color="000000"/>
+                <w:left w:val="single" w:sz="8" w:space="2" w:color="000000"/>
+                <w:bottom w:val="single" w:sz="8" w:space="2" w:color="000000"/>
+                <w:right w:val="single" w:sz="8" w:space="2" w:color="000000"/>
+              </w:pBdr>
+              <w:shd w:val="clear" w:color="auto" w:fill="E8E8E8"/>
+            </w:pPr>
+            <w:r>
+              <w:rPr>
+                <w:rFonts w:ascii="Calibri" w:hAnsi="Calibri"/>
+                <w:b/>
+                <w:i w:val="0"/>
+                <w:color w:val="000000"/>
+                <w:sz w:val="18"/>
+                <w:u w:val="none"/>
+              </w:rPr>
+              <w:t xml:space="preserve">PART A: </w:t>
+            </w:r>
+            <w:r>
+              <w:rPr>
+                <w:rFonts w:ascii="Calibri" w:hAnsi="Calibri"/>
+                <w:b/>
+                <w:i w:val="0"/>
+                <w:color w:val="000000"/>
+                <w:sz w:val="18"/>
+                <w:u w:val="none"/>
+              </w:rPr>
+              <w:t>Deriving Kinematic Equation 1</w:t>
+            </w:r>
+          </w:p>
+          <w:p>
+            <w:pPr>
+              <w:spacing w:before="60" w:after="100"/>
+            </w:pPr>
+            <w:r>
+              <w:rPr>
+                <w:rFonts w:ascii="Calibri" w:hAnsi="Calibri"/>
+                <w:b/>
+                <w:i w:val="0"/>
+                <w:color w:val="000000"/>
+                <w:sz w:val="16"/>
+                <w:u w:val="none"/>
+              </w:rPr>
+              <w:t xml:space="preserve">GOAL:  </w:t>
+            </w:r>
+            <w:r>
+              <w:rPr>
+                <w:rFonts w:ascii="Calibri" w:hAnsi="Calibri"/>
+                <w:b w:val="0"/>
+                <w:i w:val="0"/>
+                <w:color w:val="000000"/>
+                <w:sz w:val="16"/>
+                <w:u w:val="none"/>
+              </w:rPr>
+              <w:t xml:space="preserve">Derive  </w:t>
+            </w:r>
+            <m:oMath>
+              <m:r>
+                <m:t>v</m:t>
+              </m:r>
+              <m:r>
+                <m:rPr>
+                  <m:sty m:val="p"/>
+                </m:rPr>
+                <m:t> = </m:t>
+              </m:r>
+              <m:sSub>
+                <m:e>
+                  <m:r>
+                    <m:t>v</m:t>
+                  </m:r>
+                </m:e>
+                <m:sub>
+                  <m:r>
+                    <m:rPr>
+                      <m:sty m:val="p"/>
+                    </m:rPr>
+                    <m:t>0</m:t>
+                  </m:r>
+                </m:sub>
+              </m:sSub>
+              <m:r>
+                <m:rPr>
+                  <m:sty m:val="p"/>
+                </m:rPr>
+                <m:t> + </m:t>
+              </m:r>
+              <m:r>
+                <m:t>at</m:t>
+              </m:r>
+            </m:oMath>
+          </w:p>
+          <w:p>
+            <w:pPr>
+              <w:spacing w:before="80" w:after="20"/>
+            </w:pPr>
+            <w:r>
+              <w:rPr>
+                <w:rFonts w:ascii="Calibri" w:hAnsi="Calibri"/>
+                <w:b w:val="0"/>
+                <w:i w:val="0"/>
+                <w:color w:val="000000"/>
+                <w:sz w:val="18"/>
+                <w:u w:val="none"/>
+              </w:rPr>
+              <w:t>1. Definition of acceleration:</w:t>
+            </w:r>
+          </w:p>
+          <w:p>
+            <w:pPr>
+              <w:spacing w:before="80" w:after="40"/>
+              <w:jc w:val="center"/>
+            </w:pPr>
+            <m:oMathPara>
+              <m:oMath>
+                <m:r>
+                  <w:rPr>
+                    <w:color w:val="FF0000"/>
+                  </w:rPr>
+                  <m:t>a</m:t>
+                </m:r>
+                <m:r>
+                  <m:rPr>
+                    <m:sty m:val="p"/>
+                  </m:rPr>
+                  <w:rPr>
+                    <w:color w:val="FF0000"/>
+                  </w:rPr>
+                  <m:t> = </m:t>
+                </m:r>
+                <m:f>
+                  <m:num>
+                    <m:r>
+                      <w:rPr>
+                        <w:color w:val="FF0000"/>
+                      </w:rPr>
+                      <m:t>Δv</m:t>
+                    </m:r>
+                  </m:num>
+                  <m:den>
+                    <m:r>
+                      <w:rPr>
+                        <w:color w:val="FF0000"/>
+                      </w:rPr>
+                      <m:t>Δt</m:t>
+                    </m:r>
+                  </m:den>
+                </m:f>
+              </m:oMath>
+            </m:oMathPara>
+          </w:p>
+          <w:p>
+            <w:pPr>
+              <w:spacing w:before="80" w:after="20"/>
+            </w:pPr>
+            <w:r>
+              <w:rPr>
+                <w:rFonts w:ascii="Calibri" w:hAnsi="Calibri"/>
+                <w:b w:val="0"/>
+                <w:i w:val="0"/>
+                <w:color w:val="000000"/>
+                <w:sz w:val="18"/>
+                <w:u w:val="none"/>
+              </w:rPr>
+              <w:t>2. Substitute Δv = v − v₀ and Δt = t:</w:t>
+            </w:r>
+          </w:p>
+          <w:p>
+            <w:pPr>
+              <w:spacing w:before="80" w:after="40"/>
+              <w:jc w:val="center"/>
+            </w:pPr>
+            <m:oMathPara>
+              <m:oMath>
+                <m:r>
+                  <w:rPr>
+                    <w:color w:val="FF0000"/>
+                  </w:rPr>
+                  <m:t>a</m:t>
+                </m:r>
+                <m:r>
+                  <m:rPr>
+                    <m:sty m:val="p"/>
+                  </m:rPr>
+                  <w:rPr>
+                    <w:color w:val="FF0000"/>
+                  </w:rPr>
+                  <m:t> = </m:t>
+                </m:r>
+                <m:f>
+                  <m:num>
+                    <m:r>
+                      <w:rPr>
+                        <w:color w:val="FF0000"/>
+                      </w:rPr>
+                      <m:t>v</m:t>
+                    </m:r>
+                    <m:r>
+                      <m:rPr>
+                        <m:sty m:val="p"/>
+                      </m:rPr>
+                      <w:rPr>
+                        <w:color w:val="FF0000"/>
+                      </w:rPr>
+                      <m:t> − </m:t>
+                    </m:r>
+                    <m:sSub>
+                      <m:e>
+                        <m:r>
+                          <w:rPr>
+                            <w:color w:val="FF0000"/>
+                          </w:rPr>
+                          <m:t>v</m:t>
+                        </m:r>
+                      </m:e>
+                      <m:sub>
+                        <m:r>
+                          <m:rPr>
+                            <m:sty m:val="p"/>
+                          </m:rPr>
+                          <w:rPr>
+                            <w:color w:val="FF0000"/>
+                          </w:rPr>
+                          <m:t>0</m:t>
+                        </m:r>
+                      </m:sub>
+                    </m:sSub>
+                  </m:num>
+                  <m:den>
+                    <m:r>
+                      <w:rPr>
+                        <w:color w:val="FF0000"/>
+                      </w:rPr>
+                      <m:t>t</m:t>
+                    </m:r>
+                  </m:den>
+                </m:f>
+              </m:oMath>
+            </m:oMathPara>
+          </w:p>
+          <w:p>
+            <w:pPr>
+              <w:spacing w:before="80" w:after="20"/>
+            </w:pPr>
+            <w:r>
+              <w:rPr>
+                <w:rFonts w:ascii="Calibri" w:hAnsi="Calibri"/>
+                <w:b w:val="0"/>
+                <w:i w:val="0"/>
+                <w:color w:val="000000"/>
+                <w:sz w:val="18"/>
+                <w:u w:val="none"/>
+              </w:rPr>
+              <w:t>3. Multiply both sides by t:</w:t>
+            </w:r>
+          </w:p>
+          <w:p>
+            <w:pPr>
+              <w:spacing w:before="80" w:after="40"/>
+              <w:jc w:val="center"/>
+            </w:pPr>
+            <m:oMathPara>
+              <m:oMath>
+                <m:r>
+                  <w:rPr>
+                    <w:color w:val="FF0000"/>
+                  </w:rPr>
+                  <m:t>at</m:t>
+                </m:r>
+                <m:r>
+                  <m:rPr>
+                    <m:sty m:val="p"/>
+                  </m:rPr>
+                  <w:rPr>
+                    <w:color w:val="FF0000"/>
+                  </w:rPr>
+                  <m:t> = </m:t>
+                </m:r>
+                <m:r>
+                  <w:rPr>
+                    <w:color w:val="FF0000"/>
+                  </w:rPr>
+                  <m:t>v</m:t>
+                </m:r>
+                <m:r>
+                  <m:rPr>
+                    <m:sty m:val="p"/>
+                  </m:rPr>
+                  <w:rPr>
+                    <w:color w:val="FF0000"/>
+                  </w:rPr>
+                  <m:t> − </m:t>
+                </m:r>
+                <m:sSub>
+                  <m:e>
+                    <m:r>
+                      <w:rPr>
+                        <w:color w:val="FF0000"/>
+                      </w:rPr>
+                      <m:t>v</m:t>
+                    </m:r>
+                  </m:e>
+                  <m:sub>
+                    <m:r>
+                      <m:rPr>
+                        <m:sty m:val="p"/>
+                      </m:rPr>
+                      <w:rPr>
+                        <w:color w:val="FF0000"/>
+                      </w:rPr>
+                      <m:t>0</m:t>
+                    </m:r>
+                  </m:sub>
+                </m:sSub>
+              </m:oMath>
+            </m:oMathPara>
+          </w:p>
+          <w:p>
+            <w:pPr>
+              <w:spacing w:before="80" w:after="20"/>
+            </w:pPr>
+            <w:r>
+              <w:rPr>
+                <w:rFonts w:ascii="Calibri" w:hAnsi="Calibri"/>
+                <w:b w:val="0"/>
+                <w:i w:val="0"/>
+                <w:color w:val="000000"/>
+                <w:sz w:val="18"/>
+                <w:u w:val="none"/>
+              </w:rPr>
+              <w:t>4. Add v₀ to both sides:</w:t>
+            </w:r>
+          </w:p>
+          <w:p>
+            <w:pPr>
+              <w:spacing w:before="80" w:after="40"/>
+              <w:jc w:val="center"/>
+            </w:pPr>
+            <m:oMathPara>
+              <m:oMath>
+                <m:r>
+                  <w:rPr>
+                    <w:color w:val="FF0000"/>
+                  </w:rPr>
+                  <m:t>v</m:t>
+                </m:r>
+                <m:r>
+                  <m:rPr>
+                    <m:sty m:val="p"/>
+                  </m:rPr>
+                  <w:rPr>
+                    <w:color w:val="FF0000"/>
+                  </w:rPr>
+                  <m:t> = </m:t>
+                </m:r>
+                <m:sSub>
+                  <m:e>
+                    <m:r>
+                      <w:rPr>
+                        <w:color w:val="FF0000"/>
+                      </w:rPr>
+                      <m:t>v</m:t>
+                    </m:r>
+                  </m:e>
+                  <m:sub>
+                    <m:r>
+                      <m:rPr>
+                        <m:sty m:val="p"/>
+                      </m:rPr>
+                      <w:rPr>
+                        <w:color w:val="FF0000"/>
+                      </w:rPr>
+                      <m:t>0</m:t>
+                    </m:r>
+                  </m:sub>
+                </m:sSub>
+                <m:r>
+                  <m:rPr>
+                    <m:sty m:val="p"/>
+                  </m:rPr>
+                  <w:rPr>
+                    <w:color w:val="FF0000"/>
+                  </w:rPr>
+                  <m:t> + </m:t>
+                </m:r>
+                <m:r>
+                  <w:rPr>
+                    <w:color w:val="FF0000"/>
+                  </w:rPr>
+                  <m:t>at</m:t>
+                </m:r>
+              </m:oMath>
+            </m:oMathPara>
+          </w:p>
+        </w:tc>
+        <w:tc>
+          <w:tcPr>
+            <w:tcW w:type="dxa" w:w="7"/>
+            <w:tcW w:w="4464" w:type="dxa"/>
+            <w:tcMar>
+              <w:top w:w="40" w:type="dxa"/>
+              <w:bottom w:w="30" w:type="dxa"/>
+              <w:left w:w="60" w:type="dxa"/>
+              <w:right w:w="60" w:type="dxa"/>
+            </w:tcMar>
+            <w:vAlign w:val="top"/>
+            <w:tcBorders>
+              <w:top w:val="single" w:sz="10" w:space="0" w:color="000000"/>
+              <w:left w:val="single" w:sz="10" w:space="0" w:color="000000"/>
+              <w:bottom w:val="single" w:sz="10" w:space="0" w:color="000000"/>
+              <w:right w:val="dashed" w:sz="8" w:space="0" w:color="555555"/>
+            </w:tcBorders>
+          </w:tcPr>
+          <w:p>
+            <w:pPr>
+              <w:spacing w:after="0" w:before="0"/>
+            </w:pPr>
+            <w:r>
+              <w:rPr>
+                <w:rFonts w:ascii="Calibri" w:hAnsi="Calibri"/>
+                <w:b/>
+                <w:i w:val="0"/>
+                <w:color w:val="FF0000"/>
+                <w:sz w:val="16"/>
+                <w:u w:val="none"/>
+              </w:rPr>
+              <w:t>TEACHER’S ANSWER KEY</w:t>
+            </w:r>
+          </w:p>
+          <w:p>
+            <w:pPr>
+              <w:spacing w:before="40" w:after="0"/>
+            </w:pPr>
+            <w:r>
+              <w:rPr>
+                <w:rFonts w:ascii="Calibri" w:hAnsi="Calibri"/>
+                <w:b w:val="0"/>
+                <w:i w:val="0"/>
+                <w:color w:val="000000"/>
+                <w:sz w:val="16"/>
+                <w:u w:val="none"/>
+              </w:rPr>
+              <w:t xml:space="preserve"> </w:t>
+            </w:r>
+          </w:p>
+          <w:p>
+            <w:pPr>
+              <w:spacing w:before="80" w:after="40"/>
+              <w:jc w:val="center"/>
+              <w:pBdr>
+                <w:top w:val="single" w:sz="8" w:space="2" w:color="000000"/>
+                <w:left w:val="single" w:sz="8" w:space="2" w:color="000000"/>
+                <w:bottom w:val="single" w:sz="8" w:space="2" w:color="000000"/>
+                <w:right w:val="single" w:sz="8" w:space="2" w:color="000000"/>
+              </w:pBdr>
+              <w:shd w:val="clear" w:color="auto" w:fill="E8E8E8"/>
+            </w:pPr>
+            <w:r>
+              <w:rPr>
+                <w:rFonts w:ascii="Calibri" w:hAnsi="Calibri"/>
+                <w:b/>
+                <w:i w:val="0"/>
+                <w:color w:val="000000"/>
+                <w:sz w:val="18"/>
+                <w:u w:val="none"/>
+              </w:rPr>
+              <w:t xml:space="preserve">PART B: </w:t>
+            </w:r>
+            <w:r>
+              <w:rPr>
+                <w:rFonts w:ascii="Calibri" w:hAnsi="Calibri"/>
+                <w:b/>
+                <w:i w:val="0"/>
+                <w:color w:val="000000"/>
+                <w:sz w:val="18"/>
+                <w:u w:val="none"/>
+              </w:rPr>
+              <w:t>Deriving Kinematic Equation 4</w:t>
+            </w:r>
+          </w:p>
+          <w:p>
+            <w:pPr>
+              <w:spacing w:before="60" w:after="100"/>
+            </w:pPr>
+            <w:r>
+              <w:rPr>
+                <w:rFonts w:ascii="Calibri" w:hAnsi="Calibri"/>
+                <w:b/>
+                <w:i w:val="0"/>
+                <w:color w:val="000000"/>
+                <w:sz w:val="16"/>
+                <w:u w:val="none"/>
+              </w:rPr>
+              <w:t xml:space="preserve">GOAL:  </w:t>
+            </w:r>
+            <w:r>
+              <w:rPr>
+                <w:rFonts w:ascii="Calibri" w:hAnsi="Calibri"/>
+                <w:b w:val="0"/>
+                <w:i w:val="0"/>
+                <w:color w:val="000000"/>
+                <w:sz w:val="16"/>
+                <w:u w:val="none"/>
+              </w:rPr>
+              <w:t xml:space="preserve">Derive  </w:t>
+            </w:r>
+            <m:oMath>
+              <m:r>
+                <m:t>x</m:t>
+              </m:r>
+              <m:r>
+                <m:rPr>
+                  <m:sty m:val="p"/>
+                </m:rPr>
+                <m:t> = </m:t>
+              </m:r>
+              <m:sSub>
+                <m:e>
+                  <m:r>
+                    <m:t>x</m:t>
+                  </m:r>
+                </m:e>
+                <m:sub>
+                  <m:r>
+                    <m:rPr>
+                      <m:sty m:val="p"/>
+                    </m:rPr>
+                    <m:t>0</m:t>
+                  </m:r>
+                </m:sub>
+              </m:sSub>
+              <m:r>
+                <m:rPr>
+                  <m:sty m:val="p"/>
+                </m:rPr>
+                <m:t> + </m:t>
+              </m:r>
+              <m:f>
+                <m:num>
+                  <m:r>
+                    <m:rPr>
+                      <m:sty m:val="p"/>
+                    </m:rPr>
+                    <m:t>1</m:t>
+                  </m:r>
+                </m:num>
+                <m:den>
+                  <m:r>
+                    <m:rPr>
+                      <m:sty m:val="p"/>
+                    </m:rPr>
+                    <m:t>2</m:t>
+                  </m:r>
+                </m:den>
+              </m:f>
+              <m:d>
+                <m:e>
+                  <m:sSub>
+                    <m:e>
+                      <m:r>
+                        <m:t>v</m:t>
+                      </m:r>
+                    </m:e>
+                    <m:sub>
+                      <m:r>
+                        <m:rPr>
+                          <m:sty m:val="p"/>
+                        </m:rPr>
+                        <m:t>0</m:t>
+                      </m:r>
+                    </m:sub>
+                  </m:sSub>
+                  <m:r>
+                    <m:rPr>
+                      <m:sty m:val="p"/>
+                    </m:rPr>
+                    <m:t> + </m:t>
+                  </m:r>
+                  <m:r>
+                    <m:t>v</m:t>
+                  </m:r>
+                </m:e>
+              </m:d>
+              <m:r>
+                <m:t>t</m:t>
+              </m:r>
+            </m:oMath>
+          </w:p>
+          <w:p>
+            <w:pPr>
+              <w:spacing w:before="80" w:after="20"/>
+            </w:pPr>
+            <w:r>
+              <w:rPr>
+                <w:rFonts w:ascii="Calibri" w:hAnsi="Calibri"/>
+                <w:b w:val="0"/>
+                <w:i w:val="0"/>
+                <w:color w:val="000000"/>
+                <w:sz w:val="18"/>
+                <w:u w:val="none"/>
+              </w:rPr>
+              <w:t>1. Definition of average velocity:</w:t>
+            </w:r>
+          </w:p>
+          <w:p>
+            <w:pPr>
+              <w:spacing w:before="80" w:after="40"/>
+              <w:jc w:val="center"/>
+            </w:pPr>
+            <m:oMathPara>
+              <m:oMath>
+                <m:sSub>
+                  <m:e>
+                    <m:r>
+                      <w:rPr>
+                        <w:color w:val="FF0000"/>
+                      </w:rPr>
+                      <m:t>v</m:t>
+                    </m:r>
+                  </m:e>
+                  <m:sub>
+                    <m:r>
+                      <m:rPr>
+                        <m:sty m:val="p"/>
+                      </m:rPr>
+                      <w:rPr>
+                        <w:color w:val="FF0000"/>
+                      </w:rPr>
+                      <m:t>avg</m:t>
+                    </m:r>
+                  </m:sub>
+                </m:sSub>
+                <m:r>
+                  <m:rPr>
+                    <m:sty m:val="p"/>
+                  </m:rPr>
+                  <w:rPr>
+                    <w:color w:val="FF0000"/>
+                  </w:rPr>
+                  <m:t> = </m:t>
+                </m:r>
+                <m:f>
+                  <m:num>
+                    <m:r>
+                      <w:rPr>
+                        <w:color w:val="FF0000"/>
+                      </w:rPr>
+                      <m:t>x</m:t>
+                    </m:r>
+                    <m:r>
+                      <m:rPr>
+                        <m:sty m:val="p"/>
+                      </m:rPr>
+                      <w:rPr>
+                        <w:color w:val="FF0000"/>
+                      </w:rPr>
+                      <m:t> − </m:t>
+                    </m:r>
+                    <m:sSub>
+                      <m:e>
+                        <m:r>
+                          <w:rPr>
+                            <w:color w:val="FF0000"/>
+                          </w:rPr>
+                          <m:t>x</m:t>
+                        </m:r>
+                      </m:e>
+                      <m:sub>
+                        <m:r>
+                          <m:rPr>
+                            <m:sty m:val="p"/>
+                          </m:rPr>
+                          <w:rPr>
+                            <w:color w:val="FF0000"/>
+                          </w:rPr>
+                          <m:t>0</m:t>
+                        </m:r>
+                      </m:sub>
+                    </m:sSub>
+                  </m:num>
+                  <m:den>
+                    <m:r>
+                      <w:rPr>
+                        <w:color w:val="FF0000"/>
+                      </w:rPr>
+                      <m:t>t</m:t>
+                    </m:r>
+                  </m:den>
+                </m:f>
+              </m:oMath>
+            </m:oMathPara>
+          </w:p>
+          <w:p>
+            <w:pPr>
+              <w:spacing w:before="80" w:after="20"/>
+            </w:pPr>
+            <w:r>
+              <w:rPr>
+                <w:rFonts w:ascii="Calibri" w:hAnsi="Calibri"/>
+                <w:b w:val="0"/>
+                <w:i w:val="0"/>
+                <w:color w:val="000000"/>
+                <w:sz w:val="18"/>
+                <w:u w:val="none"/>
+              </w:rPr>
+              <w:t>2. Multiply by t, isolate x:</w:t>
+            </w:r>
+          </w:p>
+          <w:p>
+            <w:pPr>
+              <w:spacing w:before="80" w:after="40"/>
+              <w:jc w:val="center"/>
+            </w:pPr>
+            <m:oMathPara>
+              <m:oMath>
+                <m:r>
+                  <w:rPr>
+                    <w:color w:val="FF0000"/>
+                  </w:rPr>
+                  <m:t>x</m:t>
+                </m:r>
+                <m:r>
+                  <m:rPr>
+                    <m:sty m:val="p"/>
+                  </m:rPr>
+                  <w:rPr>
+                    <w:color w:val="FF0000"/>
+                  </w:rPr>
+                  <m:t> = </m:t>
+                </m:r>
+                <m:sSub>
+                  <m:e>
+                    <m:r>
+                      <w:rPr>
+                        <w:color w:val="FF0000"/>
+                      </w:rPr>
+                      <m:t>x</m:t>
+                    </m:r>
+                  </m:e>
+                  <m:sub>
+                    <m:r>
+                      <m:rPr>
+                        <m:sty m:val="p"/>
+                      </m:rPr>
+                      <w:rPr>
+                        <w:color w:val="FF0000"/>
+                      </w:rPr>
+                      <m:t>0</m:t>
+                    </m:r>
+                  </m:sub>
+                </m:sSub>
+                <m:r>
+                  <m:rPr>
+                    <m:sty m:val="p"/>
+                  </m:rPr>
+                  <w:rPr>
+                    <w:color w:val="FF0000"/>
+                  </w:rPr>
+                  <m:t> + </m:t>
+                </m:r>
+                <m:sSub>
+                  <m:e>
+                    <m:r>
+                      <w:rPr>
+                        <w:color w:val="FF0000"/>
+                      </w:rPr>
+                      <m:t>v</m:t>
+                    </m:r>
+                  </m:e>
+                  <m:sub>
+                    <m:r>
+                      <m:rPr>
+                        <m:sty m:val="p"/>
+                      </m:rPr>
+                      <w:rPr>
+                        <w:color w:val="FF0000"/>
+                      </w:rPr>
+                      <m:t>avg</m:t>
+                    </m:r>
+                  </m:sub>
+                </m:sSub>
+                <m:r>
+                  <m:rPr>
+                    <m:sty m:val="p"/>
+                  </m:rPr>
+                  <w:rPr>
+                    <w:color w:val="FF0000"/>
+                  </w:rPr>
+                  <m:t> · </m:t>
+                </m:r>
+                <m:r>
+                  <w:rPr>
+                    <w:color w:val="FF0000"/>
+                  </w:rPr>
+                  <m:t>t</m:t>
+                </m:r>
+              </m:oMath>
+            </m:oMathPara>
+          </w:p>
+          <w:p>
+            <w:pPr>
+              <w:spacing w:before="80" w:after="20"/>
+            </w:pPr>
+            <w:r>
+              <w:rPr>
+                <w:rFonts w:ascii="Calibri" w:hAnsi="Calibri"/>
+                <w:b w:val="0"/>
+                <w:i w:val="0"/>
+                <w:color w:val="000000"/>
+                <w:sz w:val="18"/>
+                <w:u w:val="none"/>
+              </w:rPr>
+              <w:t>3. Average velocity as mean of endpoints:</w:t>
+            </w:r>
+          </w:p>
+          <w:p>
+            <w:pPr>
+              <w:spacing w:before="80" w:after="40"/>
+              <w:jc w:val="center"/>
+            </w:pPr>
+            <m:oMathPara>
+              <m:oMath>
+                <m:sSub>
+                  <m:e>
+                    <m:r>
+                      <w:rPr>
+                        <w:color w:val="FF0000"/>
+                      </w:rPr>
+                      <m:t>v</m:t>
+                    </m:r>
+                  </m:e>
+                  <m:sub>
+                    <m:r>
+                      <m:rPr>
+                        <m:sty m:val="p"/>
+                      </m:rPr>
+                      <w:rPr>
+                        <w:color w:val="FF0000"/>
+                      </w:rPr>
+                      <m:t>avg</m:t>
+                    </m:r>
+                  </m:sub>
+                </m:sSub>
+                <m:r>
+                  <m:rPr>
+                    <m:sty m:val="p"/>
+                  </m:rPr>
+                  <w:rPr>
+                    <w:color w:val="FF0000"/>
+                  </w:rPr>
+                  <m:t> = </m:t>
+                </m:r>
+                <m:f>
+                  <m:num>
+                    <m:sSub>
+                      <m:e>
+                        <m:r>
+                          <w:rPr>
+                            <w:color w:val="FF0000"/>
+                          </w:rPr>
+                          <m:t>v</m:t>
+                        </m:r>
+                      </m:e>
+                      <m:sub>
+                        <m:r>
+                          <m:rPr>
+                            <m:sty m:val="p"/>
+                          </m:rPr>
+                          <w:rPr>
+                            <w:color w:val="FF0000"/>
+                          </w:rPr>
+                          <m:t>0</m:t>
+                        </m:r>
+                      </m:sub>
+                    </m:sSub>
+                    <m:r>
+                      <m:rPr>
+                        <m:sty m:val="p"/>
+                      </m:rPr>
+                      <w:rPr>
+                        <w:color w:val="FF0000"/>
+                      </w:rPr>
+                      <m:t> + </m:t>
+                    </m:r>
+                    <m:r>
+                      <w:rPr>
+                        <w:color w:val="FF0000"/>
+                      </w:rPr>
+                      <m:t>v</m:t>
+                    </m:r>
+                  </m:num>
+                  <m:den>
+                    <m:r>
+                      <m:rPr>
+                        <m:sty m:val="p"/>
+                      </m:rPr>
+                      <w:rPr>
+                        <w:color w:val="FF0000"/>
+                      </w:rPr>
+                      <m:t>2</m:t>
+                    </m:r>
+                  </m:den>
+                </m:f>
+              </m:oMath>
+            </m:oMathPara>
+          </w:p>
+          <w:p>
+            <w:pPr>
+              <w:spacing w:before="80" w:after="20"/>
+            </w:pPr>
+            <w:r>
+              <w:rPr>
+                <w:rFonts w:ascii="Calibri" w:hAnsi="Calibri"/>
+                <w:b w:val="0"/>
+                <w:i w:val="0"/>
+                <w:color w:val="000000"/>
+                <w:sz w:val="18"/>
+                <w:u w:val="none"/>
+              </w:rPr>
+              <w:t>4. Substitute into position equation:</w:t>
+            </w:r>
+          </w:p>
+          <w:p>
+            <w:pPr>
+              <w:spacing w:before="80" w:after="40"/>
+              <w:jc w:val="center"/>
+            </w:pPr>
+            <m:oMathPara>
+              <m:oMath>
+                <m:r>
+                  <w:rPr>
+                    <w:color w:val="FF0000"/>
+                  </w:rPr>
+                  <m:t>x</m:t>
+                </m:r>
+                <m:r>
+                  <m:rPr>
+                    <m:sty m:val="p"/>
+                  </m:rPr>
+                  <w:rPr>
+                    <w:color w:val="FF0000"/>
+                  </w:rPr>
+                  <m:t> = </m:t>
+                </m:r>
+                <m:sSub>
+                  <m:e>
+                    <m:r>
+                      <w:rPr>
+                        <w:color w:val="FF0000"/>
+                      </w:rPr>
+                      <m:t>x</m:t>
+                    </m:r>
+                  </m:e>
+                  <m:sub>
+                    <m:r>
+                      <m:rPr>
+                        <m:sty m:val="p"/>
+                      </m:rPr>
+                      <w:rPr>
+                        <w:color w:val="FF0000"/>
+                      </w:rPr>
+                      <m:t>0</m:t>
+                    </m:r>
+                  </m:sub>
+                </m:sSub>
+                <m:r>
+                  <m:rPr>
+                    <m:sty m:val="p"/>
+                  </m:rPr>
+                  <w:rPr>
+                    <w:color w:val="FF0000"/>
+                  </w:rPr>
+                  <m:t> + </m:t>
+                </m:r>
+                <m:f>
+                  <m:num>
+                    <m:r>
+                      <m:rPr>
+                        <m:sty m:val="p"/>
+                      </m:rPr>
+                      <w:rPr>
+                        <w:color w:val="FF0000"/>
+                      </w:rPr>
+                      <m:t>1</m:t>
+                    </m:r>
+                  </m:num>
+                  <m:den>
+                    <m:r>
+                      <m:rPr>
+                        <m:sty m:val="p"/>
+                      </m:rPr>
+                      <w:rPr>
+                        <w:color w:val="FF0000"/>
+                      </w:rPr>
+                      <m:t>2</m:t>
+                    </m:r>
+                  </m:den>
+                </m:f>
+                <m:d>
+                  <m:e>
+                    <m:sSub>
+                      <m:e>
+                        <m:r>
+                          <w:rPr>
+                            <w:color w:val="FF0000"/>
+                          </w:rPr>
+                          <m:t>v</m:t>
+                        </m:r>
+                      </m:e>
+                      <m:sub>
+                        <m:r>
+                          <m:rPr>
+                            <m:sty m:val="p"/>
+                          </m:rPr>
+                          <w:rPr>
+                            <w:color w:val="FF0000"/>
+                          </w:rPr>
+                          <m:t>0</m:t>
+                        </m:r>
+                      </m:sub>
+                    </m:sSub>
+                    <m:r>
+                      <m:rPr>
+                        <m:sty m:val="p"/>
+                      </m:rPr>
+                      <w:rPr>
+                        <w:color w:val="FF0000"/>
+                      </w:rPr>
+                      <m:t> + </m:t>
+                    </m:r>
+                    <m:r>
+                      <w:rPr>
+                        <w:color w:val="FF0000"/>
+                      </w:rPr>
+                      <m:t>v</m:t>
+                    </m:r>
+                  </m:e>
+                </m:d>
+                <m:r>
+                  <w:rPr>
+                    <w:color w:val="FF0000"/>
+                  </w:rPr>
+                  <m:t>t</m:t>
+                </m:r>
+              </m:oMath>
+            </m:oMathPara>
+          </w:p>
+        </w:tc>
+        <w:tc>
+          <w:tcPr>
+            <w:tcW w:type="dxa" w:w="7"/>
+            <w:tcW w:w="4464" w:type="dxa"/>
+            <w:tcMar>
+              <w:top w:w="40" w:type="dxa"/>
+              <w:bottom w:w="30" w:type="dxa"/>
+              <w:left w:w="60" w:type="dxa"/>
+              <w:right w:w="60" w:type="dxa"/>
+            </w:tcMar>
+            <w:vAlign w:val="top"/>
+            <w:tcBorders>
+              <w:top w:val="single" w:sz="10" w:space="0" w:color="000000"/>
+              <w:left w:val="single" w:sz="10" w:space="0" w:color="000000"/>
+              <w:bottom w:val="single" w:sz="10" w:space="0" w:color="000000"/>
+              <w:right w:val="dashed" w:sz="8" w:space="0" w:color="555555"/>
+            </w:tcBorders>
+          </w:tcPr>
+          <w:p>
+            <w:pPr>
+              <w:spacing w:after="0" w:before="0"/>
+            </w:pPr>
+            <w:r>
+              <w:rPr>
+                <w:rFonts w:ascii="Calibri" w:hAnsi="Calibri"/>
+                <w:b/>
+                <w:i w:val="0"/>
+                <w:color w:val="FF0000"/>
+                <w:sz w:val="16"/>
+                <w:u w:val="none"/>
+              </w:rPr>
+              <w:t>TEACHER’S ANSWER KEY</w:t>
+            </w:r>
+          </w:p>
+          <w:p>
+            <w:pPr>
+              <w:spacing w:before="40" w:after="0"/>
+            </w:pPr>
+            <w:r>
+              <w:rPr>
+                <w:rFonts w:ascii="Calibri" w:hAnsi="Calibri"/>
+                <w:b w:val="0"/>
+                <w:i w:val="0"/>
+                <w:color w:val="000000"/>
+                <w:sz w:val="16"/>
+                <w:u w:val="none"/>
+              </w:rPr>
+              <w:t xml:space="preserve"> </w:t>
+            </w:r>
+          </w:p>
+          <w:p>
+            <w:pPr>
+              <w:spacing w:before="80" w:after="40"/>
+              <w:jc w:val="center"/>
+              <w:pBdr>
+                <w:top w:val="single" w:sz="8" w:space="2" w:color="000000"/>
+                <w:left w:val="single" w:sz="8" w:space="2" w:color="000000"/>
+                <w:bottom w:val="single" w:sz="8" w:space="2" w:color="000000"/>
+                <w:right w:val="single" w:sz="8" w:space="2" w:color="000000"/>
+              </w:pBdr>
+              <w:shd w:val="clear" w:color="auto" w:fill="E8E8E8"/>
+            </w:pPr>
+            <w:r>
+              <w:rPr>
+                <w:rFonts w:ascii="Calibri" w:hAnsi="Calibri"/>
+                <w:b/>
+                <w:i w:val="0"/>
+                <w:color w:val="000000"/>
+                <w:sz w:val="18"/>
+                <w:u w:val="none"/>
+              </w:rPr>
+              <w:t xml:space="preserve">PART C: </w:t>
+            </w:r>
+            <w:r>
+              <w:rPr>
+                <w:rFonts w:ascii="Calibri" w:hAnsi="Calibri"/>
+                <w:b/>
+                <w:i w:val="0"/>
+                <w:color w:val="000000"/>
+                <w:sz w:val="18"/>
+                <w:u w:val="none"/>
+              </w:rPr>
+              <w:t>Deriving Kinematic Equation 2</w:t>
+            </w:r>
+          </w:p>
+          <w:p>
+            <w:pPr>
+              <w:spacing w:before="60" w:after="100"/>
+            </w:pPr>
+            <w:r>
+              <w:rPr>
+                <w:rFonts w:ascii="Calibri" w:hAnsi="Calibri"/>
+                <w:b/>
+                <w:i w:val="0"/>
+                <w:color w:val="000000"/>
+                <w:sz w:val="16"/>
+                <w:u w:val="none"/>
+              </w:rPr>
+              <w:t xml:space="preserve">GOAL:  </w:t>
+            </w:r>
+            <w:r>
+              <w:rPr>
+                <w:rFonts w:ascii="Calibri" w:hAnsi="Calibri"/>
+                <w:b w:val="0"/>
+                <w:i w:val="0"/>
+                <w:color w:val="000000"/>
+                <w:sz w:val="16"/>
+                <w:u w:val="none"/>
+              </w:rPr>
+              <w:t xml:space="preserve">Derive  </w:t>
             </w:r>
             <m:oMath>
               <m:r>
@@ -1212,6 +3074,513 @@
               </m:sSup>
             </m:oMath>
           </w:p>
+          <w:p>
+            <w:pPr>
+              <w:spacing w:before="80" w:after="20"/>
+            </w:pPr>
+            <w:r>
+              <w:rPr>
+                <w:rFonts w:ascii="Calibri" w:hAnsi="Calibri"/>
+                <w:b w:val="0"/>
+                <w:i w:val="0"/>
+                <w:color w:val="000000"/>
+                <w:sz w:val="18"/>
+                <w:u w:val="none"/>
+              </w:rPr>
+              <w:t>1. Source equations: Eq 1 &amp; Eq 4 (given).</w:t>
+            </w:r>
+          </w:p>
+          <w:p>
+            <w:pPr>
+              <w:spacing w:before="80" w:after="20"/>
+            </w:pPr>
+            <w:r>
+              <w:rPr>
+                <w:rFonts w:ascii="Calibri" w:hAnsi="Calibri"/>
+                <w:b w:val="0"/>
+                <w:i w:val="0"/>
+                <w:color w:val="000000"/>
+                <w:sz w:val="18"/>
+                <w:u w:val="none"/>
+              </w:rPr>
+              <w:t>2. Substitute Eq 1 into Eq 4:</w:t>
+            </w:r>
+          </w:p>
+          <w:p>
+            <w:pPr>
+              <w:spacing w:before="80" w:after="40"/>
+              <w:jc w:val="center"/>
+            </w:pPr>
+            <m:oMathPara>
+              <m:oMath>
+                <m:r>
+                  <w:rPr>
+                    <w:color w:val="FF0000"/>
+                  </w:rPr>
+                  <m:t>x</m:t>
+                </m:r>
+                <m:r>
+                  <m:rPr>
+                    <m:sty m:val="p"/>
+                  </m:rPr>
+                  <w:rPr>
+                    <w:color w:val="FF0000"/>
+                  </w:rPr>
+                  <m:t> = </m:t>
+                </m:r>
+                <m:sSub>
+                  <m:e>
+                    <m:r>
+                      <w:rPr>
+                        <w:color w:val="FF0000"/>
+                      </w:rPr>
+                      <m:t>x</m:t>
+                    </m:r>
+                  </m:e>
+                  <m:sub>
+                    <m:r>
+                      <m:rPr>
+                        <m:sty m:val="p"/>
+                      </m:rPr>
+                      <w:rPr>
+                        <w:color w:val="FF0000"/>
+                      </w:rPr>
+                      <m:t>0</m:t>
+                    </m:r>
+                  </m:sub>
+                </m:sSub>
+                <m:r>
+                  <m:rPr>
+                    <m:sty m:val="p"/>
+                  </m:rPr>
+                  <w:rPr>
+                    <w:color w:val="FF0000"/>
+                  </w:rPr>
+                  <m:t> + </m:t>
+                </m:r>
+                <m:f>
+                  <m:num>
+                    <m:r>
+                      <m:rPr>
+                        <m:sty m:val="p"/>
+                      </m:rPr>
+                      <w:rPr>
+                        <w:color w:val="FF0000"/>
+                      </w:rPr>
+                      <m:t>1</m:t>
+                    </m:r>
+                  </m:num>
+                  <m:den>
+                    <m:r>
+                      <m:rPr>
+                        <m:sty m:val="p"/>
+                      </m:rPr>
+                      <w:rPr>
+                        <w:color w:val="FF0000"/>
+                      </w:rPr>
+                      <m:t>2</m:t>
+                    </m:r>
+                  </m:den>
+                </m:f>
+                <m:d>
+                  <m:dPr>
+                    <m:begChr m:val="["/>
+                    <m:endChr m:val="]"/>
+                  </m:dPr>
+                  <m:e>
+                    <m:sSub>
+                      <m:e>
+                        <m:r>
+                          <w:rPr>
+                            <w:color w:val="FF0000"/>
+                          </w:rPr>
+                          <m:t>v</m:t>
+                        </m:r>
+                      </m:e>
+                      <m:sub>
+                        <m:r>
+                          <m:rPr>
+                            <m:sty m:val="p"/>
+                          </m:rPr>
+                          <w:rPr>
+                            <w:color w:val="FF0000"/>
+                          </w:rPr>
+                          <m:t>0</m:t>
+                        </m:r>
+                      </m:sub>
+                    </m:sSub>
+                    <m:r>
+                      <m:rPr>
+                        <m:sty m:val="p"/>
+                      </m:rPr>
+                      <w:rPr>
+                        <w:color w:val="FF0000"/>
+                      </w:rPr>
+                      <m:t> + </m:t>
+                    </m:r>
+                    <m:d>
+                      <m:e>
+                        <m:sSub>
+                          <m:e>
+                            <m:r>
+                              <w:rPr>
+                                <w:color w:val="FF0000"/>
+                              </w:rPr>
+                              <m:t>v</m:t>
+                            </m:r>
+                          </m:e>
+                          <m:sub>
+                            <m:r>
+                              <m:rPr>
+                                <m:sty m:val="p"/>
+                              </m:rPr>
+                              <w:rPr>
+                                <w:color w:val="FF0000"/>
+                              </w:rPr>
+                              <m:t>0</m:t>
+                            </m:r>
+                          </m:sub>
+                        </m:sSub>
+                        <m:r>
+                          <m:rPr>
+                            <m:sty m:val="p"/>
+                          </m:rPr>
+                          <w:rPr>
+                            <w:color w:val="FF0000"/>
+                          </w:rPr>
+                          <m:t> + </m:t>
+                        </m:r>
+                        <m:r>
+                          <w:rPr>
+                            <w:color w:val="FF0000"/>
+                          </w:rPr>
+                          <m:t>at</m:t>
+                        </m:r>
+                      </m:e>
+                    </m:d>
+                  </m:e>
+                </m:d>
+                <m:r>
+                  <w:rPr>
+                    <w:color w:val="FF0000"/>
+                  </w:rPr>
+                  <m:t>t</m:t>
+                </m:r>
+              </m:oMath>
+            </m:oMathPara>
+          </w:p>
+          <w:p>
+            <w:pPr>
+              <w:spacing w:before="80" w:after="20"/>
+            </w:pPr>
+            <w:r>
+              <w:rPr>
+                <w:rFonts w:ascii="Calibri" w:hAnsi="Calibri"/>
+                <w:b w:val="0"/>
+                <w:i w:val="0"/>
+                <w:color w:val="000000"/>
+                <w:sz w:val="18"/>
+                <w:u w:val="none"/>
+              </w:rPr>
+              <w:t>3. Combine like terms (v₀ + v₀ = 2v₀):</w:t>
+            </w:r>
+          </w:p>
+          <w:p>
+            <w:pPr>
+              <w:spacing w:before="80" w:after="40"/>
+              <w:jc w:val="center"/>
+            </w:pPr>
+            <m:oMathPara>
+              <m:oMath>
+                <m:r>
+                  <w:rPr>
+                    <w:color w:val="FF0000"/>
+                  </w:rPr>
+                  <m:t>x</m:t>
+                </m:r>
+                <m:r>
+                  <m:rPr>
+                    <m:sty m:val="p"/>
+                  </m:rPr>
+                  <w:rPr>
+                    <w:color w:val="FF0000"/>
+                  </w:rPr>
+                  <m:t> = </m:t>
+                </m:r>
+                <m:sSub>
+                  <m:e>
+                    <m:r>
+                      <w:rPr>
+                        <w:color w:val="FF0000"/>
+                      </w:rPr>
+                      <m:t>x</m:t>
+                    </m:r>
+                  </m:e>
+                  <m:sub>
+                    <m:r>
+                      <m:rPr>
+                        <m:sty m:val="p"/>
+                      </m:rPr>
+                      <w:rPr>
+                        <w:color w:val="FF0000"/>
+                      </w:rPr>
+                      <m:t>0</m:t>
+                    </m:r>
+                  </m:sub>
+                </m:sSub>
+                <m:r>
+                  <m:rPr>
+                    <m:sty m:val="p"/>
+                  </m:rPr>
+                  <w:rPr>
+                    <w:color w:val="FF0000"/>
+                  </w:rPr>
+                  <m:t> + </m:t>
+                </m:r>
+                <m:f>
+                  <m:num>
+                    <m:r>
+                      <m:rPr>
+                        <m:sty m:val="p"/>
+                      </m:rPr>
+                      <w:rPr>
+                        <w:color w:val="FF0000"/>
+                      </w:rPr>
+                      <m:t>1</m:t>
+                    </m:r>
+                  </m:num>
+                  <m:den>
+                    <m:r>
+                      <m:rPr>
+                        <m:sty m:val="p"/>
+                      </m:rPr>
+                      <w:rPr>
+                        <w:color w:val="FF0000"/>
+                      </w:rPr>
+                      <m:t>2</m:t>
+                    </m:r>
+                  </m:den>
+                </m:f>
+                <m:d>
+                  <m:dPr>
+                    <m:begChr m:val="["/>
+                    <m:endChr m:val="]"/>
+                  </m:dPr>
+                  <m:e>
+                    <m:r>
+                      <m:rPr>
+                        <m:sty m:val="p"/>
+                      </m:rPr>
+                      <w:rPr>
+                        <w:color w:val="FF0000"/>
+                      </w:rPr>
+                      <m:t>2</m:t>
+                    </m:r>
+                    <m:sSub>
+                      <m:e>
+                        <m:r>
+                          <w:rPr>
+                            <w:color w:val="FF0000"/>
+                          </w:rPr>
+                          <m:t>v</m:t>
+                        </m:r>
+                      </m:e>
+                      <m:sub>
+                        <m:r>
+                          <m:rPr>
+                            <m:sty m:val="p"/>
+                          </m:rPr>
+                          <w:rPr>
+                            <w:color w:val="FF0000"/>
+                          </w:rPr>
+                          <m:t>0</m:t>
+                        </m:r>
+                      </m:sub>
+                    </m:sSub>
+                    <m:r>
+                      <m:rPr>
+                        <m:sty m:val="p"/>
+                      </m:rPr>
+                      <w:rPr>
+                        <w:color w:val="FF0000"/>
+                      </w:rPr>
+                      <m:t> + </m:t>
+                    </m:r>
+                    <m:r>
+                      <w:rPr>
+                        <w:color w:val="FF0000"/>
+                      </w:rPr>
+                      <m:t>at</m:t>
+                    </m:r>
+                  </m:e>
+                </m:d>
+                <m:r>
+                  <w:rPr>
+                    <w:color w:val="FF0000"/>
+                  </w:rPr>
+                  <m:t>t</m:t>
+                </m:r>
+              </m:oMath>
+            </m:oMathPara>
+          </w:p>
+          <w:p>
+            <w:pPr>
+              <w:spacing w:before="80" w:after="20"/>
+            </w:pPr>
+            <w:r>
+              <w:rPr>
+                <w:rFonts w:ascii="Calibri" w:hAnsi="Calibri"/>
+                <w:b w:val="0"/>
+                <w:i w:val="0"/>
+                <w:color w:val="000000"/>
+                <w:sz w:val="18"/>
+                <w:u w:val="none"/>
+              </w:rPr>
+              <w:t>4. Distribute t and ½, simplify:</w:t>
+            </w:r>
+          </w:p>
+          <w:p>
+            <w:pPr>
+              <w:spacing w:before="80" w:after="40"/>
+              <w:jc w:val="center"/>
+            </w:pPr>
+            <m:oMathPara>
+              <m:oMath>
+                <m:r>
+                  <w:rPr>
+                    <w:color w:val="FF0000"/>
+                  </w:rPr>
+                  <m:t>x</m:t>
+                </m:r>
+                <m:r>
+                  <m:rPr>
+                    <m:sty m:val="p"/>
+                  </m:rPr>
+                  <w:rPr>
+                    <w:color w:val="FF0000"/>
+                  </w:rPr>
+                  <m:t> = </m:t>
+                </m:r>
+                <m:sSub>
+                  <m:e>
+                    <m:r>
+                      <w:rPr>
+                        <w:color w:val="FF0000"/>
+                      </w:rPr>
+                      <m:t>x</m:t>
+                    </m:r>
+                  </m:e>
+                  <m:sub>
+                    <m:r>
+                      <m:rPr>
+                        <m:sty m:val="p"/>
+                      </m:rPr>
+                      <w:rPr>
+                        <w:color w:val="FF0000"/>
+                      </w:rPr>
+                      <m:t>0</m:t>
+                    </m:r>
+                  </m:sub>
+                </m:sSub>
+                <m:r>
+                  <m:rPr>
+                    <m:sty m:val="p"/>
+                  </m:rPr>
+                  <w:rPr>
+                    <w:color w:val="FF0000"/>
+                  </w:rPr>
+                  <m:t> + </m:t>
+                </m:r>
+                <m:sSub>
+                  <m:e>
+                    <m:r>
+                      <w:rPr>
+                        <w:color w:val="FF0000"/>
+                      </w:rPr>
+                      <m:t>v</m:t>
+                    </m:r>
+                  </m:e>
+                  <m:sub>
+                    <m:r>
+                      <m:rPr>
+                        <m:sty m:val="p"/>
+                      </m:rPr>
+                      <w:rPr>
+                        <w:color w:val="FF0000"/>
+                      </w:rPr>
+                      <m:t>0</m:t>
+                    </m:r>
+                  </m:sub>
+                </m:sSub>
+                <m:r>
+                  <w:rPr>
+                    <w:color w:val="FF0000"/>
+                  </w:rPr>
+                  <m:t>t</m:t>
+                </m:r>
+                <m:r>
+                  <m:rPr>
+                    <m:sty m:val="p"/>
+                  </m:rPr>
+                  <w:rPr>
+                    <w:color w:val="FF0000"/>
+                  </w:rPr>
+                  <m:t> + </m:t>
+                </m:r>
+                <m:f>
+                  <m:num>
+                    <m:r>
+                      <m:rPr>
+                        <m:sty m:val="p"/>
+                      </m:rPr>
+                      <w:rPr>
+                        <w:color w:val="FF0000"/>
+                      </w:rPr>
+                      <m:t>1</m:t>
+                    </m:r>
+                  </m:num>
+                  <m:den>
+                    <m:r>
+                      <m:rPr>
+                        <m:sty m:val="p"/>
+                      </m:rPr>
+                      <w:rPr>
+                        <w:color w:val="FF0000"/>
+                      </w:rPr>
+                      <m:t>2</m:t>
+                    </m:r>
+                  </m:den>
+                </m:f>
+                <m:r>
+                  <w:rPr>
+                    <w:color w:val="FF0000"/>
+                  </w:rPr>
+                  <m:t>a</m:t>
+                </m:r>
+                <m:sSup>
+                  <m:e>
+                    <m:r>
+                      <w:rPr>
+                        <w:color w:val="FF0000"/>
+                      </w:rPr>
+                      <m:t>t</m:t>
+                    </m:r>
+                  </m:e>
+                  <m:sup>
+                    <m:r>
+                      <m:rPr>
+                        <m:sty m:val="p"/>
+                      </m:rPr>
+                      <w:rPr>
+                        <w:color w:val="FF0000"/>
+                      </w:rPr>
+                      <m:t>2</m:t>
+                    </m:r>
+                  </m:sup>
+                </m:sSup>
+              </m:oMath>
+            </m:oMathPara>
+          </w:p>
         </w:tc>
         <w:tc>
           <w:tcPr>
@@ -1238,13 +3607,13 @@
             <w:r>
               <w:rPr>
                 <w:rFonts w:ascii="Calibri" w:hAnsi="Calibri"/>
-                <w:b w:val="0"/>
+                <w:b/>
                 <w:i w:val="0"/>
-                <w:color w:val="000000"/>
+                <w:color w:val="FF0000"/>
                 <w:sz w:val="16"/>
                 <w:u w:val="none"/>
               </w:rPr>
-              <w:t>Name: ___________________________________</w:t>
+              <w:t>TEACHER’S ANSWER KEY</w:t>
             </w:r>
           </w:p>
           <w:p>
@@ -1260,12 +3629,12 @@
                 <w:sz w:val="16"/>
                 <w:u w:val="none"/>
               </w:rPr>
-              <w:t>Grade &amp; Section: _____________  Date: __________</w:t>
+              <w:t xml:space="preserve"> </w:t>
             </w:r>
           </w:p>
           <w:p>
             <w:pPr>
-              <w:spacing w:before="100" w:after="20"/>
+              <w:spacing w:before="80" w:after="40"/>
               <w:jc w:val="center"/>
               <w:pBdr>
                 <w:top w:val="single" w:sz="8" w:space="2" w:color="000000"/>
@@ -1273,7 +3642,7 @@
                 <w:bottom w:val="single" w:sz="8" w:space="2" w:color="000000"/>
                 <w:right w:val="single" w:sz="8" w:space="2" w:color="000000"/>
               </w:pBdr>
-              <w:shd w:val="clear" w:color="auto" w:fill="EDEDED"/>
+              <w:shd w:val="clear" w:color="auto" w:fill="E8E8E8"/>
             </w:pPr>
             <w:r>
               <w:rPr>
@@ -1300,7 +3669,7 @@
           </w:p>
           <w:p>
             <w:pPr>
-              <w:spacing w:before="80" w:after="80"/>
+              <w:spacing w:before="60" w:after="100"/>
             </w:pPr>
             <w:r>
               <w:rPr>
@@ -1311,7 +3680,18 @@
                 <w:sz w:val="16"/>
                 <w:u w:val="none"/>
               </w:rPr>
-              <w:t xml:space="preserve">GOAL: Derive  </w:t>
+              <w:t xml:space="preserve">GOAL:  </w:t>
+            </w:r>
+            <w:r>
+              <w:rPr>
+                <w:rFonts w:ascii="Calibri" w:hAnsi="Calibri"/>
+                <w:b w:val="0"/>
+                <w:i w:val="0"/>
+                <w:color w:val="000000"/>
+                <w:sz w:val="16"/>
+                <w:u w:val="none"/>
+              </w:rPr>
+              <w:t xml:space="preserve">Derive  </w:t>
             </w:r>
             <m:oMath>
               <m:sSup>
@@ -1399,7 +3779,7 @@
           </w:p>
           <w:p>
             <w:pPr>
-              <w:spacing w:before="60" w:after="0"/>
+              <w:spacing w:before="80" w:after="20"/>
             </w:pPr>
             <w:r>
               <w:rPr>
@@ -1410,31 +3790,85 @@
                 <w:sz w:val="18"/>
                 <w:u w:val="none"/>
               </w:rPr>
-              <w:t>1. Start with Equation 1: v = v₀ + at. Isolate t by first subtracting v₀, then dividing by a. Write t = :</w:t>
+              <w:t>1. Isolate t from v = v₀ + at:</w:t>
             </w:r>
           </w:p>
           <w:p>
             <w:pPr>
-              <w:spacing w:before="60" w:after="0"/>
-              <w:pBdr>
-                <w:bottom w:val="single" w:sz="4" w:space="1" w:color="999999"/>
-              </w:pBdr>
+              <w:spacing w:before="80" w:after="40"/>
+              <w:jc w:val="center"/>
             </w:pPr>
-            <w:r>
-              <w:rPr>
-                <w:rFonts w:ascii="Calibri" w:hAnsi="Calibri"/>
-                <w:b w:val="0"/>
-                <w:i w:val="0"/>
-                <w:color w:val="000000"/>
-                <w:sz w:val="22"/>
-                <w:u w:val="none"/>
-              </w:rPr>
-              <w:t xml:space="preserve"> </w:t>
-            </w:r>
+            <m:oMathPara>
+              <m:oMath>
+                <m:r>
+                  <w:rPr>
+                    <w:color w:val="FF0000"/>
+                  </w:rPr>
+                  <m:t>t</m:t>
+                </m:r>
+                <m:r>
+                  <m:rPr>
+                    <m:sty m:val="p"/>
+                  </m:rPr>
+                  <w:rPr>
+                    <w:color w:val="FF0000"/>
+                  </w:rPr>
+                  <m:t> = </m:t>
+                </m:r>
+                <m:f>
+                  <m:num>
+                    <m:r>
+                      <w:rPr>
+                        <w:color w:val="FF0000"/>
+                      </w:rPr>
+                      <m:t>v</m:t>
+                    </m:r>
+                    <m:r>
+                      <m:rPr>
+                        <m:sty m:val="p"/>
+                      </m:rPr>
+                      <w:rPr>
+                        <w:color w:val="FF0000"/>
+                      </w:rPr>
+                      <m:t> − </m:t>
+                    </m:r>
+                    <m:sSub>
+                      <m:e>
+                        <m:r>
+                          <w:rPr>
+                            <w:color w:val="FF0000"/>
+                          </w:rPr>
+                          <m:t>v</m:t>
+                        </m:r>
+                      </m:e>
+                      <m:sub>
+                        <m:r>
+                          <m:rPr>
+                            <m:sty m:val="p"/>
+                          </m:rPr>
+                          <w:rPr>
+                            <w:color w:val="FF0000"/>
+                          </w:rPr>
+                          <m:t>0</m:t>
+                        </m:r>
+                      </m:sub>
+                    </m:sSub>
+                  </m:num>
+                  <m:den>
+                    <m:r>
+                      <w:rPr>
+                        <w:color w:val="FF0000"/>
+                      </w:rPr>
+                      <m:t>a</m:t>
+                    </m:r>
+                  </m:den>
+                </m:f>
+              </m:oMath>
+            </m:oMathPara>
           </w:p>
           <w:p>
             <w:pPr>
-              <w:spacing w:before="60" w:after="0"/>
+              <w:spacing w:before="80" w:after="20"/>
             </w:pPr>
             <w:r>
               <w:rPr>
@@ -1445,31 +3879,188 @@
                 <w:sz w:val="18"/>
                 <w:u w:val="none"/>
               </w:rPr>
-              <w:t>2. Write the displacement equation: x − x₀ = ½(v₀ + v)·t. Using the expression for t from Step 1, substitute it into this equation:</w:t>
+              <w:t>2. Substitute t into displacement equation:</w:t>
             </w:r>
           </w:p>
           <w:p>
             <w:pPr>
-              <w:spacing w:before="60" w:after="0"/>
-              <w:pBdr>
-                <w:bottom w:val="single" w:sz="4" w:space="1" w:color="999999"/>
-              </w:pBdr>
+              <w:spacing w:before="80" w:after="40"/>
+              <w:jc w:val="center"/>
             </w:pPr>
-            <w:r>
-              <w:rPr>
-                <w:rFonts w:ascii="Calibri" w:hAnsi="Calibri"/>
-                <w:b w:val="0"/>
-                <w:i w:val="0"/>
-                <w:color w:val="000000"/>
-                <w:sz w:val="22"/>
-                <w:u w:val="none"/>
-              </w:rPr>
-              <w:t xml:space="preserve"> </w:t>
-            </w:r>
+            <m:oMathPara>
+              <m:oMath>
+                <m:r>
+                  <w:rPr>
+                    <w:color w:val="FF0000"/>
+                  </w:rPr>
+                  <m:t>x</m:t>
+                </m:r>
+                <m:r>
+                  <m:rPr>
+                    <m:sty m:val="p"/>
+                  </m:rPr>
+                  <w:rPr>
+                    <w:color w:val="FF0000"/>
+                  </w:rPr>
+                  <m:t> − </m:t>
+                </m:r>
+                <m:sSub>
+                  <m:e>
+                    <m:r>
+                      <w:rPr>
+                        <w:color w:val="FF0000"/>
+                      </w:rPr>
+                      <m:t>x</m:t>
+                    </m:r>
+                  </m:e>
+                  <m:sub>
+                    <m:r>
+                      <m:rPr>
+                        <m:sty m:val="p"/>
+                      </m:rPr>
+                      <w:rPr>
+                        <w:color w:val="FF0000"/>
+                      </w:rPr>
+                      <m:t>0</m:t>
+                    </m:r>
+                  </m:sub>
+                </m:sSub>
+                <m:r>
+                  <m:rPr>
+                    <m:sty m:val="p"/>
+                  </m:rPr>
+                  <w:rPr>
+                    <w:color w:val="FF0000"/>
+                  </w:rPr>
+                  <m:t> = </m:t>
+                </m:r>
+                <m:f>
+                  <m:num>
+                    <m:r>
+                      <m:rPr>
+                        <m:sty m:val="p"/>
+                      </m:rPr>
+                      <w:rPr>
+                        <w:color w:val="FF0000"/>
+                      </w:rPr>
+                      <m:t>1</m:t>
+                    </m:r>
+                  </m:num>
+                  <m:den>
+                    <m:r>
+                      <m:rPr>
+                        <m:sty m:val="p"/>
+                      </m:rPr>
+                      <w:rPr>
+                        <w:color w:val="FF0000"/>
+                      </w:rPr>
+                      <m:t>2</m:t>
+                    </m:r>
+                  </m:den>
+                </m:f>
+                <m:d>
+                  <m:e>
+                    <m:r>
+                      <w:rPr>
+                        <w:color w:val="FF0000"/>
+                      </w:rPr>
+                      <m:t>v</m:t>
+                    </m:r>
+                    <m:r>
+                      <m:rPr>
+                        <m:sty m:val="p"/>
+                      </m:rPr>
+                      <w:rPr>
+                        <w:color w:val="FF0000"/>
+                      </w:rPr>
+                      <m:t> + </m:t>
+                    </m:r>
+                    <m:sSub>
+                      <m:e>
+                        <m:r>
+                          <w:rPr>
+                            <w:color w:val="FF0000"/>
+                          </w:rPr>
+                          <m:t>v</m:t>
+                        </m:r>
+                      </m:e>
+                      <m:sub>
+                        <m:r>
+                          <m:rPr>
+                            <m:sty m:val="p"/>
+                          </m:rPr>
+                          <w:rPr>
+                            <w:color w:val="FF0000"/>
+                          </w:rPr>
+                          <m:t>0</m:t>
+                        </m:r>
+                      </m:sub>
+                    </m:sSub>
+                  </m:e>
+                </m:d>
+                <m:r>
+                  <m:rPr>
+                    <m:sty m:val="p"/>
+                  </m:rPr>
+                  <w:rPr>
+                    <w:color w:val="FF0000"/>
+                  </w:rPr>
+                  <m:t> · </m:t>
+                </m:r>
+                <m:f>
+                  <m:num>
+                    <m:r>
+                      <w:rPr>
+                        <w:color w:val="FF0000"/>
+                      </w:rPr>
+                      <m:t>v</m:t>
+                    </m:r>
+                    <m:r>
+                      <m:rPr>
+                        <m:sty m:val="p"/>
+                      </m:rPr>
+                      <w:rPr>
+                        <w:color w:val="FF0000"/>
+                      </w:rPr>
+                      <m:t> − </m:t>
+                    </m:r>
+                    <m:sSub>
+                      <m:e>
+                        <m:r>
+                          <w:rPr>
+                            <w:color w:val="FF0000"/>
+                          </w:rPr>
+                          <m:t>v</m:t>
+                        </m:r>
+                      </m:e>
+                      <m:sub>
+                        <m:r>
+                          <m:rPr>
+                            <m:sty m:val="p"/>
+                          </m:rPr>
+                          <w:rPr>
+                            <w:color w:val="FF0000"/>
+                          </w:rPr>
+                          <m:t>0</m:t>
+                        </m:r>
+                      </m:sub>
+                    </m:sSub>
+                  </m:num>
+                  <m:den>
+                    <m:r>
+                      <w:rPr>
+                        <w:color w:val="FF0000"/>
+                      </w:rPr>
+                      <m:t>a</m:t>
+                    </m:r>
+                  </m:den>
+                </m:f>
+              </m:oMath>
+            </m:oMathPara>
           </w:p>
           <w:p>
             <w:pPr>
-              <w:spacing w:before="60" w:after="0"/>
+              <w:spacing w:before="80" w:after="20"/>
             </w:pPr>
             <w:r>
               <w:rPr>
@@ -1480,31 +4071,150 @@
                 <w:sz w:val="18"/>
                 <w:u w:val="none"/>
               </w:rPr>
-              <w:t>3. Combine the fractions into one. Recognize that the numerator (v + v₀)(v − v₀) follows the difference of squares pattern: (a+b)(a−b) = a² − b². Simplify the numerator:</w:t>
+              <w:t>3. Apply difference of squares:</w:t>
             </w:r>
           </w:p>
           <w:p>
             <w:pPr>
-              <w:spacing w:before="60" w:after="0"/>
-              <w:pBdr>
-                <w:bottom w:val="single" w:sz="4" w:space="1" w:color="999999"/>
-              </w:pBdr>
+              <w:spacing w:before="80" w:after="40"/>
+              <w:jc w:val="center"/>
             </w:pPr>
-            <w:r>
-              <w:rPr>
-                <w:rFonts w:ascii="Calibri" w:hAnsi="Calibri"/>
-                <w:b w:val="0"/>
-                <w:i w:val="0"/>
-                <w:color w:val="000000"/>
-                <w:sz w:val="22"/>
-                <w:u w:val="none"/>
-              </w:rPr>
-              <w:t xml:space="preserve"> </w:t>
-            </w:r>
+            <m:oMathPara>
+              <m:oMath>
+                <m:r>
+                  <w:rPr>
+                    <w:color w:val="FF0000"/>
+                  </w:rPr>
+                  <m:t>x</m:t>
+                </m:r>
+                <m:r>
+                  <m:rPr>
+                    <m:sty m:val="p"/>
+                  </m:rPr>
+                  <w:rPr>
+                    <w:color w:val="FF0000"/>
+                  </w:rPr>
+                  <m:t> − </m:t>
+                </m:r>
+                <m:sSub>
+                  <m:e>
+                    <m:r>
+                      <w:rPr>
+                        <w:color w:val="FF0000"/>
+                      </w:rPr>
+                      <m:t>x</m:t>
+                    </m:r>
+                  </m:e>
+                  <m:sub>
+                    <m:r>
+                      <m:rPr>
+                        <m:sty m:val="p"/>
+                      </m:rPr>
+                      <w:rPr>
+                        <w:color w:val="FF0000"/>
+                      </w:rPr>
+                      <m:t>0</m:t>
+                    </m:r>
+                  </m:sub>
+                </m:sSub>
+                <m:r>
+                  <m:rPr>
+                    <m:sty m:val="p"/>
+                  </m:rPr>
+                  <w:rPr>
+                    <w:color w:val="FF0000"/>
+                  </w:rPr>
+                  <m:t> = </m:t>
+                </m:r>
+                <m:f>
+                  <m:num>
+                    <m:sSup>
+                      <m:e>
+                        <m:r>
+                          <w:rPr>
+                            <w:color w:val="FF0000"/>
+                          </w:rPr>
+                          <m:t>v</m:t>
+                        </m:r>
+                      </m:e>
+                      <m:sup>
+                        <m:r>
+                          <m:rPr>
+                            <m:sty m:val="p"/>
+                          </m:rPr>
+                          <w:rPr>
+                            <w:color w:val="FF0000"/>
+                          </w:rPr>
+                          <m:t>2</m:t>
+                        </m:r>
+                      </m:sup>
+                    </m:sSup>
+                    <m:r>
+                      <m:rPr>
+                        <m:sty m:val="p"/>
+                      </m:rPr>
+                      <w:rPr>
+                        <w:color w:val="FF0000"/>
+                      </w:rPr>
+                      <m:t> − </m:t>
+                    </m:r>
+                    <m:sSubSup>
+                      <m:e>
+                        <m:r>
+                          <w:rPr>
+                            <w:color w:val="FF0000"/>
+                          </w:rPr>
+                          <m:t>v</m:t>
+                        </m:r>
+                      </m:e>
+                      <m:sub>
+                        <m:r>
+                          <m:rPr>
+                            <m:sty m:val="p"/>
+                          </m:rPr>
+                          <w:rPr>
+                            <w:color w:val="FF0000"/>
+                          </w:rPr>
+                          <m:t>0</m:t>
+                        </m:r>
+                      </m:sub>
+                      <m:sup>
+                        <m:r>
+                          <m:rPr>
+                            <m:sty m:val="p"/>
+                          </m:rPr>
+                          <w:rPr>
+                            <w:color w:val="FF0000"/>
+                          </w:rPr>
+                          <m:t>2</m:t>
+                        </m:r>
+                      </m:sup>
+                    </m:sSubSup>
+                  </m:num>
+                  <m:den>
+                    <m:r>
+                      <m:rPr>
+                        <m:sty m:val="p"/>
+                      </m:rPr>
+                      <w:rPr>
+                        <w:color w:val="FF0000"/>
+                      </w:rPr>
+                      <m:t>2</m:t>
+                    </m:r>
+                    <m:r>
+                      <w:rPr>
+                        <w:color w:val="FF0000"/>
+                      </w:rPr>
+                      <m:t>a</m:t>
+                    </m:r>
+                  </m:den>
+                </m:f>
+              </m:oMath>
+            </m:oMathPara>
           </w:p>
           <w:p>
             <w:pPr>
-              <w:spacing w:before="60" w:after="0"/>
+              <w:spacing w:before="80" w:after="20"/>
             </w:pPr>
             <w:r>
               <w:rPr>
@@ -1515,132 +4225,135 @@
                 <w:sz w:val="18"/>
                 <w:u w:val="none"/>
               </w:rPr>
-              <w:t>4. Multiply both sides by 2a to clear the denominator. Then add v₀² to both sides. Write the final equation:</w:t>
+              <w:t>4. Multiply by 2a, add v₀²:</w:t>
             </w:r>
           </w:p>
           <w:p>
             <w:pPr>
-              <w:spacing w:before="60" w:after="0"/>
-              <w:pBdr>
-                <w:bottom w:val="single" w:sz="4" w:space="1" w:color="999999"/>
-              </w:pBdr>
+              <w:spacing w:before="80" w:after="40"/>
+              <w:jc w:val="center"/>
             </w:pPr>
-            <w:r>
-              <w:rPr>
-                <w:rFonts w:ascii="Calibri" w:hAnsi="Calibri"/>
-                <w:b w:val="0"/>
-                <w:i w:val="0"/>
-                <w:color w:val="000000"/>
-                <w:sz w:val="22"/>
-                <w:u w:val="none"/>
-              </w:rPr>
-              <w:t xml:space="preserve"> </w:t>
-            </w:r>
-          </w:p>
-          <w:p>
-            <w:pPr>
-              <w:spacing w:before="100" w:after="40"/>
-              <w:pBdr>
-                <w:top w:val="single" w:sz="6" w:space="2" w:color="000000"/>
-                <w:left w:val="single" w:sz="6" w:space="2" w:color="000000"/>
-                <w:bottom w:val="single" w:sz="6" w:space="2" w:color="000000"/>
-                <w:right w:val="single" w:sz="6" w:space="2" w:color="000000"/>
-              </w:pBdr>
-            </w:pPr>
-            <w:r>
-              <w:rPr>
-                <w:rFonts w:ascii="Calibri" w:hAnsi="Calibri"/>
-                <w:b/>
-                <w:i w:val="0"/>
-                <w:color w:val="000000"/>
-                <w:sz w:val="16"/>
-                <w:u w:val="none"/>
-              </w:rPr>
-              <w:t xml:space="preserve"> ✓  Final Equation 3:  </w:t>
-            </w:r>
-            <m:oMath>
-              <m:sSup>
-                <m:e>
-                  <m:r>
-                    <m:t>v</m:t>
-                  </m:r>
-                </m:e>
-                <m:sup>
-                  <m:r>
-                    <m:rPr>
-                      <m:sty m:val="p"/>
-                    </m:rPr>
-                    <m:t>2</m:t>
-                  </m:r>
-                </m:sup>
-              </m:sSup>
-              <m:r>
-                <m:rPr>
-                  <m:sty m:val="p"/>
-                </m:rPr>
-                <m:t> = </m:t>
-              </m:r>
-              <m:sSubSup>
-                <m:e>
-                  <m:r>
-                    <m:t>v</m:t>
-                  </m:r>
-                </m:e>
-                <m:sub>
-                  <m:r>
-                    <m:rPr>
-                      <m:sty m:val="p"/>
-                    </m:rPr>
-                    <m:t>0</m:t>
-                  </m:r>
-                </m:sub>
-                <m:sup>
-                  <m:r>
-                    <m:rPr>
-                      <m:sty m:val="p"/>
-                    </m:rPr>
-                    <m:t>2</m:t>
-                  </m:r>
-                </m:sup>
-              </m:sSubSup>
-              <m:r>
-                <m:rPr>
-                  <m:sty m:val="p"/>
-                </m:rPr>
-                <m:t> + 2</m:t>
-              </m:r>
-              <m:r>
-                <m:t>a</m:t>
-              </m:r>
-              <m:d>
-                <m:e>
-                  <m:r>
-                    <m:t>x</m:t>
-                  </m:r>
-                  <m:r>
-                    <m:rPr>
-                      <m:sty m:val="p"/>
-                    </m:rPr>
-                    <m:t> − </m:t>
-                  </m:r>
-                  <m:sSub>
-                    <m:e>
-                      <m:r>
-                        <m:t>x</m:t>
-                      </m:r>
-                    </m:e>
-                    <m:sub>
-                      <m:r>
-                        <m:rPr>
-                          <m:sty m:val="p"/>
-                        </m:rPr>
-                        <m:t>0</m:t>
-                      </m:r>
-                    </m:sub>
-                  </m:sSub>
-                </m:e>
-              </m:d>
-            </m:oMath>
+            <m:oMathPara>
+              <m:oMath>
+                <m:sSup>
+                  <m:e>
+                    <m:r>
+                      <w:rPr>
+                        <w:color w:val="FF0000"/>
+                      </w:rPr>
+                      <m:t>v</m:t>
+                    </m:r>
+                  </m:e>
+                  <m:sup>
+                    <m:r>
+                      <m:rPr>
+                        <m:sty m:val="p"/>
+                      </m:rPr>
+                      <w:rPr>
+                        <w:color w:val="FF0000"/>
+                      </w:rPr>
+                      <m:t>2</m:t>
+                    </m:r>
+                  </m:sup>
+                </m:sSup>
+                <m:r>
+                  <m:rPr>
+                    <m:sty m:val="p"/>
+                  </m:rPr>
+                  <w:rPr>
+                    <w:color w:val="FF0000"/>
+                  </w:rPr>
+                  <m:t> = </m:t>
+                </m:r>
+                <m:sSubSup>
+                  <m:e>
+                    <m:r>
+                      <w:rPr>
+                        <w:color w:val="FF0000"/>
+                      </w:rPr>
+                      <m:t>v</m:t>
+                    </m:r>
+                  </m:e>
+                  <m:sub>
+                    <m:r>
+                      <m:rPr>
+                        <m:sty m:val="p"/>
+                      </m:rPr>
+                      <w:rPr>
+                        <w:color w:val="FF0000"/>
+                      </w:rPr>
+                      <m:t>0</m:t>
+                    </m:r>
+                  </m:sub>
+                  <m:sup>
+                    <m:r>
+                      <m:rPr>
+                        <m:sty m:val="p"/>
+                      </m:rPr>
+                      <w:rPr>
+                        <w:color w:val="FF0000"/>
+                      </w:rPr>
+                      <m:t>2</m:t>
+                    </m:r>
+                  </m:sup>
+                </m:sSubSup>
+                <m:r>
+                  <m:rPr>
+                    <m:sty m:val="p"/>
+                  </m:rPr>
+                  <w:rPr>
+                    <w:color w:val="FF0000"/>
+                  </w:rPr>
+                  <m:t> + 2</m:t>
+                </m:r>
+                <m:r>
+                  <w:rPr>
+                    <w:color w:val="FF0000"/>
+                  </w:rPr>
+                  <m:t>a</m:t>
+                </m:r>
+                <m:d>
+                  <m:e>
+                    <m:r>
+                      <w:rPr>
+                        <w:color w:val="FF0000"/>
+                      </w:rPr>
+                      <m:t>x</m:t>
+                    </m:r>
+                    <m:r>
+                      <m:rPr>
+                        <m:sty m:val="p"/>
+                      </m:rPr>
+                      <w:rPr>
+                        <w:color w:val="FF0000"/>
+                      </w:rPr>
+                      <m:t> − </m:t>
+                    </m:r>
+                    <m:sSub>
+                      <m:e>
+                        <m:r>
+                          <w:rPr>
+                            <w:color w:val="FF0000"/>
+                          </w:rPr>
+                          <m:t>x</m:t>
+                        </m:r>
+                      </m:e>
+                      <m:sub>
+                        <m:r>
+                          <m:rPr>
+                            <m:sty m:val="p"/>
+                          </m:rPr>
+                          <w:rPr>
+                            <w:color w:val="FF0000"/>
+                          </w:rPr>
+                          <m:t>0</m:t>
+                        </m:r>
+                      </m:sub>
+                    </m:sSub>
+                  </m:e>
+                </m:d>
+              </m:oMath>
+            </m:oMathPara>
           </w:p>
         </w:tc>
       </w:tr>

</xml_diff>